<commit_message>
Adicionando o relatório finalizado de DevOps para o Github - 23/10/2026
</commit_message>
<xml_diff>
--- a/Quarto_Semestre/Computacao_Em_Nuvem_DevOps/aula_08_relatorio-final/Relatório Final — Laboratórios DevOps 1, 2 e 3 - Revisao.docx
+++ b/Quarto_Semestre/Computacao_Em_Nuvem_DevOps/aula_08_relatorio-final/Relatório Final — Laboratórios DevOps 1, 2 e 3 - Revisao.docx
@@ -1,6 +1,6 @@
 
 <file path=word/document.xml><?xml version="1.0" encoding="utf-8"?>
-<w:document xmlns:wpc="http://schemas.microsoft.com/office/word/2010/wordprocessingCanvas" xmlns:cx="http://schemas.microsoft.com/office/drawing/2014/chartex" xmlns:cx1="http://schemas.microsoft.com/office/drawing/2015/9/8/chartex" xmlns:cx2="http://schemas.microsoft.com/office/drawing/2015/10/21/chartex" xmlns:cx3="http://schemas.microsoft.com/office/drawing/2016/5/9/chartex" xmlns:cx4="http://schemas.microsoft.com/office/drawing/2016/5/10/chartex" xmlns:cx5="http://schemas.microsoft.com/office/drawing/2016/5/11/chartex" xmlns:cx6="http://schemas.microsoft.com/office/drawing/2016/5/12/chartex" xmlns:cx7="http://schemas.microsoft.com/office/drawing/2016/5/13/chartex" xmlns:cx8="http://schemas.microsoft.com/office/drawing/2016/5/14/chartex" xmlns:mc="http://schemas.openxmlformats.org/markup-compatibility/2006" xmlns:aink="http://schemas.microsoft.com/office/drawing/2016/ink" xmlns:am3d="http://schemas.microsoft.com/office/drawing/2017/model3d" xmlns:o="urn:schemas-microsoft-com:office:office" xmlns:r="http://schemas.openxmlformats.org/officeDocument/2006/relationships" xmlns:m="http://schemas.openxmlformats.org/officeDocument/2006/math" xmlns:v="urn:schemas-microsoft-com:vml" xmlns:wp14="http://schemas.microsoft.com/office/word/2010/wordprocessingDrawing" xmlns:wp="http://schemas.openxmlformats.org/drawingml/2006/wordprocessingDrawing" xmlns:w10="urn:schemas-microsoft-com:office:word" xmlns:w="http://schemas.openxmlformats.org/wordprocessingml/2006/main" xmlns:w14="http://schemas.microsoft.com/office/word/2010/wordml" xmlns:w15="http://schemas.microsoft.com/office/word/2012/wordml" xmlns:w16cex="http://schemas.microsoft.com/office/word/2018/wordml/cex" xmlns:w16cid="http://schemas.microsoft.com/office/word/2016/wordml/cid" xmlns:w16="http://schemas.microsoft.com/office/word/2018/wordml" xmlns:w16sdtdh="http://schemas.microsoft.com/office/word/2020/wordml/sdtdatahash" xmlns:w16se="http://schemas.microsoft.com/office/word/2015/wordml/symex" xmlns:wpg="http://schemas.microsoft.com/office/word/2010/wordprocessingGroup" xmlns:wpi="http://schemas.microsoft.com/office/word/2010/wordprocessingInk" xmlns:wne="http://schemas.microsoft.com/office/word/2006/wordml" xmlns:wps="http://schemas.microsoft.com/office/word/2010/wordprocessingShape" mc:Ignorable="w14 w15 w16se w16cid w16 w16cex w16sdtdh wp14">
+<w:document xmlns:wpc="http://schemas.microsoft.com/office/word/2010/wordprocessingCanvas" xmlns:cx="http://schemas.microsoft.com/office/drawing/2014/chartex" xmlns:cx1="http://schemas.microsoft.com/office/drawing/2015/9/8/chartex" xmlns:cx2="http://schemas.microsoft.com/office/drawing/2015/10/21/chartex" xmlns:cx3="http://schemas.microsoft.com/office/drawing/2016/5/9/chartex" xmlns:cx4="http://schemas.microsoft.com/office/drawing/2016/5/10/chartex" xmlns:cx5="http://schemas.microsoft.com/office/drawing/2016/5/11/chartex" xmlns:cx6="http://schemas.microsoft.com/office/drawing/2016/5/12/chartex" xmlns:cx7="http://schemas.microsoft.com/office/drawing/2016/5/13/chartex" xmlns:cx8="http://schemas.microsoft.com/office/drawing/2016/5/14/chartex" xmlns:mc="http://schemas.openxmlformats.org/markup-compatibility/2006" xmlns:aink="http://schemas.microsoft.com/office/drawing/2016/ink" xmlns:am3d="http://schemas.microsoft.com/office/drawing/2017/model3d" xmlns:o="urn:schemas-microsoft-com:office:office" xmlns:oel="http://schemas.microsoft.com/office/2019/extlst" xmlns:r="http://schemas.openxmlformats.org/officeDocument/2006/relationships" xmlns:m="http://schemas.openxmlformats.org/officeDocument/2006/math" xmlns:v="urn:schemas-microsoft-com:vml" xmlns:wp14="http://schemas.microsoft.com/office/word/2010/wordprocessingDrawing" xmlns:wp="http://schemas.openxmlformats.org/drawingml/2006/wordprocessingDrawing" xmlns:w10="urn:schemas-microsoft-com:office:word" xmlns:w="http://schemas.openxmlformats.org/wordprocessingml/2006/main" xmlns:w14="http://schemas.microsoft.com/office/word/2010/wordml" xmlns:w15="http://schemas.microsoft.com/office/word/2012/wordml" xmlns:w16cex="http://schemas.microsoft.com/office/word/2018/wordml/cex" xmlns:w16cid="http://schemas.microsoft.com/office/word/2016/wordml/cid" xmlns:w16="http://schemas.microsoft.com/office/word/2018/wordml" xmlns:w16du="http://schemas.microsoft.com/office/word/2023/wordml/word16du" xmlns:w16sdtdh="http://schemas.microsoft.com/office/word/2020/wordml/sdtdatahash" xmlns:w16sdtfl="http://schemas.microsoft.com/office/word/2024/wordml/sdtformatlock" xmlns:w16se="http://schemas.microsoft.com/office/word/2015/wordml/symex" xmlns:wpg="http://schemas.microsoft.com/office/word/2010/wordprocessingGroup" xmlns:wpi="http://schemas.microsoft.com/office/word/2010/wordprocessingInk" xmlns:wne="http://schemas.microsoft.com/office/word/2006/wordml" xmlns:wps="http://schemas.microsoft.com/office/word/2010/wordprocessingShape" mc:Ignorable="w14 w15 w16se w16cid w16 w16cex w16sdtdh w16sdtfl w16du wp14">
   <w:body>
     <w:p>
       <w:pPr>
@@ -339,15 +339,7 @@
               <w:t xml:space="preserve"> </w:t>
             </w:r>
             <w:r>
-              <w:t xml:space="preserve">Eduardo Silva </w:t>
-            </w:r>
-            <w:proofErr w:type="spellStart"/>
-            <w:r>
-              <w:t>Sinico</w:t>
-            </w:r>
-            <w:proofErr w:type="spellEnd"/>
-            <w:r>
-              <w:t xml:space="preserve"> – RA: 0444/25-1</w:t>
+              <w:t>Eduardo Silva Sinico – RA: 0444/25-1</w:t>
             </w:r>
           </w:p>
         </w:tc>
@@ -4313,7 +4305,11 @@
         <w:t>não</w:t>
       </w:r>
       <w:r>
-        <w:t xml:space="preserve"> deve conter a pasta </w:t>
+        <w:t xml:space="preserve"> deve conter a </w:t>
+      </w:r>
+      <w:proofErr w:type="gramStart"/>
+      <w:r>
+        <w:t xml:space="preserve">pasta </w:t>
       </w:r>
       <w:r>
         <w:rPr>
@@ -4322,19 +4318,31 @@
           <w:szCs w:val="20"/>
           <w:shd w:val="clear" w:color="auto" w:fill="F5F5F5"/>
         </w:rPr>
-        <w:t>.terraform/</w:t>
-      </w:r>
-      <w:r>
-        <w:t xml:space="preserve"> nem o arquivo </w:t>
-      </w:r>
+        <w:t>.terraform</w:t>
+      </w:r>
+      <w:proofErr w:type="gramEnd"/>
       <w:r>
         <w:rPr>
           <w:rFonts w:ascii="Consolas" w:eastAsia="Consolas" w:hAnsi="Consolas" w:cs="Consolas"/>
           <w:sz w:val="20"/>
           <w:szCs w:val="20"/>
+          <w:shd w:val="clear" w:color="auto" w:fill="F5F5F5"/>
+        </w:rPr>
+        <w:t>/</w:t>
+      </w:r>
+      <w:r>
+        <w:t xml:space="preserve"> nem o arquivo </w:t>
+      </w:r>
+      <w:proofErr w:type="gramStart"/>
+      <w:r>
+        <w:rPr>
+          <w:rFonts w:ascii="Consolas" w:eastAsia="Consolas" w:hAnsi="Consolas" w:cs="Consolas"/>
+          <w:sz w:val="20"/>
+          <w:szCs w:val="20"/>
         </w:rPr>
         <w:t>terraform.tfstate</w:t>
       </w:r>
+      <w:proofErr w:type="gramEnd"/>
       <w:r>
         <w:t xml:space="preserve">. </w:t>
       </w:r>
@@ -4477,15 +4485,7 @@
         <w:ind w:left="5"/>
       </w:pPr>
       <w:r>
-        <w:t xml:space="preserve">Link para o </w:t>
-      </w:r>
-      <w:proofErr w:type="spellStart"/>
-      <w:r>
-        <w:t>Github</w:t>
-      </w:r>
-      <w:proofErr w:type="spellEnd"/>
-      <w:r>
-        <w:t xml:space="preserve"> </w:t>
+        <w:t xml:space="preserve">Link para o Github </w:t>
       </w:r>
       <w:proofErr w:type="spellStart"/>
       <w:r>
@@ -4509,15 +4509,7 @@
         <w:ind w:left="5"/>
       </w:pPr>
       <w:r>
-        <w:t xml:space="preserve">Infelizmente, por algum motivo que desconhecemos, todo o histórico execuções do </w:t>
-      </w:r>
-      <w:proofErr w:type="spellStart"/>
-      <w:r>
-        <w:t>Github</w:t>
-      </w:r>
-      <w:proofErr w:type="spellEnd"/>
-      <w:r>
-        <w:t xml:space="preserve"> </w:t>
+        <w:t xml:space="preserve">Infelizmente, por algum motivo que desconhecemos, todo o histórico execuções do Github </w:t>
       </w:r>
       <w:proofErr w:type="spellStart"/>
       <w:r>
@@ -4537,6 +4529,9 @@
         <w:br/>
       </w:r>
       <w:r>
+        <w:rPr>
+          <w:noProof/>
+        </w:rPr>
         <w:drawing>
           <wp:inline distT="0" distB="0" distL="0" distR="0" wp14:anchorId="79434483" wp14:editId="44C1F2DA">
             <wp:extent cx="4888357" cy="3230880"/>
@@ -5451,14 +5446,12 @@
       <w:r>
         <w:t xml:space="preserve">, </w:t>
       </w:r>
-      <w:proofErr w:type="spellStart"/>
       <w:r>
         <w:rPr>
           <w:i/>
         </w:rPr>
         <w:t>step</w:t>
       </w:r>
-      <w:proofErr w:type="spellEnd"/>
       <w:r>
         <w:t xml:space="preserve">, </w:t>
       </w:r>
@@ -6013,42 +6006,26 @@
         <w:rPr>
           <w:i/>
         </w:rPr>
-        <w:t xml:space="preserve">GitHub </w:t>
+        <w:t>GitHub Secrets</w:t>
+      </w:r>
+      <w:r>
+        <w:t xml:space="preserve"> funciona e cite duas alternativas usadas na indústria (por exemplo </w:t>
       </w:r>
       <w:proofErr w:type="spellStart"/>
       <w:r>
-        <w:rPr>
-          <w:i/>
-        </w:rPr>
-        <w:t>Secrets</w:t>
+        <w:t>HashiCorp</w:t>
       </w:r>
       <w:proofErr w:type="spellEnd"/>
       <w:r>
-        <w:t xml:space="preserve"> funciona e cite duas alternativas usadas na indústria (por exemplo </w:t>
+        <w:t xml:space="preserve"> </w:t>
       </w:r>
       <w:proofErr w:type="spellStart"/>
       <w:r>
-        <w:t>HashiCorp</w:t>
+        <w:t>Vault</w:t>
       </w:r>
       <w:proofErr w:type="spellEnd"/>
       <w:r>
-        <w:t xml:space="preserve"> </w:t>
-      </w:r>
-      <w:proofErr w:type="spellStart"/>
-      <w:r>
-        <w:t>Vault</w:t>
-      </w:r>
-      <w:proofErr w:type="spellEnd"/>
-      <w:r>
-        <w:t xml:space="preserve">, AWS </w:t>
-      </w:r>
-      <w:proofErr w:type="spellStart"/>
-      <w:r>
-        <w:t>Secrets</w:t>
-      </w:r>
-      <w:proofErr w:type="spellEnd"/>
-      <w:r>
-        <w:t xml:space="preserve"> Manager ou Azure Key </w:t>
+        <w:t xml:space="preserve">, AWS Secrets Manager ou Azure Key </w:t>
       </w:r>
       <w:proofErr w:type="spellStart"/>
       <w:r>
@@ -6600,145 +6577,13 @@
       </w:pPr>
     </w:p>
     <w:p/>
+    <w:p/>
     <w:p>
       <w:pPr>
         <w:pStyle w:val="Ttulo2"/>
         <w:spacing w:after="0"/>
         <w:ind w:left="0" w:firstLine="0"/>
       </w:pPr>
-    </w:p>
-    <w:p>
-      <w:pPr>
-        <w:pStyle w:val="Ttulo2"/>
-        <w:spacing w:after="0"/>
-        <w:ind w:left="0" w:firstLine="0"/>
-      </w:pPr>
-    </w:p>
-    <w:p>
-      <w:pPr>
-        <w:pStyle w:val="Ttulo2"/>
-        <w:spacing w:after="0"/>
-        <w:ind w:left="0" w:firstLine="0"/>
-      </w:pPr>
-    </w:p>
-    <w:p>
-      <w:pPr>
-        <w:pStyle w:val="Ttulo2"/>
-        <w:spacing w:after="0"/>
-        <w:ind w:left="0" w:firstLine="0"/>
-      </w:pPr>
-    </w:p>
-    <w:p>
-      <w:pPr>
-        <w:pStyle w:val="Ttulo2"/>
-        <w:spacing w:after="0"/>
-        <w:ind w:left="0" w:firstLine="0"/>
-      </w:pPr>
-    </w:p>
-    <w:p>
-      <w:pPr>
-        <w:pStyle w:val="Ttulo2"/>
-        <w:spacing w:after="0"/>
-        <w:ind w:left="0" w:firstLine="0"/>
-      </w:pPr>
-    </w:p>
-    <w:p>
-      <w:pPr>
-        <w:pStyle w:val="Ttulo2"/>
-        <w:spacing w:after="0"/>
-        <w:ind w:left="0" w:firstLine="0"/>
-      </w:pPr>
-    </w:p>
-    <w:p>
-      <w:pPr>
-        <w:pStyle w:val="Ttulo2"/>
-        <w:spacing w:after="0"/>
-        <w:ind w:left="0" w:firstLine="0"/>
-      </w:pPr>
-    </w:p>
-    <w:p>
-      <w:pPr>
-        <w:pStyle w:val="Ttulo2"/>
-        <w:spacing w:after="0"/>
-        <w:ind w:left="0" w:firstLine="0"/>
-      </w:pPr>
-    </w:p>
-    <w:p>
-      <w:pPr>
-        <w:pStyle w:val="Ttulo2"/>
-        <w:spacing w:after="0"/>
-        <w:ind w:left="0" w:firstLine="0"/>
-      </w:pPr>
-    </w:p>
-    <w:p>
-      <w:pPr>
-        <w:pStyle w:val="Ttulo2"/>
-        <w:spacing w:after="0"/>
-        <w:ind w:left="0" w:firstLine="0"/>
-      </w:pPr>
-    </w:p>
-    <w:p>
-      <w:pPr>
-        <w:pStyle w:val="Ttulo2"/>
-        <w:spacing w:after="0"/>
-        <w:ind w:left="0" w:firstLine="0"/>
-      </w:pPr>
-    </w:p>
-    <w:p>
-      <w:pPr>
-        <w:pStyle w:val="Ttulo2"/>
-        <w:spacing w:after="0"/>
-        <w:ind w:left="0" w:firstLine="0"/>
-      </w:pPr>
-    </w:p>
-    <w:p>
-      <w:pPr>
-        <w:pStyle w:val="Ttulo2"/>
-        <w:spacing w:after="0"/>
-        <w:ind w:left="0" w:firstLine="0"/>
-      </w:pPr>
-    </w:p>
-    <w:p>
-      <w:pPr>
-        <w:pStyle w:val="Ttulo2"/>
-        <w:spacing w:after="0"/>
-        <w:ind w:left="0" w:firstLine="0"/>
-      </w:pPr>
-    </w:p>
-    <w:p>
-      <w:pPr>
-        <w:pStyle w:val="Ttulo2"/>
-        <w:spacing w:after="0"/>
-        <w:ind w:left="0" w:firstLine="0"/>
-      </w:pPr>
-    </w:p>
-    <w:p>
-      <w:pPr>
-        <w:pStyle w:val="Ttulo2"/>
-        <w:spacing w:after="0"/>
-        <w:ind w:left="0" w:firstLine="0"/>
-      </w:pPr>
-    </w:p>
-    <w:p>
-      <w:pPr>
-        <w:pStyle w:val="Ttulo2"/>
-        <w:spacing w:after="0"/>
-        <w:ind w:left="0" w:firstLine="0"/>
-      </w:pPr>
-    </w:p>
-    <w:p>
-      <w:pPr>
-        <w:pStyle w:val="Ttulo2"/>
-        <w:spacing w:after="0"/>
-        <w:ind w:left="0" w:firstLine="0"/>
-      </w:pPr>
-    </w:p>
-    <w:p>
-      <w:pPr>
-        <w:pStyle w:val="Ttulo2"/>
-        <w:spacing w:after="0"/>
-        <w:ind w:left="0" w:firstLine="0"/>
-      </w:pPr>
       <w:r>
         <w:t xml:space="preserve">Laboratório 3 </w:t>
       </w:r>
@@ -6881,7 +6726,6 @@
         <w:br/>
       </w:r>
       <w:r>
-        <w:lastRenderedPageBreak/>
         <w:tab/>
       </w:r>
       <w:r>
@@ -7044,13 +6888,7 @@
         <w:rPr>
           <w:lang w:val="en-US"/>
         </w:rPr>
-        <w:t xml:space="preserve"> timeout 60 md5sum /dev/zero</w:t>
-      </w:r>
-      <w:r>
-        <w:rPr>
-          <w:lang w:val="en-US"/>
-        </w:rPr>
-        <w:t xml:space="preserve"> </w:t>
+        <w:t xml:space="preserve"> timeout 60 md5sum /dev/zero </w:t>
       </w:r>
     </w:p>
     <w:p>
@@ -7062,6 +6900,7 @@
         <w:rPr>
           <w:b/>
         </w:rPr>
+        <w:lastRenderedPageBreak/>
         <w:t xml:space="preserve">E3.2 — </w:t>
       </w:r>
       <w:proofErr w:type="spellStart"/>
@@ -7494,7 +7333,6 @@
           <w:b/>
           <w:bCs/>
         </w:rPr>
-        <w:lastRenderedPageBreak/>
         <w:t>E3.3 — Tudo no GitHub (etapa 5 da apostila).</w:t>
       </w:r>
       <w:r>
@@ -7650,23 +7488,7 @@
             <w:sz w:val="20"/>
             <w:szCs w:val="20"/>
           </w:rPr>
-          <w:t>https://github.com/Edu1Sinico/projeto_CI-CD_lab2/</w:t>
-        </w:r>
-        <w:r>
-          <w:rPr>
-            <w:rStyle w:val="Hyperlink"/>
-            <w:sz w:val="20"/>
-            <w:szCs w:val="20"/>
-          </w:rPr>
-          <w:t>c</w:t>
-        </w:r>
-        <w:r>
-          <w:rPr>
-            <w:rStyle w:val="Hyperlink"/>
-            <w:sz w:val="20"/>
-            <w:szCs w:val="20"/>
-          </w:rPr>
-          <w:t>ommit/37beb80500dc04a9761eeed30aaad51b695e2bae</w:t>
+          <w:t>https://github.com/Edu1Sinico/projeto_CI-CD_lab2/commit/37beb80500dc04a9761eeed30aaad51b695e2bae</w:t>
         </w:r>
       </w:hyperlink>
     </w:p>
@@ -7679,6 +7501,9 @@
         </w:rPr>
       </w:pPr>
       <w:r>
+        <w:rPr>
+          <w:noProof/>
+        </w:rPr>
         <w:drawing>
           <wp:anchor distT="0" distB="0" distL="114300" distR="114300" simplePos="0" relativeHeight="251658240" behindDoc="0" locked="0" layoutInCell="1" allowOverlap="1" wp14:anchorId="1F9E8307" wp14:editId="149B4631">
             <wp:simplePos x="906780" y="4876800"/>
@@ -7736,6 +7561,9 @@
         <w:br/>
       </w:r>
       <w:r>
+        <w:rPr>
+          <w:noProof/>
+        </w:rPr>
         <w:drawing>
           <wp:inline distT="0" distB="0" distL="0" distR="0" wp14:anchorId="25109CB8" wp14:editId="27437718">
             <wp:extent cx="5944235" cy="598170"/>
@@ -7788,6 +7616,9 @@
         <w:br/>
       </w:r>
       <w:r>
+        <w:rPr>
+          <w:noProof/>
+        </w:rPr>
         <w:drawing>
           <wp:inline distT="0" distB="0" distL="0" distR="0" wp14:anchorId="29FCEE38" wp14:editId="264C1F6A">
             <wp:extent cx="5944235" cy="377825"/>
@@ -7831,6 +7662,7 @@
         <w:ind w:left="-5"/>
       </w:pPr>
       <w:r>
+        <w:lastRenderedPageBreak/>
         <w:t xml:space="preserve">Parte B — Exercício da apostila e cenários (responda em 3 a 6 linhas cada) </w:t>
       </w:r>
     </w:p>
@@ -7957,8 +7789,16 @@
       </w:r>
       <w:proofErr w:type="gramEnd"/>
       <w:r>
-        <w:t xml:space="preserve"> da maneira graceful</w:t>
-      </w:r>
+        <w:t xml:space="preserve"> </w:t>
+      </w:r>
+      <w:r>
+        <w:t xml:space="preserve">da maneira </w:t>
+      </w:r>
+      <w:proofErr w:type="spellStart"/>
+      <w:r>
+        <w:t>graceful</w:t>
+      </w:r>
+      <w:proofErr w:type="spellEnd"/>
       <w:r>
         <w:t xml:space="preserve">, os dados são armazenados, </w:t>
       </w:r>
@@ -7984,7 +7824,6 @@
         <w:rPr>
           <w:b/>
         </w:rPr>
-        <w:lastRenderedPageBreak/>
         <w:t>Exercício 6 — MTTD.</w:t>
       </w:r>
       <w:r>
@@ -8119,6 +7958,7 @@
         <w:ind w:left="-5"/>
       </w:pPr>
       <w:r>
+        <w:lastRenderedPageBreak/>
         <w:t xml:space="preserve">Parte C — Questões conceituais (pesquise e responda com suas palavras) </w:t>
       </w:r>
     </w:p>
@@ -8263,15 +8103,18 @@
     </w:p>
     <w:p>
       <w:pPr>
-        <w:spacing w:after="0" w:line="480" w:lineRule="auto"/>
-        <w:ind w:left="0" w:firstLine="0"/>
+        <w:pStyle w:val="PargrafodaLista"/>
+        <w:numPr>
+          <w:ilvl w:val="0"/>
+          <w:numId w:val="24"/>
+        </w:numPr>
+        <w:spacing w:after="0" w:line="276" w:lineRule="auto"/>
         <w:rPr>
           <w:rFonts w:ascii="Segoe UI" w:hAnsi="Segoe UI" w:cs="Segoe UI"/>
           <w:color w:val="0563C1" w:themeColor="hyperlink"/>
         </w:rPr>
       </w:pPr>
       <w:r>
-        <w:lastRenderedPageBreak/>
         <w:t>Métricas</w:t>
       </w:r>
       <w:r>
@@ -8285,8 +8128,12 @@
     </w:p>
     <w:p>
       <w:pPr>
-        <w:spacing w:after="161" w:line="480" w:lineRule="auto"/>
-        <w:ind w:left="0"/>
+        <w:pStyle w:val="PargrafodaLista"/>
+        <w:numPr>
+          <w:ilvl w:val="0"/>
+          <w:numId w:val="24"/>
+        </w:numPr>
+        <w:spacing w:after="161" w:line="276" w:lineRule="auto"/>
       </w:pPr>
       <w:r>
         <w:t>Logs</w:t>
@@ -8306,8 +8153,12 @@
     </w:p>
     <w:p>
       <w:pPr>
-        <w:spacing w:after="161" w:line="480" w:lineRule="auto"/>
-        <w:ind w:left="0" w:firstLine="0"/>
+        <w:pStyle w:val="PargrafodaLista"/>
+        <w:numPr>
+          <w:ilvl w:val="0"/>
+          <w:numId w:val="24"/>
+        </w:numPr>
+        <w:spacing w:after="161" w:line="276" w:lineRule="auto"/>
       </w:pPr>
       <w:r>
         <w:t>Traces</w:t>
@@ -8417,120 +8268,85 @@
     <w:p>
       <w:pPr>
         <w:ind w:left="-5"/>
-        <w:rPr>
-          <w:highlight w:val="darkRed"/>
-        </w:rPr>
       </w:pPr>
       <w:r>
         <w:rPr>
           <w:b/>
           <w:bCs/>
-          <w:highlight w:val="darkRed"/>
         </w:rPr>
         <w:t>C3.2 — Como o Prometheus funciona.</w:t>
       </w:r>
       <w:r>
-        <w:rPr>
-          <w:highlight w:val="darkRed"/>
-        </w:rPr>
         <w:t xml:space="preserve"> Explique o modelo </w:t>
       </w:r>
       <w:r>
         <w:rPr>
           <w:i/>
           <w:iCs/>
-          <w:highlight w:val="darkRed"/>
         </w:rPr>
         <w:t>pull</w:t>
       </w:r>
       <w:r>
-        <w:rPr>
-          <w:highlight w:val="darkRed"/>
-        </w:rPr>
         <w:t xml:space="preserve"> (</w:t>
       </w:r>
       <w:r>
         <w:rPr>
           <w:i/>
           <w:iCs/>
-          <w:highlight w:val="darkRed"/>
         </w:rPr>
         <w:t>scrape</w:t>
       </w:r>
       <w:r>
-        <w:rPr>
-          <w:highlight w:val="darkRed"/>
-        </w:rPr>
         <w:t xml:space="preserve">) em comparação ao </w:t>
       </w:r>
       <w:r>
         <w:rPr>
           <w:i/>
           <w:iCs/>
-          <w:highlight w:val="darkRed"/>
         </w:rPr>
         <w:t>push</w:t>
       </w:r>
       <w:r>
-        <w:rPr>
-          <w:highlight w:val="darkRed"/>
-        </w:rPr>
         <w:t xml:space="preserve"> e o que é uma série temporal. Diferencie os tipos de métrica </w:t>
       </w:r>
       <w:r>
         <w:rPr>
           <w:i/>
           <w:iCs/>
-          <w:highlight w:val="darkRed"/>
         </w:rPr>
         <w:t>counter</w:t>
       </w:r>
       <w:r>
-        <w:rPr>
-          <w:highlight w:val="darkRed"/>
-        </w:rPr>
         <w:t xml:space="preserve">, </w:t>
       </w:r>
       <w:r>
         <w:rPr>
           <w:i/>
           <w:iCs/>
-          <w:highlight w:val="darkRed"/>
         </w:rPr>
         <w:t>gauge</w:t>
       </w:r>
       <w:r>
-        <w:rPr>
-          <w:highlight w:val="darkRed"/>
-        </w:rPr>
         <w:t xml:space="preserve"> e </w:t>
       </w:r>
       <w:r>
         <w:rPr>
           <w:i/>
           <w:iCs/>
-          <w:highlight w:val="darkRed"/>
         </w:rPr>
         <w:t>histogram</w:t>
       </w:r>
       <w:r>
-        <w:rPr>
-          <w:highlight w:val="darkRed"/>
-        </w:rPr>
         <w:t xml:space="preserve"> e diga por que um </w:t>
       </w:r>
       <w:r>
         <w:rPr>
           <w:i/>
           <w:iCs/>
-          <w:highlight w:val="darkRed"/>
         </w:rPr>
         <w:t>counter</w:t>
       </w:r>
       <w:r>
-        <w:rPr>
-          <w:highlight w:val="darkRed"/>
-        </w:rPr>
         <w:t xml:space="preserve"> precisa do </w:t>
       </w:r>
       <w:proofErr w:type="gramStart"/>
@@ -8539,7 +8355,6 @@
           <w:rFonts w:ascii="Consolas" w:eastAsia="Consolas" w:hAnsi="Consolas" w:cs="Consolas"/>
           <w:sz w:val="20"/>
           <w:szCs w:val="20"/>
-          <w:highlight w:val="darkRed"/>
           <w:shd w:val="clear" w:color="auto" w:fill="F5F5F5"/>
         </w:rPr>
         <w:t>rate(</w:t>
@@ -8550,167 +8365,794 @@
           <w:rFonts w:ascii="Consolas" w:eastAsia="Consolas" w:hAnsi="Consolas" w:cs="Consolas"/>
           <w:sz w:val="20"/>
           <w:szCs w:val="20"/>
-          <w:highlight w:val="darkRed"/>
           <w:shd w:val="clear" w:color="auto" w:fill="F5F5F5"/>
         </w:rPr>
         <w:t>)</w:t>
       </w:r>
       <w:r>
-        <w:rPr>
-          <w:highlight w:val="darkRed"/>
-        </w:rPr>
-        <w:t>. Resuma o papel de cAdvisor, Prometheus e Grafana na cadeia.</w:t>
-      </w:r>
-      <w:r>
-        <w:t xml:space="preserve"> </w:t>
+        <w:t xml:space="preserve">. Resuma o papel de cAdvisor, Prometheus e Grafana na cadeia. </w:t>
       </w:r>
     </w:p>
     <w:p>
       <w:pPr>
         <w:spacing w:after="161" w:line="259" w:lineRule="auto"/>
         <w:ind w:left="-5"/>
-        <w:rPr>
-          <w:highlight w:val="darkRed"/>
-        </w:rPr>
-      </w:pPr>
-      <w:r>
         <w:rPr>
           <w:i/>
           <w:iCs/>
-          <w:highlight w:val="darkRed"/>
-        </w:rPr>
-        <w:t>Sua resposta e fonte:</w:t>
-      </w:r>
-      <w:r>
-        <w:t xml:space="preserve"> </w:t>
-      </w:r>
-    </w:p>
-    <w:p>
-      <w:pPr>
-        <w:spacing w:after="161" w:line="259" w:lineRule="auto"/>
-        <w:ind w:left="-5"/>
-        <w:rPr>
-          <w:highlight w:val="darkRed"/>
-        </w:rPr>
-      </w:pPr>
-    </w:p>
-    <w:p>
-      <w:pPr>
-        <w:ind w:left="-5"/>
-        <w:rPr>
-          <w:highlight w:val="darkRed"/>
-        </w:rPr>
-      </w:pPr>
-      <w:r>
-        <w:rPr>
-          <w:b/>
-          <w:bCs/>
-          <w:highlight w:val="darkRed"/>
-        </w:rPr>
-        <w:t>C3.3 — Bons alertas, SLI, SLO e SLA.</w:t>
-      </w:r>
-      <w:r>
-        <w:rPr>
-          <w:highlight w:val="darkRed"/>
-        </w:rPr>
-        <w:t xml:space="preserve"> Defina SLI, SLO e SLA e os quatro </w:t>
-      </w:r>
+        </w:rPr>
+      </w:pPr>
       <w:r>
         <w:rPr>
           <w:i/>
           <w:iCs/>
+        </w:rPr>
+        <w:t>Sua resposta e fonte</w:t>
+      </w:r>
+    </w:p>
+    <w:p>
+      <w:pPr>
+        <w:spacing w:after="161" w:line="259" w:lineRule="auto"/>
+        <w:ind w:left="-5"/>
+      </w:pPr>
+      <w:r>
+        <w:lastRenderedPageBreak/>
+        <w:t xml:space="preserve">            </w:t>
+      </w:r>
+      <w:r>
+        <w:t xml:space="preserve">O </w:t>
+      </w:r>
+      <w:proofErr w:type="spellStart"/>
+      <w:r>
+        <w:t>prometheus</w:t>
+      </w:r>
+      <w:proofErr w:type="spellEnd"/>
+      <w:r>
+        <w:t xml:space="preserve"> por padrão utiliza o modelo </w:t>
+      </w:r>
+      <w:proofErr w:type="spellStart"/>
+      <w:r>
+        <w:t>Pull</w:t>
+      </w:r>
+      <w:proofErr w:type="spellEnd"/>
+      <w:r>
+        <w:t xml:space="preserve">, o qual é usado na maioria dos cenários, por conter menos complexidade, mostrando as métricas do cenário, e sendo fácil de executar debug, enquanto o método </w:t>
+      </w:r>
+      <w:proofErr w:type="spellStart"/>
+      <w:r>
+        <w:t>push</w:t>
+      </w:r>
+      <w:proofErr w:type="spellEnd"/>
+      <w:r>
+        <w:t xml:space="preserve"> utiliza de um intermediário </w:t>
+      </w:r>
+      <w:proofErr w:type="spellStart"/>
+      <w:r>
+        <w:t>PushGateway</w:t>
+      </w:r>
+      <w:proofErr w:type="spellEnd"/>
+      <w:r>
+        <w:t>, que traz uma complexidade muito maior para ser executado na maioria dos aspectos.</w:t>
+      </w:r>
+    </w:p>
+    <w:p>
+      <w:pPr>
+        <w:spacing w:after="161" w:line="259" w:lineRule="auto"/>
+        <w:ind w:left="-5"/>
+      </w:pPr>
+      <w:r>
+        <w:t xml:space="preserve">            </w:t>
+      </w:r>
+      <w:r>
+        <w:t xml:space="preserve">A serie temporal, “Time Series”, é a </w:t>
+      </w:r>
+      <w:r>
+        <w:t>análise</w:t>
+      </w:r>
+      <w:r>
+        <w:t xml:space="preserve"> dos valores e registros de tempo por pontos, sendo uma maneira otimizada, multidimensional de armazenar resultados, contendo 4 tipos de métricas distintas. </w:t>
+      </w:r>
+    </w:p>
+    <w:p>
+      <w:pPr>
+        <w:spacing w:after="161" w:line="259" w:lineRule="auto"/>
+        <w:ind w:left="-5"/>
+      </w:pPr>
+      <w:r>
+        <w:t>São as métricas:</w:t>
+      </w:r>
+    </w:p>
+    <w:p>
+      <w:pPr>
+        <w:pStyle w:val="PargrafodaLista"/>
+        <w:numPr>
+          <w:ilvl w:val="0"/>
+          <w:numId w:val="23"/>
+        </w:numPr>
+        <w:spacing w:after="161" w:line="259" w:lineRule="auto"/>
+      </w:pPr>
+      <w:r>
+        <w:rPr>
+          <w:b/>
+          <w:bCs/>
+        </w:rPr>
+        <w:t>Counter</w:t>
+      </w:r>
+      <w:r>
+        <w:t>:</w:t>
+      </w:r>
+      <w:r>
+        <w:t xml:space="preserve"> é uma representação numérica que não deve ser projetada para ser alterada frequentemente, tendo somente o momento de reinicialização para alterar seu valor</w:t>
+      </w:r>
+      <w:r>
+        <w:t>.</w:t>
+      </w:r>
+    </w:p>
+    <w:p>
+      <w:pPr>
+        <w:pStyle w:val="PargrafodaLista"/>
+        <w:spacing w:after="161" w:line="259" w:lineRule="auto"/>
+        <w:ind w:left="705" w:firstLine="0"/>
+        <w:rPr>
+          <w:b/>
+          <w:bCs/>
+        </w:rPr>
+      </w:pPr>
+    </w:p>
+    <w:p>
+      <w:pPr>
+        <w:pStyle w:val="PargrafodaLista"/>
+        <w:spacing w:after="161" w:line="259" w:lineRule="auto"/>
+        <w:ind w:left="705" w:firstLine="0"/>
+      </w:pPr>
+      <w:r>
+        <w:t xml:space="preserve">O Counter sempre deve ser utilizado junto de </w:t>
+      </w:r>
+      <w:proofErr w:type="gramStart"/>
+      <w:r>
+        <w:t>rate(</w:t>
+      </w:r>
+      <w:proofErr w:type="gramEnd"/>
+      <w:r>
+        <w:t xml:space="preserve">) </w:t>
+      </w:r>
+      <w:r>
+        <w:t>porque</w:t>
+      </w:r>
+      <w:r>
+        <w:t xml:space="preserve"> somente com rate é possível obter valores importantes, como requisições por segundo, enquanto </w:t>
+      </w:r>
+      <w:proofErr w:type="spellStart"/>
+      <w:r>
+        <w:t>counter</w:t>
+      </w:r>
+      <w:proofErr w:type="spellEnd"/>
+      <w:r>
+        <w:t xml:space="preserve"> sozinho efetua operações que não trazem real valor para quem analisa. </w:t>
+      </w:r>
+    </w:p>
+    <w:p>
+      <w:pPr>
+        <w:pStyle w:val="PargrafodaLista"/>
+        <w:spacing w:after="161" w:line="259" w:lineRule="auto"/>
+        <w:ind w:left="705" w:firstLine="0"/>
+      </w:pPr>
+    </w:p>
+    <w:p>
+      <w:pPr>
+        <w:pStyle w:val="PargrafodaLista"/>
+        <w:numPr>
+          <w:ilvl w:val="0"/>
+          <w:numId w:val="22"/>
+        </w:numPr>
+        <w:spacing w:after="161" w:line="259" w:lineRule="auto"/>
+      </w:pPr>
+      <w:proofErr w:type="spellStart"/>
+      <w:r>
+        <w:rPr>
+          <w:b/>
+          <w:bCs/>
+        </w:rPr>
+        <w:t>Gauge</w:t>
+      </w:r>
+      <w:proofErr w:type="spellEnd"/>
+      <w:r>
+        <w:rPr>
+          <w:b/>
+          <w:bCs/>
+        </w:rPr>
+        <w:t>:</w:t>
+      </w:r>
+      <w:r>
+        <w:t xml:space="preserve"> trata-se de um campo de valor variável, podendo subir ou descer seu valor, sendo ideais para campos altamente variáveis.</w:t>
+      </w:r>
+    </w:p>
+    <w:p>
+      <w:pPr>
+        <w:pStyle w:val="PargrafodaLista"/>
+        <w:numPr>
+          <w:ilvl w:val="0"/>
+          <w:numId w:val="22"/>
+        </w:numPr>
+        <w:spacing w:after="161" w:line="259" w:lineRule="auto"/>
+      </w:pPr>
+      <w:proofErr w:type="spellStart"/>
+      <w:r>
+        <w:rPr>
+          <w:b/>
+          <w:bCs/>
+        </w:rPr>
+        <w:t>Historigram</w:t>
+      </w:r>
+      <w:proofErr w:type="spellEnd"/>
+      <w:r>
+        <w:t>:</w:t>
+      </w:r>
+      <w:r>
+        <w:t xml:space="preserve"> armazena períodos, </w:t>
+      </w:r>
+      <w:r>
+        <w:t>análises</w:t>
+      </w:r>
+      <w:r>
+        <w:t xml:space="preserve"> temporais, ao invés de valores esparsos. Podendo ser utilizado na análise de períodos de pico, alto fluxo, </w:t>
+      </w:r>
+      <w:proofErr w:type="gramStart"/>
+      <w:r>
+        <w:t>latência e etc.</w:t>
+      </w:r>
+      <w:proofErr w:type="gramEnd"/>
+    </w:p>
+    <w:p>
+      <w:pPr>
+        <w:pStyle w:val="PargrafodaLista"/>
+        <w:numPr>
+          <w:ilvl w:val="0"/>
+          <w:numId w:val="22"/>
+        </w:numPr>
+        <w:spacing w:after="161" w:line="259" w:lineRule="auto"/>
+      </w:pPr>
+      <w:r>
+        <w:t xml:space="preserve">Quanto as ferramentas de CI/CD no </w:t>
+      </w:r>
+      <w:proofErr w:type="spellStart"/>
+      <w:r>
+        <w:t>DevOps</w:t>
+      </w:r>
+      <w:proofErr w:type="spellEnd"/>
+      <w:r>
+        <w:t>:</w:t>
+      </w:r>
+    </w:p>
+    <w:p>
+      <w:pPr>
+        <w:pStyle w:val="PargrafodaLista"/>
+        <w:numPr>
+          <w:ilvl w:val="0"/>
+          <w:numId w:val="22"/>
+        </w:numPr>
+        <w:spacing w:after="161" w:line="259" w:lineRule="auto"/>
+      </w:pPr>
+      <w:proofErr w:type="spellStart"/>
+      <w:r>
+        <w:rPr>
+          <w:b/>
+          <w:bCs/>
+        </w:rPr>
+        <w:t>cAdvisor</w:t>
+      </w:r>
+      <w:proofErr w:type="spellEnd"/>
+      <w:r>
+        <w:t xml:space="preserve">: </w:t>
+      </w:r>
+      <w:r>
+        <w:t xml:space="preserve">é uma ferramenta Open </w:t>
+      </w:r>
+      <w:proofErr w:type="spellStart"/>
+      <w:r>
+        <w:t>Code</w:t>
+      </w:r>
+      <w:proofErr w:type="spellEnd"/>
+      <w:r>
+        <w:t xml:space="preserve"> da Google voltado a </w:t>
+      </w:r>
+      <w:r>
+        <w:t>análise</w:t>
+      </w:r>
+      <w:r>
+        <w:t xml:space="preserve"> de containers em tempo real, fornecendo resumos sobre seu estado, desempenho e consumo de recursos computacionais.</w:t>
+      </w:r>
+    </w:p>
+    <w:p>
+      <w:pPr>
+        <w:pStyle w:val="PargrafodaLista"/>
+        <w:numPr>
+          <w:ilvl w:val="0"/>
+          <w:numId w:val="22"/>
+        </w:numPr>
+        <w:spacing w:after="161" w:line="259" w:lineRule="auto"/>
+      </w:pPr>
+      <w:proofErr w:type="spellStart"/>
+      <w:r>
+        <w:rPr>
+          <w:b/>
+          <w:bCs/>
+        </w:rPr>
+        <w:t>Prometheus</w:t>
+      </w:r>
+      <w:proofErr w:type="spellEnd"/>
+      <w:r>
+        <w:t xml:space="preserve">: </w:t>
+      </w:r>
+      <w:r>
+        <w:t>é uma ferramenta completa para monitoramento com alertas capaz de coletar e armazenar valores e séries temporais da aplicação.</w:t>
+      </w:r>
+    </w:p>
+    <w:p>
+      <w:pPr>
+        <w:pStyle w:val="PargrafodaLista"/>
+        <w:numPr>
+          <w:ilvl w:val="0"/>
+          <w:numId w:val="22"/>
+        </w:numPr>
+        <w:spacing w:after="161" w:line="259" w:lineRule="auto"/>
+      </w:pPr>
+      <w:proofErr w:type="spellStart"/>
+      <w:r>
+        <w:rPr>
+          <w:b/>
+          <w:bCs/>
+        </w:rPr>
+        <w:t>Grafana</w:t>
+      </w:r>
+      <w:proofErr w:type="spellEnd"/>
+      <w:r>
+        <w:t xml:space="preserve">: </w:t>
+      </w:r>
+      <w:r>
+        <w:t>trata-se de um recurso capaz de analisar métricas, consultar campos e atender alertas da aplicação, sendo capaz de criar painéis ágeis e versáteis para a maioria das necessidades.</w:t>
+      </w:r>
+    </w:p>
+    <w:p>
+      <w:pPr>
+        <w:spacing w:after="161" w:line="259" w:lineRule="auto"/>
+        <w:ind w:left="-5"/>
+      </w:pPr>
+      <w:r>
+        <w:rPr>
+          <w:b/>
+          <w:bCs/>
+          <w:color w:val="00B050"/>
+        </w:rPr>
+        <w:t>A</w:t>
+      </w:r>
+      <w:r>
+        <w:rPr>
+          <w:b/>
+          <w:bCs/>
+          <w:color w:val="00B050"/>
+        </w:rPr>
+        <w:t>1</w:t>
+      </w:r>
+    </w:p>
+    <w:p>
+      <w:pPr>
+        <w:spacing w:after="161" w:line="259" w:lineRule="auto"/>
+        <w:ind w:left="-5"/>
+      </w:pPr>
+      <w:r>
+        <w:t>Fonte</w:t>
+      </w:r>
+      <w:r>
+        <w:t>s</w:t>
+      </w:r>
+      <w:r>
+        <w:t>:</w:t>
+      </w:r>
+    </w:p>
+    <w:p>
+      <w:pPr>
+        <w:pStyle w:val="PargrafodaLista"/>
+        <w:numPr>
+          <w:ilvl w:val="0"/>
+          <w:numId w:val="21"/>
+        </w:numPr>
+        <w:spacing w:after="161" w:line="259" w:lineRule="auto"/>
+      </w:pPr>
+      <w:hyperlink r:id="rId38" w:history="1">
+        <w:r>
+          <w:rPr>
+            <w:rStyle w:val="Hyperlink"/>
+          </w:rPr>
+          <w:t>https://medium.com/@pratap477/an-architects-guide-to-prometheus-the-battle-of-push-vs-pull-00afd60d0066</w:t>
+        </w:r>
+      </w:hyperlink>
+    </w:p>
+    <w:p>
+      <w:pPr>
+        <w:pStyle w:val="PargrafodaLista"/>
+        <w:numPr>
+          <w:ilvl w:val="0"/>
+          <w:numId w:val="21"/>
+        </w:numPr>
+        <w:spacing w:after="161" w:line="259" w:lineRule="auto"/>
+      </w:pPr>
+      <w:hyperlink r:id="rId39" w:history="1">
+        <w:r>
+          <w:rPr>
+            <w:rStyle w:val="Hyperlink"/>
+          </w:rPr>
+          <w:t>https://prometheus.io/docs/concepts/metric_types/</w:t>
+        </w:r>
+      </w:hyperlink>
+    </w:p>
+    <w:p>
+      <w:pPr>
+        <w:pStyle w:val="PargrafodaLista"/>
+        <w:numPr>
+          <w:ilvl w:val="0"/>
+          <w:numId w:val="21"/>
+        </w:numPr>
+        <w:spacing w:after="161" w:line="259" w:lineRule="auto"/>
+      </w:pPr>
+      <w:hyperlink r:id="rId40" w:history="1">
+        <w:r>
+          <w:rPr>
+            <w:rStyle w:val="Hyperlink"/>
+          </w:rPr>
+          <w:t>https://medium.com/@varunjain2108/monitoring-docker-containers-with-cadvisor-prometheus-and-grafana-d101b4dbbc84</w:t>
+        </w:r>
+      </w:hyperlink>
+      <w:r>
+        <w:t xml:space="preserve"> </w:t>
+      </w:r>
+    </w:p>
+    <w:p>
+      <w:pPr>
+        <w:spacing w:after="161" w:line="259" w:lineRule="auto"/>
+        <w:ind w:left="-5"/>
+        <w:rPr>
           <w:highlight w:val="darkRed"/>
         </w:rPr>
-        <w:t>golden signals</w:t>
-      </w:r>
-      <w:r>
-        <w:rPr>
-          <w:highlight w:val="darkRed"/>
-        </w:rPr>
-        <w:t xml:space="preserve"> do livro Google SRE (latência, tráfego, erros e saturação). O que é </w:t>
+      </w:pPr>
+    </w:p>
+    <w:p>
+      <w:pPr>
+        <w:ind w:left="-5"/>
+      </w:pPr>
+      <w:r>
+        <w:rPr>
+          <w:b/>
+          <w:bCs/>
+        </w:rPr>
+        <w:t>C3.3 — Bons alertas, SLI, SLO e SLA.</w:t>
+      </w:r>
+      <w:r>
+        <w:t xml:space="preserve"> Defina SLI, SLO e SLA e os quatro </w:t>
       </w:r>
       <w:r>
         <w:rPr>
           <w:i/>
           <w:iCs/>
-          <w:highlight w:val="darkRed"/>
-        </w:rPr>
-        <w:t>alert fatigue</w:t>
-      </w:r>
-      <w:r>
-        <w:rPr>
-          <w:highlight w:val="darkRed"/>
-        </w:rPr>
-        <w:t xml:space="preserve"> e como um alerta bem escolhido a evita? Relacione com o limiar que você definiu no E3.1.</w:t>
-      </w:r>
-      <w:r>
-        <w:t xml:space="preserve"> </w:t>
-      </w:r>
-    </w:p>
-    <w:p>
-      <w:pPr>
-        <w:spacing w:after="161" w:line="259" w:lineRule="auto"/>
-        <w:ind w:left="-5"/>
-        <w:rPr>
-          <w:highlight w:val="darkRed"/>
-        </w:rPr>
-      </w:pPr>
+        </w:rPr>
+        <w:t>golden signals</w:t>
+      </w:r>
+      <w:r>
+        <w:t xml:space="preserve"> do livro Google SRE (latência, tráfego, erros e saturação). O que é </w:t>
+      </w:r>
       <w:r>
         <w:rPr>
           <w:i/>
           <w:iCs/>
-          <w:highlight w:val="darkRed"/>
-        </w:rPr>
-        <w:t>Sua resposta e fonte:</w:t>
-      </w:r>
-      <w:r>
-        <w:t xml:space="preserve"> </w:t>
+        </w:rPr>
+        <w:t>alert fatigue</w:t>
+      </w:r>
+      <w:r>
+        <w:t xml:space="preserve"> e como um alerta bem escolhido a evita? Relacione com o limiar que você definiu no E3.1. </w:t>
       </w:r>
     </w:p>
     <w:p>
       <w:pPr>
         <w:spacing w:after="161" w:line="259" w:lineRule="auto"/>
         <w:ind w:left="-5"/>
-        <w:rPr>
-          <w:highlight w:val="darkRed"/>
-        </w:rPr>
-      </w:pPr>
-    </w:p>
-    <w:p>
-      <w:pPr>
-        <w:ind w:left="-5"/>
-      </w:pPr>
-      <w:r>
-        <w:rPr>
-          <w:b/>
-          <w:bCs/>
-        </w:rPr>
-        <w:t>C3.4 — Resposta a incidentes e postmortem sem culpa.</w:t>
-      </w:r>
-      <w:r>
-        <w:t xml:space="preserve"> Descreva o ciclo detectar, diagnosticar, mitigar e aprender. Defina MTTD e MTTR. Por que o postmortem deve ser </w:t>
-      </w:r>
+      </w:pPr>
       <w:r>
         <w:rPr>
           <w:i/>
           <w:iCs/>
         </w:rPr>
-        <w:t>sem culpa</w:t>
-      </w:r>
-      <w:r>
-        <w:t xml:space="preserve"> e o que uma equipe ganha com ele? </w:t>
-      </w:r>
-    </w:p>
-    <w:p>
-      <w:pPr>
+        <w:lastRenderedPageBreak/>
+        <w:t>Sua resposta e fonte:</w:t>
+      </w:r>
+      <w:r>
+        <w:t xml:space="preserve"> </w:t>
+      </w:r>
+      <w:r>
+        <w:br/>
+      </w:r>
+      <w:r>
+        <w:br/>
+        <w:t>Os três principais indicadores são:</w:t>
+      </w:r>
+    </w:p>
+    <w:p>
+      <w:pPr>
+        <w:pStyle w:val="PargrafodaLista"/>
+        <w:numPr>
+          <w:ilvl w:val="0"/>
+          <w:numId w:val="25"/>
+        </w:numPr>
         <w:spacing w:after="161" w:line="259" w:lineRule="auto"/>
-        <w:ind w:left="-5"/>
-      </w:pPr>
+      </w:pPr>
+      <w:r>
+        <w:rPr>
+          <w:b/>
+          <w:bCs/>
+        </w:rPr>
+        <w:t>SLI</w:t>
+      </w:r>
+      <w:r>
+        <w:t xml:space="preserve">: </w:t>
+      </w:r>
+      <w:r>
+        <w:t xml:space="preserve">é um indicador que mede a qualidade </w:t>
+      </w:r>
+      <w:r>
+        <w:t xml:space="preserve">e desempenho </w:t>
+      </w:r>
+      <w:r>
+        <w:t>de um serviço</w:t>
+      </w:r>
+    </w:p>
+    <w:p>
+      <w:pPr>
+        <w:pStyle w:val="PargrafodaLista"/>
+        <w:numPr>
+          <w:ilvl w:val="0"/>
+          <w:numId w:val="25"/>
+        </w:numPr>
+        <w:spacing w:after="161" w:line="259" w:lineRule="auto"/>
+      </w:pPr>
+      <w:r>
+        <w:rPr>
+          <w:b/>
+          <w:bCs/>
+        </w:rPr>
+        <w:t>SLO</w:t>
+      </w:r>
+      <w:r>
+        <w:t xml:space="preserve">: </w:t>
+      </w:r>
+      <w:r>
+        <w:t xml:space="preserve">representa a meta </w:t>
+      </w:r>
+      <w:r>
+        <w:t xml:space="preserve">interna </w:t>
+      </w:r>
+      <w:r>
+        <w:t>que a equipe se compromete a atingir para determinada SLI</w:t>
+      </w:r>
+    </w:p>
+    <w:p>
+      <w:pPr>
+        <w:pStyle w:val="PargrafodaLista"/>
+        <w:numPr>
+          <w:ilvl w:val="0"/>
+          <w:numId w:val="25"/>
+        </w:numPr>
+        <w:spacing w:after="161" w:line="259" w:lineRule="auto"/>
+      </w:pPr>
+      <w:r>
+        <w:rPr>
+          <w:b/>
+          <w:bCs/>
+        </w:rPr>
+        <w:t>SLA</w:t>
+      </w:r>
+      <w:r>
+        <w:t xml:space="preserve">: </w:t>
+      </w:r>
+      <w:r>
+        <w:t>é um acordo formal sobre o nível de serviço oferecido</w:t>
+      </w:r>
+      <w:r>
+        <w:t xml:space="preserve"> entre </w:t>
+      </w:r>
+      <w:r>
+        <w:t>o provedor do serviço e o cliente final.</w:t>
+      </w:r>
+    </w:p>
+    <w:p>
+      <w:pPr>
+        <w:spacing w:after="161" w:line="259" w:lineRule="auto"/>
+      </w:pPr>
+      <w:r>
+        <w:t xml:space="preserve">Segundo o Google SRE, os quatro </w:t>
+      </w:r>
+      <w:r>
+        <w:t>G</w:t>
+      </w:r>
+      <w:r>
+        <w:t xml:space="preserve">olden </w:t>
+      </w:r>
+      <w:proofErr w:type="spellStart"/>
+      <w:r>
+        <w:t>S</w:t>
+      </w:r>
+      <w:r>
+        <w:t>ignals</w:t>
+      </w:r>
+      <w:proofErr w:type="spellEnd"/>
+      <w:r>
+        <w:t xml:space="preserve"> são latênci</w:t>
+      </w:r>
+      <w:r>
+        <w:t>a</w:t>
+      </w:r>
+      <w:r>
+        <w:t>, tráfego, erros e saturação.</w:t>
+      </w:r>
+    </w:p>
+    <w:p>
+      <w:pPr>
+        <w:spacing w:after="161" w:line="259" w:lineRule="auto"/>
+        <w:ind w:left="-5" w:firstLine="0"/>
+      </w:pPr>
+      <w:r>
+        <w:t xml:space="preserve">            </w:t>
+      </w:r>
+      <w:r>
+        <w:t xml:space="preserve">O </w:t>
+      </w:r>
+      <w:proofErr w:type="spellStart"/>
+      <w:r>
+        <w:t>alert</w:t>
+      </w:r>
+      <w:proofErr w:type="spellEnd"/>
+      <w:r>
+        <w:t xml:space="preserve"> fatigue ocorre quando há alertas excessivos ou pouco relevantes, fazendo com que a equipe deixe de dar a devida atenção a eles. Para evitar isso, os alertas devem utilizar limites adequados e identificar problemas que realmente precisam de intervenção.</w:t>
+      </w:r>
+      <w:r>
+        <w:t xml:space="preserve"> </w:t>
+      </w:r>
+      <w:r>
+        <w:t xml:space="preserve">No laboratório, o limiar de CPU definido no </w:t>
+      </w:r>
+      <w:proofErr w:type="spellStart"/>
+      <w:r>
+        <w:t>Grafana</w:t>
+      </w:r>
+      <w:proofErr w:type="spellEnd"/>
+      <w:r>
+        <w:t xml:space="preserve"> permite identificar um consumo elevado sem gerar notificações por pequenas oscilações.</w:t>
+      </w:r>
+    </w:p>
+    <w:p>
+      <w:pPr>
+        <w:spacing w:after="161" w:line="259" w:lineRule="auto"/>
+        <w:ind w:left="-5"/>
+        <w:rPr>
+          <w:b/>
+          <w:bCs/>
+          <w:color w:val="00B050"/>
+        </w:rPr>
+      </w:pPr>
+      <w:r>
+        <w:rPr>
+          <w:b/>
+          <w:bCs/>
+          <w:color w:val="00B050"/>
+        </w:rPr>
+        <w:t>A</w:t>
+      </w:r>
+      <w:r>
+        <w:rPr>
+          <w:b/>
+          <w:bCs/>
+          <w:color w:val="00B050"/>
+        </w:rPr>
+        <w:t>1 + A2</w:t>
+      </w:r>
+    </w:p>
+    <w:p>
+      <w:pPr>
+        <w:spacing w:after="161" w:line="259" w:lineRule="auto"/>
+        <w:ind w:left="-5"/>
+      </w:pPr>
+      <w:r>
+        <w:t>Fontes: </w:t>
+      </w:r>
+    </w:p>
+    <w:p>
+      <w:pPr>
+        <w:pStyle w:val="PargrafodaLista"/>
+        <w:numPr>
+          <w:ilvl w:val="0"/>
+          <w:numId w:val="26"/>
+        </w:numPr>
+        <w:spacing w:after="161" w:line="259" w:lineRule="auto"/>
+      </w:pPr>
+      <w:hyperlink r:id="rId41" w:history="1">
+        <w:r>
+          <w:rPr>
+            <w:rStyle w:val="Hyperlink"/>
+          </w:rPr>
+          <w:t>https://www.zendesk.com.br/blog/customer-service/sli-sla-e-slo</w:t>
+        </w:r>
+        <w:r>
+          <w:rPr>
+            <w:rStyle w:val="Hyperlink"/>
+          </w:rPr>
+          <w:t>/</w:t>
+        </w:r>
+      </w:hyperlink>
+    </w:p>
+    <w:p>
+      <w:pPr>
+        <w:pStyle w:val="PargrafodaLista"/>
+        <w:numPr>
+          <w:ilvl w:val="0"/>
+          <w:numId w:val="26"/>
+        </w:numPr>
+        <w:spacing w:after="161" w:line="259" w:lineRule="auto"/>
+      </w:pPr>
+      <w:hyperlink r:id="rId42" w:history="1">
+        <w:r>
+          <w:rPr>
+            <w:rStyle w:val="Hyperlink"/>
+          </w:rPr>
+          <w:t>https://sre.google/sre-book/monitoring-distributed-systems/</w:t>
+        </w:r>
+      </w:hyperlink>
+    </w:p>
+    <w:p>
+      <w:pPr>
+        <w:pStyle w:val="PargrafodaLista"/>
+        <w:spacing w:after="161" w:line="259" w:lineRule="auto"/>
+        <w:ind w:left="705" w:firstLine="0"/>
+      </w:pPr>
+    </w:p>
+    <w:p>
+      <w:pPr>
+        <w:spacing w:after="161" w:line="259" w:lineRule="auto"/>
+        <w:ind w:left="0" w:firstLine="0"/>
+      </w:pPr>
+    </w:p>
+    <w:p>
+      <w:pPr>
+        <w:ind w:left="-5"/>
+      </w:pPr>
+      <w:r>
+        <w:rPr>
+          <w:b/>
+          <w:bCs/>
+        </w:rPr>
+        <w:t>C3.4 — Resposta a incidentes e postmortem sem culpa.</w:t>
+      </w:r>
+      <w:r>
+        <w:t xml:space="preserve"> Descreva o ciclo detectar, diagnosticar, mitigar e aprender. Defina MTTD e MTTR. Por que o postmortem deve ser </w:t>
+      </w:r>
       <w:r>
         <w:rPr>
           <w:i/>
           <w:iCs/>
         </w:rPr>
+        <w:t>sem culpa</w:t>
+      </w:r>
+      <w:r>
+        <w:t xml:space="preserve"> e o que uma equipe ganha com ele? </w:t>
+      </w:r>
+    </w:p>
+    <w:p>
+      <w:pPr>
+        <w:spacing w:after="161" w:line="259" w:lineRule="auto"/>
+        <w:ind w:left="-5"/>
+      </w:pPr>
+      <w:r>
+        <w:rPr>
+          <w:i/>
+          <w:iCs/>
+        </w:rPr>
         <w:t>Sua resposta e fonte:</w:t>
       </w:r>
       <w:r>
@@ -8721,56 +9163,377 @@
       <w:pPr>
         <w:spacing w:after="161" w:line="259" w:lineRule="auto"/>
         <w:ind w:left="-5"/>
-        <w:rPr>
-          <w:u w:val="single"/>
-        </w:rPr>
-      </w:pPr>
-      <w:r>
-        <w:t>O ciclo detectar, diagnosticar, mitigar e aprender:</w:t>
-      </w:r>
-    </w:p>
-    <w:p>
-      <w:pPr>
+      </w:pPr>
+      <w:r>
+        <w:t>O Ciclo de Resposta a Incidentes quatro etapas: </w:t>
+      </w:r>
+    </w:p>
+    <w:p>
+      <w:pPr>
+        <w:numPr>
+          <w:ilvl w:val="0"/>
+          <w:numId w:val="10"/>
+        </w:numPr>
         <w:spacing w:after="161" w:line="259" w:lineRule="auto"/>
-        <w:ind w:left="-5"/>
-      </w:pPr>
-    </w:p>
-    <w:p>
-      <w:pPr>
-        <w:ind w:left="-5"/>
-        <w:rPr>
-          <w:highlight w:val="darkRed"/>
-        </w:rPr>
       </w:pPr>
       <w:r>
         <w:rPr>
           <w:b/>
           <w:bCs/>
         </w:rPr>
+        <w:t>Detectar</w:t>
+      </w:r>
+      <w:r>
+        <w:t>: etapa de identificação do problema de forma rápida e eficiente, utilizando de ferramentas de monitoramento automatizado, alertas de segurança e relatórios. </w:t>
+      </w:r>
+    </w:p>
+    <w:p>
+      <w:pPr>
+        <w:numPr>
+          <w:ilvl w:val="0"/>
+          <w:numId w:val="11"/>
+        </w:numPr>
+        <w:spacing w:after="161" w:line="259" w:lineRule="auto"/>
+      </w:pPr>
+      <w:r>
+        <w:rPr>
+          <w:b/>
+          <w:bCs/>
+        </w:rPr>
+        <w:t>Diagnosticar</w:t>
+      </w:r>
+      <w:r>
+        <w:t>: etapa de diagnóstico da causa do problema, buscando entender os motivos pelos quais ocasionaram no incidente. Ela pode ser feita através da análise de logs e eventos que permitem verificar alterações no sistema e o isolamento do ambiente fechado. </w:t>
+      </w:r>
+    </w:p>
+    <w:p>
+      <w:pPr>
+        <w:numPr>
+          <w:ilvl w:val="0"/>
+          <w:numId w:val="12"/>
+        </w:numPr>
+        <w:spacing w:after="161" w:line="259" w:lineRule="auto"/>
+      </w:pPr>
+      <w:r>
+        <w:rPr>
+          <w:b/>
+          <w:bCs/>
+        </w:rPr>
+        <w:t>Mitigar</w:t>
+      </w:r>
+      <w:r>
+        <w:t xml:space="preserve">: etapa focada em conter os impactos causados pelo problema, aplicando uma solução temporária até encontrar uma solução definitiva para o caso. Isso pode ser feito através da reinicialização, atualizações ou reinstalação do sistema, fazer o </w:t>
+      </w:r>
+      <w:proofErr w:type="spellStart"/>
+      <w:r>
+        <w:t>rollback</w:t>
+      </w:r>
+      <w:proofErr w:type="spellEnd"/>
+      <w:r>
+        <w:t xml:space="preserve">, bloquear </w:t>
+      </w:r>
+      <w:proofErr w:type="spellStart"/>
+      <w:proofErr w:type="gramStart"/>
+      <w:r>
+        <w:t>IPs</w:t>
+      </w:r>
+      <w:proofErr w:type="spellEnd"/>
+      <w:r>
+        <w:t xml:space="preserve"> e etc.</w:t>
+      </w:r>
+      <w:proofErr w:type="gramEnd"/>
+      <w:r>
+        <w:t> </w:t>
+      </w:r>
+    </w:p>
+    <w:p>
+      <w:pPr>
+        <w:numPr>
+          <w:ilvl w:val="0"/>
+          <w:numId w:val="13"/>
+        </w:numPr>
+        <w:spacing w:after="161" w:line="259" w:lineRule="auto"/>
+      </w:pPr>
+      <w:r>
+        <w:rPr>
+          <w:b/>
+          <w:bCs/>
+        </w:rPr>
+        <w:t>Aprender</w:t>
+      </w:r>
+      <w:r>
+        <w:t>: etapa que busca aprender com a crise, preparando a equipe para garantir que o mesmo erro não ocorra novamente. </w:t>
+      </w:r>
+    </w:p>
+    <w:p>
+      <w:pPr>
+        <w:spacing w:after="161" w:line="259" w:lineRule="auto"/>
+        <w:ind w:left="-5"/>
+      </w:pPr>
+      <w:r>
+        <w:lastRenderedPageBreak/>
+        <w:t>Esse ciclo é semelhante ao Ciclo PDCA, do Scrum. </w:t>
+      </w:r>
+    </w:p>
+    <w:p>
+      <w:pPr>
+        <w:spacing w:after="161" w:line="259" w:lineRule="auto"/>
+        <w:ind w:left="-5"/>
+      </w:pPr>
+      <w:r>
+        <w:t>As métricas MTTD e MTTR: </w:t>
+      </w:r>
+    </w:p>
+    <w:p>
+      <w:pPr>
+        <w:numPr>
+          <w:ilvl w:val="0"/>
+          <w:numId w:val="14"/>
+        </w:numPr>
+        <w:spacing w:after="161" w:line="259" w:lineRule="auto"/>
+      </w:pPr>
+      <w:r>
+        <w:rPr>
+          <w:b/>
+          <w:bCs/>
+        </w:rPr>
+        <w:t>MTTD (</w:t>
+      </w:r>
+      <w:proofErr w:type="spellStart"/>
+      <w:r>
+        <w:rPr>
+          <w:b/>
+          <w:bCs/>
+        </w:rPr>
+        <w:t>Mean</w:t>
+      </w:r>
+      <w:proofErr w:type="spellEnd"/>
+      <w:r>
+        <w:rPr>
+          <w:b/>
+          <w:bCs/>
+        </w:rPr>
+        <w:t xml:space="preserve"> Time </w:t>
+      </w:r>
+      <w:proofErr w:type="spellStart"/>
+      <w:r>
+        <w:rPr>
+          <w:b/>
+          <w:bCs/>
+        </w:rPr>
+        <w:t>to</w:t>
+      </w:r>
+      <w:proofErr w:type="spellEnd"/>
+      <w:r>
+        <w:rPr>
+          <w:b/>
+          <w:bCs/>
+        </w:rPr>
+        <w:t xml:space="preserve"> </w:t>
+      </w:r>
+      <w:proofErr w:type="spellStart"/>
+      <w:r>
+        <w:rPr>
+          <w:b/>
+          <w:bCs/>
+        </w:rPr>
+        <w:t>Detect</w:t>
+      </w:r>
+      <w:proofErr w:type="spellEnd"/>
+      <w:r>
+        <w:rPr>
+          <w:b/>
+          <w:bCs/>
+        </w:rPr>
+        <w:t>)</w:t>
+      </w:r>
+      <w:r>
+        <w:t>: Representa o tempo necessário para a empresa detectar um incidente. </w:t>
+      </w:r>
+    </w:p>
+    <w:p>
+      <w:pPr>
+        <w:numPr>
+          <w:ilvl w:val="0"/>
+          <w:numId w:val="15"/>
+        </w:numPr>
+        <w:spacing w:after="161" w:line="259" w:lineRule="auto"/>
+      </w:pPr>
+      <w:r>
+        <w:rPr>
+          <w:b/>
+          <w:bCs/>
+        </w:rPr>
+        <w:t>MTTR (</w:t>
+      </w:r>
+      <w:proofErr w:type="spellStart"/>
+      <w:r>
+        <w:rPr>
+          <w:b/>
+          <w:bCs/>
+        </w:rPr>
+        <w:t>Mean</w:t>
+      </w:r>
+      <w:proofErr w:type="spellEnd"/>
+      <w:r>
+        <w:rPr>
+          <w:b/>
+          <w:bCs/>
+        </w:rPr>
+        <w:t xml:space="preserve"> Time </w:t>
+      </w:r>
+      <w:proofErr w:type="spellStart"/>
+      <w:r>
+        <w:rPr>
+          <w:b/>
+          <w:bCs/>
+        </w:rPr>
+        <w:t>to</w:t>
+      </w:r>
+      <w:proofErr w:type="spellEnd"/>
+      <w:r>
+        <w:rPr>
+          <w:b/>
+          <w:bCs/>
+        </w:rPr>
+        <w:t xml:space="preserve"> </w:t>
+      </w:r>
+      <w:proofErr w:type="spellStart"/>
+      <w:r>
+        <w:rPr>
+          <w:b/>
+          <w:bCs/>
+        </w:rPr>
+        <w:t>Repair</w:t>
+      </w:r>
+      <w:proofErr w:type="spellEnd"/>
+      <w:r>
+        <w:rPr>
+          <w:b/>
+          <w:bCs/>
+        </w:rPr>
+        <w:t>)</w:t>
+      </w:r>
+      <w:r>
+        <w:t>: Indica o tempo que a empresa leva para corrigir o incidente. </w:t>
+      </w:r>
+    </w:p>
+    <w:p>
+      <w:pPr>
+        <w:spacing w:after="161" w:line="259" w:lineRule="auto"/>
+        <w:ind w:left="-5"/>
+      </w:pPr>
+      <w:r>
+        <w:t xml:space="preserve">            O </w:t>
+      </w:r>
+      <w:proofErr w:type="spellStart"/>
+      <w:r>
+        <w:t>postmortem</w:t>
+      </w:r>
+      <w:proofErr w:type="spellEnd"/>
+      <w:r>
+        <w:t xml:space="preserve"> sem culpa busca analisar as causas e os processos envolvidos em incidente, sem responsabilizar os um indivíduo ou equipe por comportamento ruim ou inapropriado. Isso permite que a equipe compartilhe informações, identifique melhorias e reduza a possibilidade de incidentes semelhantes, sem o medo de sofrer punições ou consequências que não auxiliariam na resolução dos problemas. </w:t>
+      </w:r>
+    </w:p>
+    <w:p>
+      <w:pPr>
+        <w:spacing w:after="161" w:line="259" w:lineRule="auto"/>
+        <w:ind w:left="-5"/>
+      </w:pPr>
+      <w:r>
+        <w:rPr>
+          <w:b/>
+          <w:bCs/>
+          <w:color w:val="00B050"/>
+        </w:rPr>
+        <w:t>A</w:t>
+      </w:r>
+      <w:r>
+        <w:rPr>
+          <w:b/>
+          <w:bCs/>
+          <w:color w:val="00B050"/>
+        </w:rPr>
+        <w:t>2</w:t>
+      </w:r>
+    </w:p>
+    <w:p>
+      <w:pPr>
+        <w:spacing w:after="161" w:line="259" w:lineRule="auto"/>
+        <w:ind w:left="-5"/>
+      </w:pPr>
+      <w:r>
+        <w:t>Fontes: </w:t>
+      </w:r>
+    </w:p>
+    <w:p>
+      <w:pPr>
+        <w:numPr>
+          <w:ilvl w:val="0"/>
+          <w:numId w:val="16"/>
+        </w:numPr>
+        <w:spacing w:after="161" w:line="259" w:lineRule="auto"/>
+      </w:pPr>
+      <w:hyperlink r:id="rId43" w:tgtFrame="_blank" w:history="1">
+        <w:r>
+          <w:rPr>
+            <w:rStyle w:val="Hyperlink"/>
+          </w:rPr>
+          <w:t>https://blog.cubos.io/mttd-e-mttr-o-que-sao-e-por-que-dar-atencao/</w:t>
+        </w:r>
+      </w:hyperlink>
+      <w:r>
+        <w:t> </w:t>
+      </w:r>
+    </w:p>
+    <w:p>
+      <w:pPr>
+        <w:numPr>
+          <w:ilvl w:val="0"/>
+          <w:numId w:val="17"/>
+        </w:numPr>
+        <w:spacing w:after="161" w:line="259" w:lineRule="auto"/>
+      </w:pPr>
+      <w:hyperlink r:id="rId44" w:tgtFrame="_blank" w:history="1">
+        <w:r>
+          <w:rPr>
+            <w:rStyle w:val="Hyperlink"/>
+          </w:rPr>
+          <w:t>https://sre.google/sre-book/postmortem-culture/</w:t>
+        </w:r>
+      </w:hyperlink>
+    </w:p>
+    <w:p>
+      <w:pPr>
+        <w:spacing w:after="161" w:line="259" w:lineRule="auto"/>
+        <w:ind w:left="-5"/>
+      </w:pPr>
+    </w:p>
+    <w:p>
+      <w:pPr>
+        <w:ind w:left="-5"/>
+      </w:pPr>
+      <w:r>
+        <w:rPr>
+          <w:b/>
+          <w:bCs/>
+        </w:rPr>
         <w:t>C3.5 — Visão integrada e segurança.</w:t>
       </w:r>
       <w:r>
         <w:t xml:space="preserve"> Explique como IaC, CI/CD e observabilidade formam um ciclo contínuo de melhoria (o que a observabilidade devolve para o desenvolvimento?). Cite o serviço equivalente ao Prometheus e ao Grafana em um provedor de nuvem (AWS, Azure ou GCP). Aponte </w:t>
       </w:r>
       <w:r>
-        <w:rPr>
-          <w:highlight w:val="darkRed"/>
-        </w:rPr>
-        <w:lastRenderedPageBreak/>
         <w:t xml:space="preserve">ainda </w:t>
       </w:r>
       <w:r>
         <w:rPr>
           <w:b/>
           <w:bCs/>
-          <w:highlight w:val="darkRed"/>
         </w:rPr>
         <w:t>dois riscos de segurança</w:t>
       </w:r>
       <w:r>
-        <w:rPr>
-          <w:highlight w:val="darkRed"/>
-        </w:rPr>
         <w:t xml:space="preserve"> da stack do laboratório (por exemplo cAdvisor com </w:t>
       </w:r>
       <w:r>
@@ -8778,15 +9541,11 @@
           <w:rFonts w:ascii="Consolas" w:eastAsia="Consolas" w:hAnsi="Consolas" w:cs="Consolas"/>
           <w:sz w:val="20"/>
           <w:szCs w:val="20"/>
-          <w:highlight w:val="darkRed"/>
           <w:shd w:val="clear" w:color="auto" w:fill="F5F5F5"/>
         </w:rPr>
         <w:t>privileged = true</w:t>
       </w:r>
       <w:r>
-        <w:rPr>
-          <w:highlight w:val="darkRed"/>
-        </w:rPr>
         <w:t xml:space="preserve">, Grafana com </w:t>
       </w:r>
       <w:r>
@@ -8794,58 +9553,213 @@
           <w:rFonts w:ascii="Consolas" w:eastAsia="Consolas" w:hAnsi="Consolas" w:cs="Consolas"/>
           <w:sz w:val="20"/>
           <w:szCs w:val="20"/>
-          <w:highlight w:val="darkRed"/>
           <w:shd w:val="clear" w:color="auto" w:fill="F5F5F5"/>
         </w:rPr>
         <w:t>admin/admin</w:t>
       </w:r>
       <w:r>
-        <w:rPr>
-          <w:highlight w:val="darkRed"/>
-        </w:rPr>
-        <w:t>, senha do Postgres em texto aberto) e como você os mitigaria em produção.</w:t>
-      </w:r>
-      <w:r>
-        <w:t xml:space="preserve"> </w:t>
+        <w:t xml:space="preserve">, senha do Postgres em texto aberto) e como você os mitigaria em produção. </w:t>
       </w:r>
     </w:p>
     <w:p>
       <w:pPr>
         <w:spacing w:after="197" w:line="259" w:lineRule="auto"/>
         <w:ind w:left="-5"/>
-        <w:rPr>
-          <w:highlight w:val="darkRed"/>
-        </w:rPr>
       </w:pPr>
       <w:r>
         <w:rPr>
           <w:i/>
           <w:iCs/>
-          <w:highlight w:val="darkRed"/>
         </w:rPr>
         <w:t>Sua resposta e fonte:</w:t>
       </w:r>
+    </w:p>
+    <w:p>
+      <w:pPr>
+        <w:spacing w:after="197" w:line="259" w:lineRule="auto"/>
+        <w:ind w:left="-5"/>
+      </w:pPr>
+      <w:r>
+        <w:t xml:space="preserve">            A </w:t>
+      </w:r>
+      <w:proofErr w:type="spellStart"/>
+      <w:r>
+        <w:t>IaC</w:t>
+      </w:r>
+      <w:proofErr w:type="spellEnd"/>
+      <w:r>
+        <w:t xml:space="preserve"> permite criar e gerenciar a infraestrutura por meio de código, enquanto o CI/CD automatiza a validação a implantação das alterações. Já a </w:t>
+      </w:r>
+      <w:proofErr w:type="spellStart"/>
+      <w:r>
+        <w:t>observabilidade</w:t>
+      </w:r>
+      <w:proofErr w:type="spellEnd"/>
+      <w:r>
+        <w:t xml:space="preserve"> acompanha o funcionamento do sistema e fornece métricas e alertas que ajudam os desenvolvedores a identificarem falhas e realizar melhorias.  Na AWS, o </w:t>
+      </w:r>
+      <w:proofErr w:type="spellStart"/>
+      <w:r>
+        <w:t>Amazon</w:t>
+      </w:r>
+      <w:proofErr w:type="spellEnd"/>
       <w:r>
         <w:t xml:space="preserve"> </w:t>
       </w:r>
+      <w:proofErr w:type="spellStart"/>
+      <w:r>
+        <w:t>CloudWatch</w:t>
+      </w:r>
+      <w:proofErr w:type="spellEnd"/>
+      <w:r>
+        <w:t xml:space="preserve"> oferece recursos de monitoramento, dashboards e alertas semelhantes aos utilizados com </w:t>
+      </w:r>
+      <w:proofErr w:type="spellStart"/>
+      <w:r>
+        <w:t>Prometheus</w:t>
+      </w:r>
+      <w:proofErr w:type="spellEnd"/>
+      <w:r>
+        <w:t xml:space="preserve"> e </w:t>
+      </w:r>
+      <w:proofErr w:type="spellStart"/>
+      <w:r>
+        <w:t>Grafana</w:t>
+      </w:r>
+      <w:proofErr w:type="spellEnd"/>
+      <w:r>
+        <w:t>.  </w:t>
+      </w:r>
+    </w:p>
+    <w:p>
+      <w:pPr>
+        <w:spacing w:after="161" w:line="259" w:lineRule="auto"/>
+        <w:ind w:left="-5"/>
+      </w:pPr>
+      <w:r>
+        <w:t xml:space="preserve">            Entre os riscos do laboratório estão o </w:t>
+      </w:r>
+      <w:proofErr w:type="spellStart"/>
+      <w:r>
+        <w:t>cAdvisor</w:t>
+      </w:r>
+      <w:proofErr w:type="spellEnd"/>
+      <w:r>
+        <w:t xml:space="preserve"> com </w:t>
+      </w:r>
+      <w:proofErr w:type="spellStart"/>
+      <w:r>
+        <w:t>privileged</w:t>
+      </w:r>
+      <w:proofErr w:type="spellEnd"/>
+      <w:r>
+        <w:t xml:space="preserve"> = </w:t>
+      </w:r>
+      <w:proofErr w:type="spellStart"/>
+      <w:r>
+        <w:t>true</w:t>
+      </w:r>
+      <w:proofErr w:type="spellEnd"/>
+      <w:r>
+        <w:t>, que concede permissões elevadas ao container, e a senha do PostgreSQL em texto aberto no main.tf. Em produção, esses riscos podem ser reduzidos limitando os privilégios do container e utilizando um gerenciador de segredos para proteger as credenciais. </w:t>
+      </w:r>
+      <w:r>
+        <w:br/>
+      </w:r>
+      <w:r>
+        <w:rPr>
+          <w:b/>
+          <w:bCs/>
+          <w:color w:val="00B050"/>
+        </w:rPr>
+        <w:t>A</w:t>
+      </w:r>
+      <w:r>
+        <w:rPr>
+          <w:b/>
+          <w:bCs/>
+          <w:color w:val="00B050"/>
+        </w:rPr>
+        <w:t>2</w:t>
+      </w:r>
+      <w:r>
+        <w:br/>
+        <w:t>Fontes: </w:t>
+      </w:r>
+    </w:p>
+    <w:p>
+      <w:pPr>
+        <w:numPr>
+          <w:ilvl w:val="0"/>
+          <w:numId w:val="18"/>
+        </w:numPr>
+        <w:spacing w:after="197" w:line="259" w:lineRule="auto"/>
+      </w:pPr>
+      <w:hyperlink r:id="rId45" w:tgtFrame="_blank" w:history="1">
+        <w:r>
+          <w:rPr>
+            <w:rStyle w:val="Hyperlink"/>
+          </w:rPr>
+          <w:t>https://docs.aws.amazon.com/pt_br/prescriptive-guidance/latest/amazon-rds-monitoring-alerting/third-party-monitoring-tools.html</w:t>
+        </w:r>
+      </w:hyperlink>
+      <w:r>
+        <w:t> </w:t>
+      </w:r>
+    </w:p>
+    <w:p>
+      <w:pPr>
+        <w:numPr>
+          <w:ilvl w:val="0"/>
+          <w:numId w:val="19"/>
+        </w:numPr>
+        <w:spacing w:after="197" w:line="259" w:lineRule="auto"/>
+      </w:pPr>
+      <w:hyperlink r:id="rId46" w:tgtFrame="_blank" w:history="1">
+        <w:r>
+          <w:rPr>
+            <w:rStyle w:val="Hyperlink"/>
+          </w:rPr>
+          <w:t>https://docs.aws.amazon.com/AmazonECS/latest/developerguide/security-tasks-containers.html</w:t>
+        </w:r>
+      </w:hyperlink>
+      <w:r>
+        <w:t> </w:t>
+      </w:r>
+    </w:p>
+    <w:p>
+      <w:pPr>
+        <w:numPr>
+          <w:ilvl w:val="0"/>
+          <w:numId w:val="20"/>
+        </w:numPr>
+        <w:spacing w:after="197" w:line="259" w:lineRule="auto"/>
+      </w:pPr>
+      <w:r>
+        <w:t>Com base nas respostas da parte B do Laboratório 3, desta apostila. </w:t>
+      </w:r>
+    </w:p>
+    <w:p>
+      <w:pPr>
+        <w:spacing w:after="197" w:line="259" w:lineRule="auto"/>
+        <w:ind w:left="-5"/>
+      </w:pPr>
     </w:p>
     <w:p>
       <w:pPr>
         <w:spacing w:after="0" w:line="259" w:lineRule="auto"/>
         <w:ind w:left="0" w:firstLine="0"/>
         <w:rPr>
-          <w:b/>
-          <w:bCs/>
           <w:sz w:val="26"/>
           <w:szCs w:val="26"/>
         </w:rPr>
         <w:sectPr>
-          <w:headerReference w:type="even" r:id="rId38"/>
-          <w:headerReference w:type="default" r:id="rId39"/>
-          <w:footerReference w:type="even" r:id="rId40"/>
-          <w:footerReference w:type="default" r:id="rId41"/>
-          <w:headerReference w:type="first" r:id="rId42"/>
-          <w:footerReference w:type="first" r:id="rId43"/>
+          <w:headerReference w:type="even" r:id="rId47"/>
+          <w:headerReference w:type="default" r:id="rId48"/>
+          <w:footerReference w:type="even" r:id="rId49"/>
+          <w:footerReference w:type="default" r:id="rId50"/>
+          <w:headerReference w:type="first" r:id="rId51"/>
+          <w:footerReference w:type="first" r:id="rId52"/>
           <w:pgSz w:w="12240" w:h="15840"/>
           <w:pgMar w:top="1484" w:right="1439" w:bottom="1777" w:left="1440" w:header="720" w:footer="720" w:gutter="0"/>
           <w:cols w:space="720"/>
@@ -9482,11 +10396,11 @@
       </w:r>
     </w:p>
     <w:sectPr>
-      <w:headerReference w:type="even" r:id="rId44"/>
-      <w:headerReference w:type="default" r:id="rId45"/>
-      <w:footerReference w:type="default" r:id="rId46"/>
-      <w:headerReference w:type="first" r:id="rId47"/>
-      <w:footerReference w:type="first" r:id="rId48"/>
+      <w:headerReference w:type="even" r:id="rId53"/>
+      <w:headerReference w:type="default" r:id="rId54"/>
+      <w:footerReference w:type="default" r:id="rId55"/>
+      <w:headerReference w:type="first" r:id="rId56"/>
+      <w:footerReference w:type="first" r:id="rId57"/>
       <w:pgSz w:w="12240" w:h="15840"/>
       <w:pgMar w:top="1440" w:right="1502" w:bottom="1440" w:left="1440" w:header="720" w:footer="720" w:gutter="0"/>
       <w:cols w:space="720"/>
@@ -9496,7 +10410,7 @@
 </file>
 
 <file path=word/endnotes.xml><?xml version="1.0" encoding="utf-8"?>
-<w:endnotes xmlns:wpc="http://schemas.microsoft.com/office/word/2010/wordprocessingCanvas" xmlns:cx="http://schemas.microsoft.com/office/drawing/2014/chartex" xmlns:cx1="http://schemas.microsoft.com/office/drawing/2015/9/8/chartex" xmlns:cx2="http://schemas.microsoft.com/office/drawing/2015/10/21/chartex" xmlns:cx3="http://schemas.microsoft.com/office/drawing/2016/5/9/chartex" xmlns:cx4="http://schemas.microsoft.com/office/drawing/2016/5/10/chartex" xmlns:cx5="http://schemas.microsoft.com/office/drawing/2016/5/11/chartex" xmlns:cx6="http://schemas.microsoft.com/office/drawing/2016/5/12/chartex" xmlns:cx7="http://schemas.microsoft.com/office/drawing/2016/5/13/chartex" xmlns:cx8="http://schemas.microsoft.com/office/drawing/2016/5/14/chartex" xmlns:mc="http://schemas.openxmlformats.org/markup-compatibility/2006" xmlns:aink="http://schemas.microsoft.com/office/drawing/2016/ink" xmlns:am3d="http://schemas.microsoft.com/office/drawing/2017/model3d" xmlns:o="urn:schemas-microsoft-com:office:office" xmlns:r="http://schemas.openxmlformats.org/officeDocument/2006/relationships" xmlns:m="http://schemas.openxmlformats.org/officeDocument/2006/math" xmlns:v="urn:schemas-microsoft-com:vml" xmlns:wp14="http://schemas.microsoft.com/office/word/2010/wordprocessingDrawing" xmlns:wp="http://schemas.openxmlformats.org/drawingml/2006/wordprocessingDrawing" xmlns:w10="urn:schemas-microsoft-com:office:word" xmlns:w="http://schemas.openxmlformats.org/wordprocessingml/2006/main" xmlns:w14="http://schemas.microsoft.com/office/word/2010/wordml" xmlns:w15="http://schemas.microsoft.com/office/word/2012/wordml" xmlns:w16cex="http://schemas.microsoft.com/office/word/2018/wordml/cex" xmlns:w16cid="http://schemas.microsoft.com/office/word/2016/wordml/cid" xmlns:w16="http://schemas.microsoft.com/office/word/2018/wordml" xmlns:w16sdtdh="http://schemas.microsoft.com/office/word/2020/wordml/sdtdatahash" xmlns:w16se="http://schemas.microsoft.com/office/word/2015/wordml/symex" xmlns:wpg="http://schemas.microsoft.com/office/word/2010/wordprocessingGroup" xmlns:wpi="http://schemas.microsoft.com/office/word/2010/wordprocessingInk" xmlns:wne="http://schemas.microsoft.com/office/word/2006/wordml" xmlns:wps="http://schemas.microsoft.com/office/word/2010/wordprocessingShape" mc:Ignorable="w14 w15 w16se w16cid w16 w16cex w16sdtdh wp14">
+<w:endnotes xmlns:wpc="http://schemas.microsoft.com/office/word/2010/wordprocessingCanvas" xmlns:cx="http://schemas.microsoft.com/office/drawing/2014/chartex" xmlns:cx1="http://schemas.microsoft.com/office/drawing/2015/9/8/chartex" xmlns:cx2="http://schemas.microsoft.com/office/drawing/2015/10/21/chartex" xmlns:cx3="http://schemas.microsoft.com/office/drawing/2016/5/9/chartex" xmlns:cx4="http://schemas.microsoft.com/office/drawing/2016/5/10/chartex" xmlns:cx5="http://schemas.microsoft.com/office/drawing/2016/5/11/chartex" xmlns:cx6="http://schemas.microsoft.com/office/drawing/2016/5/12/chartex" xmlns:cx7="http://schemas.microsoft.com/office/drawing/2016/5/13/chartex" xmlns:cx8="http://schemas.microsoft.com/office/drawing/2016/5/14/chartex" xmlns:mc="http://schemas.openxmlformats.org/markup-compatibility/2006" xmlns:aink="http://schemas.microsoft.com/office/drawing/2016/ink" xmlns:am3d="http://schemas.microsoft.com/office/drawing/2017/model3d" xmlns:o="urn:schemas-microsoft-com:office:office" xmlns:oel="http://schemas.microsoft.com/office/2019/extlst" xmlns:r="http://schemas.openxmlformats.org/officeDocument/2006/relationships" xmlns:m="http://schemas.openxmlformats.org/officeDocument/2006/math" xmlns:v="urn:schemas-microsoft-com:vml" xmlns:wp14="http://schemas.microsoft.com/office/word/2010/wordprocessingDrawing" xmlns:wp="http://schemas.openxmlformats.org/drawingml/2006/wordprocessingDrawing" xmlns:w10="urn:schemas-microsoft-com:office:word" xmlns:w="http://schemas.openxmlformats.org/wordprocessingml/2006/main" xmlns:w14="http://schemas.microsoft.com/office/word/2010/wordml" xmlns:w15="http://schemas.microsoft.com/office/word/2012/wordml" xmlns:w16cex="http://schemas.microsoft.com/office/word/2018/wordml/cex" xmlns:w16cid="http://schemas.microsoft.com/office/word/2016/wordml/cid" xmlns:w16="http://schemas.microsoft.com/office/word/2018/wordml" xmlns:w16du="http://schemas.microsoft.com/office/word/2023/wordml/word16du" xmlns:w16sdtdh="http://schemas.microsoft.com/office/word/2020/wordml/sdtdatahash" xmlns:w16sdtfl="http://schemas.microsoft.com/office/word/2024/wordml/sdtformatlock" xmlns:w16se="http://schemas.microsoft.com/office/word/2015/wordml/symex" xmlns:wpg="http://schemas.microsoft.com/office/word/2010/wordprocessingGroup" xmlns:wpi="http://schemas.microsoft.com/office/word/2010/wordprocessingInk" xmlns:wne="http://schemas.microsoft.com/office/word/2006/wordml" xmlns:wps="http://schemas.microsoft.com/office/word/2010/wordprocessingShape" mc:Ignorable="w14 w15 w16se w16cid w16 w16cex w16sdtdh w16sdtfl w16du wp14">
   <w:endnote w:type="separator" w:id="-1">
     <w:p>
       <w:pPr>
@@ -9521,7 +10435,7 @@
 </file>
 
 <file path=word/footer1.xml><?xml version="1.0" encoding="utf-8"?>
-<w:ftr xmlns:wpc="http://schemas.microsoft.com/office/word/2010/wordprocessingCanvas" xmlns:cx="http://schemas.microsoft.com/office/drawing/2014/chartex" xmlns:cx1="http://schemas.microsoft.com/office/drawing/2015/9/8/chartex" xmlns:cx2="http://schemas.microsoft.com/office/drawing/2015/10/21/chartex" xmlns:cx3="http://schemas.microsoft.com/office/drawing/2016/5/9/chartex" xmlns:cx4="http://schemas.microsoft.com/office/drawing/2016/5/10/chartex" xmlns:cx5="http://schemas.microsoft.com/office/drawing/2016/5/11/chartex" xmlns:cx6="http://schemas.microsoft.com/office/drawing/2016/5/12/chartex" xmlns:cx7="http://schemas.microsoft.com/office/drawing/2016/5/13/chartex" xmlns:cx8="http://schemas.microsoft.com/office/drawing/2016/5/14/chartex" xmlns:mc="http://schemas.openxmlformats.org/markup-compatibility/2006" xmlns:aink="http://schemas.microsoft.com/office/drawing/2016/ink" xmlns:am3d="http://schemas.microsoft.com/office/drawing/2017/model3d" xmlns:o="urn:schemas-microsoft-com:office:office" xmlns:r="http://schemas.openxmlformats.org/officeDocument/2006/relationships" xmlns:m="http://schemas.openxmlformats.org/officeDocument/2006/math" xmlns:v="urn:schemas-microsoft-com:vml" xmlns:wp14="http://schemas.microsoft.com/office/word/2010/wordprocessingDrawing" xmlns:wp="http://schemas.openxmlformats.org/drawingml/2006/wordprocessingDrawing" xmlns:w10="urn:schemas-microsoft-com:office:word" xmlns:w="http://schemas.openxmlformats.org/wordprocessingml/2006/main" xmlns:w14="http://schemas.microsoft.com/office/word/2010/wordml" xmlns:w15="http://schemas.microsoft.com/office/word/2012/wordml" xmlns:w16cex="http://schemas.microsoft.com/office/word/2018/wordml/cex" xmlns:w16cid="http://schemas.microsoft.com/office/word/2016/wordml/cid" xmlns:w16="http://schemas.microsoft.com/office/word/2018/wordml" xmlns:w16sdtdh="http://schemas.microsoft.com/office/word/2020/wordml/sdtdatahash" xmlns:w16se="http://schemas.microsoft.com/office/word/2015/wordml/symex" xmlns:wpg="http://schemas.microsoft.com/office/word/2010/wordprocessingGroup" xmlns:wpi="http://schemas.microsoft.com/office/word/2010/wordprocessingInk" xmlns:wne="http://schemas.microsoft.com/office/word/2006/wordml" xmlns:wps="http://schemas.microsoft.com/office/word/2010/wordprocessingShape" mc:Ignorable="w14 w15 w16se w16cid w16 w16cex w16sdtdh wp14">
+<w:ftr xmlns:wpc="http://schemas.microsoft.com/office/word/2010/wordprocessingCanvas" xmlns:cx="http://schemas.microsoft.com/office/drawing/2014/chartex" xmlns:cx1="http://schemas.microsoft.com/office/drawing/2015/9/8/chartex" xmlns:cx2="http://schemas.microsoft.com/office/drawing/2015/10/21/chartex" xmlns:cx3="http://schemas.microsoft.com/office/drawing/2016/5/9/chartex" xmlns:cx4="http://schemas.microsoft.com/office/drawing/2016/5/10/chartex" xmlns:cx5="http://schemas.microsoft.com/office/drawing/2016/5/11/chartex" xmlns:cx6="http://schemas.microsoft.com/office/drawing/2016/5/12/chartex" xmlns:cx7="http://schemas.microsoft.com/office/drawing/2016/5/13/chartex" xmlns:cx8="http://schemas.microsoft.com/office/drawing/2016/5/14/chartex" xmlns:mc="http://schemas.openxmlformats.org/markup-compatibility/2006" xmlns:aink="http://schemas.microsoft.com/office/drawing/2016/ink" xmlns:am3d="http://schemas.microsoft.com/office/drawing/2017/model3d" xmlns:o="urn:schemas-microsoft-com:office:office" xmlns:oel="http://schemas.microsoft.com/office/2019/extlst" xmlns:r="http://schemas.openxmlformats.org/officeDocument/2006/relationships" xmlns:m="http://schemas.openxmlformats.org/officeDocument/2006/math" xmlns:v="urn:schemas-microsoft-com:vml" xmlns:wp14="http://schemas.microsoft.com/office/word/2010/wordprocessingDrawing" xmlns:wp="http://schemas.openxmlformats.org/drawingml/2006/wordprocessingDrawing" xmlns:w10="urn:schemas-microsoft-com:office:word" xmlns:w="http://schemas.openxmlformats.org/wordprocessingml/2006/main" xmlns:w14="http://schemas.microsoft.com/office/word/2010/wordml" xmlns:w15="http://schemas.microsoft.com/office/word/2012/wordml" xmlns:w16cex="http://schemas.microsoft.com/office/word/2018/wordml/cex" xmlns:w16cid="http://schemas.microsoft.com/office/word/2016/wordml/cid" xmlns:w16="http://schemas.microsoft.com/office/word/2018/wordml" xmlns:w16du="http://schemas.microsoft.com/office/word/2023/wordml/word16du" xmlns:w16sdtdh="http://schemas.microsoft.com/office/word/2020/wordml/sdtdatahash" xmlns:w16sdtfl="http://schemas.microsoft.com/office/word/2024/wordml/sdtformatlock" xmlns:w16se="http://schemas.microsoft.com/office/word/2015/wordml/symex" xmlns:wpg="http://schemas.microsoft.com/office/word/2010/wordprocessingGroup" xmlns:wpi="http://schemas.microsoft.com/office/word/2010/wordprocessingInk" xmlns:wne="http://schemas.microsoft.com/office/word/2006/wordml" xmlns:wps="http://schemas.microsoft.com/office/word/2010/wordprocessingShape" mc:Ignorable="w14 w15 w16se w16cid w16 w16cex w16sdtdh w16sdtfl w16du wp14">
   <w:tbl>
     <w:tblPr>
       <w:tblW w:w="0" w:type="auto"/>
@@ -9581,7 +10495,7 @@
 </file>
 
 <file path=word/footer2.xml><?xml version="1.0" encoding="utf-8"?>
-<w:ftr xmlns:wpc="http://schemas.microsoft.com/office/word/2010/wordprocessingCanvas" xmlns:cx="http://schemas.microsoft.com/office/drawing/2014/chartex" xmlns:cx1="http://schemas.microsoft.com/office/drawing/2015/9/8/chartex" xmlns:cx2="http://schemas.microsoft.com/office/drawing/2015/10/21/chartex" xmlns:cx3="http://schemas.microsoft.com/office/drawing/2016/5/9/chartex" xmlns:cx4="http://schemas.microsoft.com/office/drawing/2016/5/10/chartex" xmlns:cx5="http://schemas.microsoft.com/office/drawing/2016/5/11/chartex" xmlns:cx6="http://schemas.microsoft.com/office/drawing/2016/5/12/chartex" xmlns:cx7="http://schemas.microsoft.com/office/drawing/2016/5/13/chartex" xmlns:cx8="http://schemas.microsoft.com/office/drawing/2016/5/14/chartex" xmlns:mc="http://schemas.openxmlformats.org/markup-compatibility/2006" xmlns:aink="http://schemas.microsoft.com/office/drawing/2016/ink" xmlns:am3d="http://schemas.microsoft.com/office/drawing/2017/model3d" xmlns:o="urn:schemas-microsoft-com:office:office" xmlns:r="http://schemas.openxmlformats.org/officeDocument/2006/relationships" xmlns:m="http://schemas.openxmlformats.org/officeDocument/2006/math" xmlns:v="urn:schemas-microsoft-com:vml" xmlns:wp14="http://schemas.microsoft.com/office/word/2010/wordprocessingDrawing" xmlns:wp="http://schemas.openxmlformats.org/drawingml/2006/wordprocessingDrawing" xmlns:w10="urn:schemas-microsoft-com:office:word" xmlns:w="http://schemas.openxmlformats.org/wordprocessingml/2006/main" xmlns:w14="http://schemas.microsoft.com/office/word/2010/wordml" xmlns:w15="http://schemas.microsoft.com/office/word/2012/wordml" xmlns:w16cex="http://schemas.microsoft.com/office/word/2018/wordml/cex" xmlns:w16cid="http://schemas.microsoft.com/office/word/2016/wordml/cid" xmlns:w16="http://schemas.microsoft.com/office/word/2018/wordml" xmlns:w16sdtdh="http://schemas.microsoft.com/office/word/2020/wordml/sdtdatahash" xmlns:w16se="http://schemas.microsoft.com/office/word/2015/wordml/symex" xmlns:wpg="http://schemas.microsoft.com/office/word/2010/wordprocessingGroup" xmlns:wpi="http://schemas.microsoft.com/office/word/2010/wordprocessingInk" xmlns:wne="http://schemas.microsoft.com/office/word/2006/wordml" xmlns:wps="http://schemas.microsoft.com/office/word/2010/wordprocessingShape" mc:Ignorable="w14 w15 w16se w16cid w16 w16cex w16sdtdh wp14">
+<w:ftr xmlns:wpc="http://schemas.microsoft.com/office/word/2010/wordprocessingCanvas" xmlns:cx="http://schemas.microsoft.com/office/drawing/2014/chartex" xmlns:cx1="http://schemas.microsoft.com/office/drawing/2015/9/8/chartex" xmlns:cx2="http://schemas.microsoft.com/office/drawing/2015/10/21/chartex" xmlns:cx3="http://schemas.microsoft.com/office/drawing/2016/5/9/chartex" xmlns:cx4="http://schemas.microsoft.com/office/drawing/2016/5/10/chartex" xmlns:cx5="http://schemas.microsoft.com/office/drawing/2016/5/11/chartex" xmlns:cx6="http://schemas.microsoft.com/office/drawing/2016/5/12/chartex" xmlns:cx7="http://schemas.microsoft.com/office/drawing/2016/5/13/chartex" xmlns:cx8="http://schemas.microsoft.com/office/drawing/2016/5/14/chartex" xmlns:mc="http://schemas.openxmlformats.org/markup-compatibility/2006" xmlns:aink="http://schemas.microsoft.com/office/drawing/2016/ink" xmlns:am3d="http://schemas.microsoft.com/office/drawing/2017/model3d" xmlns:o="urn:schemas-microsoft-com:office:office" xmlns:oel="http://schemas.microsoft.com/office/2019/extlst" xmlns:r="http://schemas.openxmlformats.org/officeDocument/2006/relationships" xmlns:m="http://schemas.openxmlformats.org/officeDocument/2006/math" xmlns:v="urn:schemas-microsoft-com:vml" xmlns:wp14="http://schemas.microsoft.com/office/word/2010/wordprocessingDrawing" xmlns:wp="http://schemas.openxmlformats.org/drawingml/2006/wordprocessingDrawing" xmlns:w10="urn:schemas-microsoft-com:office:word" xmlns:w="http://schemas.openxmlformats.org/wordprocessingml/2006/main" xmlns:w14="http://schemas.microsoft.com/office/word/2010/wordml" xmlns:w15="http://schemas.microsoft.com/office/word/2012/wordml" xmlns:w16cex="http://schemas.microsoft.com/office/word/2018/wordml/cex" xmlns:w16cid="http://schemas.microsoft.com/office/word/2016/wordml/cid" xmlns:w16="http://schemas.microsoft.com/office/word/2018/wordml" xmlns:w16du="http://schemas.microsoft.com/office/word/2023/wordml/word16du" xmlns:w16sdtdh="http://schemas.microsoft.com/office/word/2020/wordml/sdtdatahash" xmlns:w16sdtfl="http://schemas.microsoft.com/office/word/2024/wordml/sdtformatlock" xmlns:w16se="http://schemas.microsoft.com/office/word/2015/wordml/symex" xmlns:wpg="http://schemas.microsoft.com/office/word/2010/wordprocessingGroup" xmlns:wpi="http://schemas.microsoft.com/office/word/2010/wordprocessingInk" xmlns:wne="http://schemas.microsoft.com/office/word/2006/wordml" xmlns:wps="http://schemas.microsoft.com/office/word/2010/wordprocessingShape" mc:Ignorable="w14 w15 w16se w16cid w16 w16cex w16sdtdh w16sdtfl w16du wp14">
   <w:tbl>
     <w:tblPr>
       <w:tblW w:w="0" w:type="auto"/>
@@ -9641,7 +10555,7 @@
 </file>
 
 <file path=word/footer3.xml><?xml version="1.0" encoding="utf-8"?>
-<w:ftr xmlns:wpc="http://schemas.microsoft.com/office/word/2010/wordprocessingCanvas" xmlns:cx="http://schemas.microsoft.com/office/drawing/2014/chartex" xmlns:cx1="http://schemas.microsoft.com/office/drawing/2015/9/8/chartex" xmlns:cx2="http://schemas.microsoft.com/office/drawing/2015/10/21/chartex" xmlns:cx3="http://schemas.microsoft.com/office/drawing/2016/5/9/chartex" xmlns:cx4="http://schemas.microsoft.com/office/drawing/2016/5/10/chartex" xmlns:cx5="http://schemas.microsoft.com/office/drawing/2016/5/11/chartex" xmlns:cx6="http://schemas.microsoft.com/office/drawing/2016/5/12/chartex" xmlns:cx7="http://schemas.microsoft.com/office/drawing/2016/5/13/chartex" xmlns:cx8="http://schemas.microsoft.com/office/drawing/2016/5/14/chartex" xmlns:mc="http://schemas.openxmlformats.org/markup-compatibility/2006" xmlns:aink="http://schemas.microsoft.com/office/drawing/2016/ink" xmlns:am3d="http://schemas.microsoft.com/office/drawing/2017/model3d" xmlns:o="urn:schemas-microsoft-com:office:office" xmlns:r="http://schemas.openxmlformats.org/officeDocument/2006/relationships" xmlns:m="http://schemas.openxmlformats.org/officeDocument/2006/math" xmlns:v="urn:schemas-microsoft-com:vml" xmlns:wp14="http://schemas.microsoft.com/office/word/2010/wordprocessingDrawing" xmlns:wp="http://schemas.openxmlformats.org/drawingml/2006/wordprocessingDrawing" xmlns:w10="urn:schemas-microsoft-com:office:word" xmlns:w="http://schemas.openxmlformats.org/wordprocessingml/2006/main" xmlns:w14="http://schemas.microsoft.com/office/word/2010/wordml" xmlns:w15="http://schemas.microsoft.com/office/word/2012/wordml" xmlns:w16cex="http://schemas.microsoft.com/office/word/2018/wordml/cex" xmlns:w16cid="http://schemas.microsoft.com/office/word/2016/wordml/cid" xmlns:w16="http://schemas.microsoft.com/office/word/2018/wordml" xmlns:w16sdtdh="http://schemas.microsoft.com/office/word/2020/wordml/sdtdatahash" xmlns:w16se="http://schemas.microsoft.com/office/word/2015/wordml/symex" xmlns:wpg="http://schemas.microsoft.com/office/word/2010/wordprocessingGroup" xmlns:wpi="http://schemas.microsoft.com/office/word/2010/wordprocessingInk" xmlns:wne="http://schemas.microsoft.com/office/word/2006/wordml" xmlns:wps="http://schemas.microsoft.com/office/word/2010/wordprocessingShape" mc:Ignorable="w14 w15 w16se w16cid w16 w16cex w16sdtdh wp14">
+<w:ftr xmlns:wpc="http://schemas.microsoft.com/office/word/2010/wordprocessingCanvas" xmlns:cx="http://schemas.microsoft.com/office/drawing/2014/chartex" xmlns:cx1="http://schemas.microsoft.com/office/drawing/2015/9/8/chartex" xmlns:cx2="http://schemas.microsoft.com/office/drawing/2015/10/21/chartex" xmlns:cx3="http://schemas.microsoft.com/office/drawing/2016/5/9/chartex" xmlns:cx4="http://schemas.microsoft.com/office/drawing/2016/5/10/chartex" xmlns:cx5="http://schemas.microsoft.com/office/drawing/2016/5/11/chartex" xmlns:cx6="http://schemas.microsoft.com/office/drawing/2016/5/12/chartex" xmlns:cx7="http://schemas.microsoft.com/office/drawing/2016/5/13/chartex" xmlns:cx8="http://schemas.microsoft.com/office/drawing/2016/5/14/chartex" xmlns:mc="http://schemas.openxmlformats.org/markup-compatibility/2006" xmlns:aink="http://schemas.microsoft.com/office/drawing/2016/ink" xmlns:am3d="http://schemas.microsoft.com/office/drawing/2017/model3d" xmlns:o="urn:schemas-microsoft-com:office:office" xmlns:oel="http://schemas.microsoft.com/office/2019/extlst" xmlns:r="http://schemas.openxmlformats.org/officeDocument/2006/relationships" xmlns:m="http://schemas.openxmlformats.org/officeDocument/2006/math" xmlns:v="urn:schemas-microsoft-com:vml" xmlns:wp14="http://schemas.microsoft.com/office/word/2010/wordprocessingDrawing" xmlns:wp="http://schemas.openxmlformats.org/drawingml/2006/wordprocessingDrawing" xmlns:w10="urn:schemas-microsoft-com:office:word" xmlns:w="http://schemas.openxmlformats.org/wordprocessingml/2006/main" xmlns:w14="http://schemas.microsoft.com/office/word/2010/wordml" xmlns:w15="http://schemas.microsoft.com/office/word/2012/wordml" xmlns:w16cex="http://schemas.microsoft.com/office/word/2018/wordml/cex" xmlns:w16cid="http://schemas.microsoft.com/office/word/2016/wordml/cid" xmlns:w16="http://schemas.microsoft.com/office/word/2018/wordml" xmlns:w16du="http://schemas.microsoft.com/office/word/2023/wordml/word16du" xmlns:w16sdtdh="http://schemas.microsoft.com/office/word/2020/wordml/sdtdatahash" xmlns:w16sdtfl="http://schemas.microsoft.com/office/word/2024/wordml/sdtformatlock" xmlns:w16se="http://schemas.microsoft.com/office/word/2015/wordml/symex" xmlns:wpg="http://schemas.microsoft.com/office/word/2010/wordprocessingGroup" xmlns:wpi="http://schemas.microsoft.com/office/word/2010/wordprocessingInk" xmlns:wne="http://schemas.microsoft.com/office/word/2006/wordml" xmlns:wps="http://schemas.microsoft.com/office/word/2010/wordprocessingShape" mc:Ignorable="w14 w15 w16se w16cid w16 w16cex w16sdtdh w16sdtfl w16du wp14">
   <w:tbl>
     <w:tblPr>
       <w:tblW w:w="0" w:type="auto"/>
@@ -9701,7 +10615,7 @@
 </file>
 
 <file path=word/footer4.xml><?xml version="1.0" encoding="utf-8"?>
-<w:ftr xmlns:wpc="http://schemas.microsoft.com/office/word/2010/wordprocessingCanvas" xmlns:cx="http://schemas.microsoft.com/office/drawing/2014/chartex" xmlns:cx1="http://schemas.microsoft.com/office/drawing/2015/9/8/chartex" xmlns:cx2="http://schemas.microsoft.com/office/drawing/2015/10/21/chartex" xmlns:cx3="http://schemas.microsoft.com/office/drawing/2016/5/9/chartex" xmlns:cx4="http://schemas.microsoft.com/office/drawing/2016/5/10/chartex" xmlns:cx5="http://schemas.microsoft.com/office/drawing/2016/5/11/chartex" xmlns:cx6="http://schemas.microsoft.com/office/drawing/2016/5/12/chartex" xmlns:cx7="http://schemas.microsoft.com/office/drawing/2016/5/13/chartex" xmlns:cx8="http://schemas.microsoft.com/office/drawing/2016/5/14/chartex" xmlns:mc="http://schemas.openxmlformats.org/markup-compatibility/2006" xmlns:aink="http://schemas.microsoft.com/office/drawing/2016/ink" xmlns:am3d="http://schemas.microsoft.com/office/drawing/2017/model3d" xmlns:o="urn:schemas-microsoft-com:office:office" xmlns:r="http://schemas.openxmlformats.org/officeDocument/2006/relationships" xmlns:m="http://schemas.openxmlformats.org/officeDocument/2006/math" xmlns:v="urn:schemas-microsoft-com:vml" xmlns:wp14="http://schemas.microsoft.com/office/word/2010/wordprocessingDrawing" xmlns:wp="http://schemas.openxmlformats.org/drawingml/2006/wordprocessingDrawing" xmlns:w10="urn:schemas-microsoft-com:office:word" xmlns:w="http://schemas.openxmlformats.org/wordprocessingml/2006/main" xmlns:w14="http://schemas.microsoft.com/office/word/2010/wordml" xmlns:w15="http://schemas.microsoft.com/office/word/2012/wordml" xmlns:w16cex="http://schemas.microsoft.com/office/word/2018/wordml/cex" xmlns:w16cid="http://schemas.microsoft.com/office/word/2016/wordml/cid" xmlns:w16="http://schemas.microsoft.com/office/word/2018/wordml" xmlns:w16sdtdh="http://schemas.microsoft.com/office/word/2020/wordml/sdtdatahash" xmlns:w16se="http://schemas.microsoft.com/office/word/2015/wordml/symex" xmlns:wpg="http://schemas.microsoft.com/office/word/2010/wordprocessingGroup" xmlns:wpi="http://schemas.microsoft.com/office/word/2010/wordprocessingInk" xmlns:wne="http://schemas.microsoft.com/office/word/2006/wordml" xmlns:wps="http://schemas.microsoft.com/office/word/2010/wordprocessingShape" mc:Ignorable="w14 w15 w16se w16cid w16 w16cex w16sdtdh wp14">
+<w:ftr xmlns:wpc="http://schemas.microsoft.com/office/word/2010/wordprocessingCanvas" xmlns:cx="http://schemas.microsoft.com/office/drawing/2014/chartex" xmlns:cx1="http://schemas.microsoft.com/office/drawing/2015/9/8/chartex" xmlns:cx2="http://schemas.microsoft.com/office/drawing/2015/10/21/chartex" xmlns:cx3="http://schemas.microsoft.com/office/drawing/2016/5/9/chartex" xmlns:cx4="http://schemas.microsoft.com/office/drawing/2016/5/10/chartex" xmlns:cx5="http://schemas.microsoft.com/office/drawing/2016/5/11/chartex" xmlns:cx6="http://schemas.microsoft.com/office/drawing/2016/5/12/chartex" xmlns:cx7="http://schemas.microsoft.com/office/drawing/2016/5/13/chartex" xmlns:cx8="http://schemas.microsoft.com/office/drawing/2016/5/14/chartex" xmlns:mc="http://schemas.openxmlformats.org/markup-compatibility/2006" xmlns:aink="http://schemas.microsoft.com/office/drawing/2016/ink" xmlns:am3d="http://schemas.microsoft.com/office/drawing/2017/model3d" xmlns:o="urn:schemas-microsoft-com:office:office" xmlns:oel="http://schemas.microsoft.com/office/2019/extlst" xmlns:r="http://schemas.openxmlformats.org/officeDocument/2006/relationships" xmlns:m="http://schemas.openxmlformats.org/officeDocument/2006/math" xmlns:v="urn:schemas-microsoft-com:vml" xmlns:wp14="http://schemas.microsoft.com/office/word/2010/wordprocessingDrawing" xmlns:wp="http://schemas.openxmlformats.org/drawingml/2006/wordprocessingDrawing" xmlns:w10="urn:schemas-microsoft-com:office:word" xmlns:w="http://schemas.openxmlformats.org/wordprocessingml/2006/main" xmlns:w14="http://schemas.microsoft.com/office/word/2010/wordml" xmlns:w15="http://schemas.microsoft.com/office/word/2012/wordml" xmlns:w16cex="http://schemas.microsoft.com/office/word/2018/wordml/cex" xmlns:w16cid="http://schemas.microsoft.com/office/word/2016/wordml/cid" xmlns:w16="http://schemas.microsoft.com/office/word/2018/wordml" xmlns:w16du="http://schemas.microsoft.com/office/word/2023/wordml/word16du" xmlns:w16sdtdh="http://schemas.microsoft.com/office/word/2020/wordml/sdtdatahash" xmlns:w16sdtfl="http://schemas.microsoft.com/office/word/2024/wordml/sdtformatlock" xmlns:w16se="http://schemas.microsoft.com/office/word/2015/wordml/symex" xmlns:wpg="http://schemas.microsoft.com/office/word/2010/wordprocessingGroup" xmlns:wpi="http://schemas.microsoft.com/office/word/2010/wordprocessingInk" xmlns:wne="http://schemas.microsoft.com/office/word/2006/wordml" xmlns:wps="http://schemas.microsoft.com/office/word/2010/wordprocessingShape" mc:Ignorable="w14 w15 w16se w16cid w16 w16cex w16sdtdh w16sdtfl w16du wp14">
   <w:tbl>
     <w:tblPr>
       <w:tblW w:w="0" w:type="auto"/>
@@ -9761,7 +10675,7 @@
 </file>
 
 <file path=word/footer5.xml><?xml version="1.0" encoding="utf-8"?>
-<w:ftr xmlns:wpc="http://schemas.microsoft.com/office/word/2010/wordprocessingCanvas" xmlns:cx="http://schemas.microsoft.com/office/drawing/2014/chartex" xmlns:cx1="http://schemas.microsoft.com/office/drawing/2015/9/8/chartex" xmlns:cx2="http://schemas.microsoft.com/office/drawing/2015/10/21/chartex" xmlns:cx3="http://schemas.microsoft.com/office/drawing/2016/5/9/chartex" xmlns:cx4="http://schemas.microsoft.com/office/drawing/2016/5/10/chartex" xmlns:cx5="http://schemas.microsoft.com/office/drawing/2016/5/11/chartex" xmlns:cx6="http://schemas.microsoft.com/office/drawing/2016/5/12/chartex" xmlns:cx7="http://schemas.microsoft.com/office/drawing/2016/5/13/chartex" xmlns:cx8="http://schemas.microsoft.com/office/drawing/2016/5/14/chartex" xmlns:mc="http://schemas.openxmlformats.org/markup-compatibility/2006" xmlns:aink="http://schemas.microsoft.com/office/drawing/2016/ink" xmlns:am3d="http://schemas.microsoft.com/office/drawing/2017/model3d" xmlns:o="urn:schemas-microsoft-com:office:office" xmlns:r="http://schemas.openxmlformats.org/officeDocument/2006/relationships" xmlns:m="http://schemas.openxmlformats.org/officeDocument/2006/math" xmlns:v="urn:schemas-microsoft-com:vml" xmlns:wp14="http://schemas.microsoft.com/office/word/2010/wordprocessingDrawing" xmlns:wp="http://schemas.openxmlformats.org/drawingml/2006/wordprocessingDrawing" xmlns:w10="urn:schemas-microsoft-com:office:word" xmlns:w="http://schemas.openxmlformats.org/wordprocessingml/2006/main" xmlns:w14="http://schemas.microsoft.com/office/word/2010/wordml" xmlns:w15="http://schemas.microsoft.com/office/word/2012/wordml" xmlns:w16cex="http://schemas.microsoft.com/office/word/2018/wordml/cex" xmlns:w16cid="http://schemas.microsoft.com/office/word/2016/wordml/cid" xmlns:w16="http://schemas.microsoft.com/office/word/2018/wordml" xmlns:w16sdtdh="http://schemas.microsoft.com/office/word/2020/wordml/sdtdatahash" xmlns:w16se="http://schemas.microsoft.com/office/word/2015/wordml/symex" xmlns:wpg="http://schemas.microsoft.com/office/word/2010/wordprocessingGroup" xmlns:wpi="http://schemas.microsoft.com/office/word/2010/wordprocessingInk" xmlns:wne="http://schemas.microsoft.com/office/word/2006/wordml" xmlns:wps="http://schemas.microsoft.com/office/word/2010/wordprocessingShape" mc:Ignorable="w14 w15 w16se w16cid w16 w16cex w16sdtdh wp14">
+<w:ftr xmlns:wpc="http://schemas.microsoft.com/office/word/2010/wordprocessingCanvas" xmlns:cx="http://schemas.microsoft.com/office/drawing/2014/chartex" xmlns:cx1="http://schemas.microsoft.com/office/drawing/2015/9/8/chartex" xmlns:cx2="http://schemas.microsoft.com/office/drawing/2015/10/21/chartex" xmlns:cx3="http://schemas.microsoft.com/office/drawing/2016/5/9/chartex" xmlns:cx4="http://schemas.microsoft.com/office/drawing/2016/5/10/chartex" xmlns:cx5="http://schemas.microsoft.com/office/drawing/2016/5/11/chartex" xmlns:cx6="http://schemas.microsoft.com/office/drawing/2016/5/12/chartex" xmlns:cx7="http://schemas.microsoft.com/office/drawing/2016/5/13/chartex" xmlns:cx8="http://schemas.microsoft.com/office/drawing/2016/5/14/chartex" xmlns:mc="http://schemas.openxmlformats.org/markup-compatibility/2006" xmlns:aink="http://schemas.microsoft.com/office/drawing/2016/ink" xmlns:am3d="http://schemas.microsoft.com/office/drawing/2017/model3d" xmlns:o="urn:schemas-microsoft-com:office:office" xmlns:oel="http://schemas.microsoft.com/office/2019/extlst" xmlns:r="http://schemas.openxmlformats.org/officeDocument/2006/relationships" xmlns:m="http://schemas.openxmlformats.org/officeDocument/2006/math" xmlns:v="urn:schemas-microsoft-com:vml" xmlns:wp14="http://schemas.microsoft.com/office/word/2010/wordprocessingDrawing" xmlns:wp="http://schemas.openxmlformats.org/drawingml/2006/wordprocessingDrawing" xmlns:w10="urn:schemas-microsoft-com:office:word" xmlns:w="http://schemas.openxmlformats.org/wordprocessingml/2006/main" xmlns:w14="http://schemas.microsoft.com/office/word/2010/wordml" xmlns:w15="http://schemas.microsoft.com/office/word/2012/wordml" xmlns:w16cex="http://schemas.microsoft.com/office/word/2018/wordml/cex" xmlns:w16cid="http://schemas.microsoft.com/office/word/2016/wordml/cid" xmlns:w16="http://schemas.microsoft.com/office/word/2018/wordml" xmlns:w16du="http://schemas.microsoft.com/office/word/2023/wordml/word16du" xmlns:w16sdtdh="http://schemas.microsoft.com/office/word/2020/wordml/sdtdatahash" xmlns:w16sdtfl="http://schemas.microsoft.com/office/word/2024/wordml/sdtformatlock" xmlns:w16se="http://schemas.microsoft.com/office/word/2015/wordml/symex" xmlns:wpg="http://schemas.microsoft.com/office/word/2010/wordprocessingGroup" xmlns:wpi="http://schemas.microsoft.com/office/word/2010/wordprocessingInk" xmlns:wne="http://schemas.microsoft.com/office/word/2006/wordml" xmlns:wps="http://schemas.microsoft.com/office/word/2010/wordprocessingShape" mc:Ignorable="w14 w15 w16se w16cid w16 w16cex w16sdtdh w16sdtfl w16du wp14">
   <w:tbl>
     <w:tblPr>
       <w:tblW w:w="0" w:type="auto"/>
@@ -9814,7 +10728,7 @@
 </file>
 
 <file path=word/footnotes.xml><?xml version="1.0" encoding="utf-8"?>
-<w:footnotes xmlns:wpc="http://schemas.microsoft.com/office/word/2010/wordprocessingCanvas" xmlns:cx="http://schemas.microsoft.com/office/drawing/2014/chartex" xmlns:cx1="http://schemas.microsoft.com/office/drawing/2015/9/8/chartex" xmlns:cx2="http://schemas.microsoft.com/office/drawing/2015/10/21/chartex" xmlns:cx3="http://schemas.microsoft.com/office/drawing/2016/5/9/chartex" xmlns:cx4="http://schemas.microsoft.com/office/drawing/2016/5/10/chartex" xmlns:cx5="http://schemas.microsoft.com/office/drawing/2016/5/11/chartex" xmlns:cx6="http://schemas.microsoft.com/office/drawing/2016/5/12/chartex" xmlns:cx7="http://schemas.microsoft.com/office/drawing/2016/5/13/chartex" xmlns:cx8="http://schemas.microsoft.com/office/drawing/2016/5/14/chartex" xmlns:mc="http://schemas.openxmlformats.org/markup-compatibility/2006" xmlns:aink="http://schemas.microsoft.com/office/drawing/2016/ink" xmlns:am3d="http://schemas.microsoft.com/office/drawing/2017/model3d" xmlns:o="urn:schemas-microsoft-com:office:office" xmlns:r="http://schemas.openxmlformats.org/officeDocument/2006/relationships" xmlns:m="http://schemas.openxmlformats.org/officeDocument/2006/math" xmlns:v="urn:schemas-microsoft-com:vml" xmlns:wp14="http://schemas.microsoft.com/office/word/2010/wordprocessingDrawing" xmlns:wp="http://schemas.openxmlformats.org/drawingml/2006/wordprocessingDrawing" xmlns:w10="urn:schemas-microsoft-com:office:word" xmlns:w="http://schemas.openxmlformats.org/wordprocessingml/2006/main" xmlns:w14="http://schemas.microsoft.com/office/word/2010/wordml" xmlns:w15="http://schemas.microsoft.com/office/word/2012/wordml" xmlns:w16cex="http://schemas.microsoft.com/office/word/2018/wordml/cex" xmlns:w16cid="http://schemas.microsoft.com/office/word/2016/wordml/cid" xmlns:w16="http://schemas.microsoft.com/office/word/2018/wordml" xmlns:w16sdtdh="http://schemas.microsoft.com/office/word/2020/wordml/sdtdatahash" xmlns:w16se="http://schemas.microsoft.com/office/word/2015/wordml/symex" xmlns:wpg="http://schemas.microsoft.com/office/word/2010/wordprocessingGroup" xmlns:wpi="http://schemas.microsoft.com/office/word/2010/wordprocessingInk" xmlns:wne="http://schemas.microsoft.com/office/word/2006/wordml" xmlns:wps="http://schemas.microsoft.com/office/word/2010/wordprocessingShape" mc:Ignorable="w14 w15 w16se w16cid w16 w16cex w16sdtdh wp14">
+<w:footnotes xmlns:wpc="http://schemas.microsoft.com/office/word/2010/wordprocessingCanvas" xmlns:cx="http://schemas.microsoft.com/office/drawing/2014/chartex" xmlns:cx1="http://schemas.microsoft.com/office/drawing/2015/9/8/chartex" xmlns:cx2="http://schemas.microsoft.com/office/drawing/2015/10/21/chartex" xmlns:cx3="http://schemas.microsoft.com/office/drawing/2016/5/9/chartex" xmlns:cx4="http://schemas.microsoft.com/office/drawing/2016/5/10/chartex" xmlns:cx5="http://schemas.microsoft.com/office/drawing/2016/5/11/chartex" xmlns:cx6="http://schemas.microsoft.com/office/drawing/2016/5/12/chartex" xmlns:cx7="http://schemas.microsoft.com/office/drawing/2016/5/13/chartex" xmlns:cx8="http://schemas.microsoft.com/office/drawing/2016/5/14/chartex" xmlns:mc="http://schemas.openxmlformats.org/markup-compatibility/2006" xmlns:aink="http://schemas.microsoft.com/office/drawing/2016/ink" xmlns:am3d="http://schemas.microsoft.com/office/drawing/2017/model3d" xmlns:o="urn:schemas-microsoft-com:office:office" xmlns:oel="http://schemas.microsoft.com/office/2019/extlst" xmlns:r="http://schemas.openxmlformats.org/officeDocument/2006/relationships" xmlns:m="http://schemas.openxmlformats.org/officeDocument/2006/math" xmlns:v="urn:schemas-microsoft-com:vml" xmlns:wp14="http://schemas.microsoft.com/office/word/2010/wordprocessingDrawing" xmlns:wp="http://schemas.openxmlformats.org/drawingml/2006/wordprocessingDrawing" xmlns:w10="urn:schemas-microsoft-com:office:word" xmlns:w="http://schemas.openxmlformats.org/wordprocessingml/2006/main" xmlns:w14="http://schemas.microsoft.com/office/word/2010/wordml" xmlns:w15="http://schemas.microsoft.com/office/word/2012/wordml" xmlns:w16cex="http://schemas.microsoft.com/office/word/2018/wordml/cex" xmlns:w16cid="http://schemas.microsoft.com/office/word/2016/wordml/cid" xmlns:w16="http://schemas.microsoft.com/office/word/2018/wordml" xmlns:w16du="http://schemas.microsoft.com/office/word/2023/wordml/word16du" xmlns:w16sdtdh="http://schemas.microsoft.com/office/word/2020/wordml/sdtdatahash" xmlns:w16sdtfl="http://schemas.microsoft.com/office/word/2024/wordml/sdtformatlock" xmlns:w16se="http://schemas.microsoft.com/office/word/2015/wordml/symex" xmlns:wpg="http://schemas.microsoft.com/office/word/2010/wordprocessingGroup" xmlns:wpi="http://schemas.microsoft.com/office/word/2010/wordprocessingInk" xmlns:wne="http://schemas.microsoft.com/office/word/2006/wordml" xmlns:wps="http://schemas.microsoft.com/office/word/2010/wordprocessingShape" mc:Ignorable="w14 w15 w16se w16cid w16 w16cex w16sdtdh w16sdtfl w16du wp14">
   <w:footnote w:type="separator" w:id="-1">
     <w:p>
       <w:pPr>
@@ -9839,7 +10753,7 @@
 </file>
 
 <file path=word/header1.xml><?xml version="1.0" encoding="utf-8"?>
-<w:hdr xmlns:wpc="http://schemas.microsoft.com/office/word/2010/wordprocessingCanvas" xmlns:cx="http://schemas.microsoft.com/office/drawing/2014/chartex" xmlns:cx1="http://schemas.microsoft.com/office/drawing/2015/9/8/chartex" xmlns:cx2="http://schemas.microsoft.com/office/drawing/2015/10/21/chartex" xmlns:cx3="http://schemas.microsoft.com/office/drawing/2016/5/9/chartex" xmlns:cx4="http://schemas.microsoft.com/office/drawing/2016/5/10/chartex" xmlns:cx5="http://schemas.microsoft.com/office/drawing/2016/5/11/chartex" xmlns:cx6="http://schemas.microsoft.com/office/drawing/2016/5/12/chartex" xmlns:cx7="http://schemas.microsoft.com/office/drawing/2016/5/13/chartex" xmlns:cx8="http://schemas.microsoft.com/office/drawing/2016/5/14/chartex" xmlns:mc="http://schemas.openxmlformats.org/markup-compatibility/2006" xmlns:aink="http://schemas.microsoft.com/office/drawing/2016/ink" xmlns:am3d="http://schemas.microsoft.com/office/drawing/2017/model3d" xmlns:o="urn:schemas-microsoft-com:office:office" xmlns:r="http://schemas.openxmlformats.org/officeDocument/2006/relationships" xmlns:m="http://schemas.openxmlformats.org/officeDocument/2006/math" xmlns:v="urn:schemas-microsoft-com:vml" xmlns:wp14="http://schemas.microsoft.com/office/word/2010/wordprocessingDrawing" xmlns:wp="http://schemas.openxmlformats.org/drawingml/2006/wordprocessingDrawing" xmlns:w10="urn:schemas-microsoft-com:office:word" xmlns:w="http://schemas.openxmlformats.org/wordprocessingml/2006/main" xmlns:w14="http://schemas.microsoft.com/office/word/2010/wordml" xmlns:w15="http://schemas.microsoft.com/office/word/2012/wordml" xmlns:w16cex="http://schemas.microsoft.com/office/word/2018/wordml/cex" xmlns:w16cid="http://schemas.microsoft.com/office/word/2016/wordml/cid" xmlns:w16="http://schemas.microsoft.com/office/word/2018/wordml" xmlns:w16sdtdh="http://schemas.microsoft.com/office/word/2020/wordml/sdtdatahash" xmlns:w16se="http://schemas.microsoft.com/office/word/2015/wordml/symex" xmlns:wpg="http://schemas.microsoft.com/office/word/2010/wordprocessingGroup" xmlns:wpi="http://schemas.microsoft.com/office/word/2010/wordprocessingInk" xmlns:wne="http://schemas.microsoft.com/office/word/2006/wordml" xmlns:wps="http://schemas.microsoft.com/office/word/2010/wordprocessingShape" mc:Ignorable="w14 w15 w16se w16cid w16 w16cex w16sdtdh wp14">
+<w:hdr xmlns:wpc="http://schemas.microsoft.com/office/word/2010/wordprocessingCanvas" xmlns:cx="http://schemas.microsoft.com/office/drawing/2014/chartex" xmlns:cx1="http://schemas.microsoft.com/office/drawing/2015/9/8/chartex" xmlns:cx2="http://schemas.microsoft.com/office/drawing/2015/10/21/chartex" xmlns:cx3="http://schemas.microsoft.com/office/drawing/2016/5/9/chartex" xmlns:cx4="http://schemas.microsoft.com/office/drawing/2016/5/10/chartex" xmlns:cx5="http://schemas.microsoft.com/office/drawing/2016/5/11/chartex" xmlns:cx6="http://schemas.microsoft.com/office/drawing/2016/5/12/chartex" xmlns:cx7="http://schemas.microsoft.com/office/drawing/2016/5/13/chartex" xmlns:cx8="http://schemas.microsoft.com/office/drawing/2016/5/14/chartex" xmlns:mc="http://schemas.openxmlformats.org/markup-compatibility/2006" xmlns:aink="http://schemas.microsoft.com/office/drawing/2016/ink" xmlns:am3d="http://schemas.microsoft.com/office/drawing/2017/model3d" xmlns:o="urn:schemas-microsoft-com:office:office" xmlns:oel="http://schemas.microsoft.com/office/2019/extlst" xmlns:r="http://schemas.openxmlformats.org/officeDocument/2006/relationships" xmlns:m="http://schemas.openxmlformats.org/officeDocument/2006/math" xmlns:v="urn:schemas-microsoft-com:vml" xmlns:wp14="http://schemas.microsoft.com/office/word/2010/wordprocessingDrawing" xmlns:wp="http://schemas.openxmlformats.org/drawingml/2006/wordprocessingDrawing" xmlns:w10="urn:schemas-microsoft-com:office:word" xmlns:w="http://schemas.openxmlformats.org/wordprocessingml/2006/main" xmlns:w14="http://schemas.microsoft.com/office/word/2010/wordml" xmlns:w15="http://schemas.microsoft.com/office/word/2012/wordml" xmlns:w16cex="http://schemas.microsoft.com/office/word/2018/wordml/cex" xmlns:w16cid="http://schemas.microsoft.com/office/word/2016/wordml/cid" xmlns:w16="http://schemas.microsoft.com/office/word/2018/wordml" xmlns:w16du="http://schemas.microsoft.com/office/word/2023/wordml/word16du" xmlns:w16sdtdh="http://schemas.microsoft.com/office/word/2020/wordml/sdtdatahash" xmlns:w16sdtfl="http://schemas.microsoft.com/office/word/2024/wordml/sdtformatlock" xmlns:w16se="http://schemas.microsoft.com/office/word/2015/wordml/symex" xmlns:wpg="http://schemas.microsoft.com/office/word/2010/wordprocessingGroup" xmlns:wpi="http://schemas.microsoft.com/office/word/2010/wordprocessingInk" xmlns:wne="http://schemas.microsoft.com/office/word/2006/wordml" xmlns:wps="http://schemas.microsoft.com/office/word/2010/wordprocessingShape" mc:Ignorable="w14 w15 w16se w16cid w16 w16cex w16sdtdh w16sdtfl w16du wp14">
   <w:p>
     <w:pPr>
       <w:spacing w:after="160" w:line="259" w:lineRule="auto"/>
@@ -9850,7 +10764,7 @@
 </file>
 
 <file path=word/header2.xml><?xml version="1.0" encoding="utf-8"?>
-<w:hdr xmlns:wpc="http://schemas.microsoft.com/office/word/2010/wordprocessingCanvas" xmlns:cx="http://schemas.microsoft.com/office/drawing/2014/chartex" xmlns:cx1="http://schemas.microsoft.com/office/drawing/2015/9/8/chartex" xmlns:cx2="http://schemas.microsoft.com/office/drawing/2015/10/21/chartex" xmlns:cx3="http://schemas.microsoft.com/office/drawing/2016/5/9/chartex" xmlns:cx4="http://schemas.microsoft.com/office/drawing/2016/5/10/chartex" xmlns:cx5="http://schemas.microsoft.com/office/drawing/2016/5/11/chartex" xmlns:cx6="http://schemas.microsoft.com/office/drawing/2016/5/12/chartex" xmlns:cx7="http://schemas.microsoft.com/office/drawing/2016/5/13/chartex" xmlns:cx8="http://schemas.microsoft.com/office/drawing/2016/5/14/chartex" xmlns:mc="http://schemas.openxmlformats.org/markup-compatibility/2006" xmlns:aink="http://schemas.microsoft.com/office/drawing/2016/ink" xmlns:am3d="http://schemas.microsoft.com/office/drawing/2017/model3d" xmlns:o="urn:schemas-microsoft-com:office:office" xmlns:r="http://schemas.openxmlformats.org/officeDocument/2006/relationships" xmlns:m="http://schemas.openxmlformats.org/officeDocument/2006/math" xmlns:v="urn:schemas-microsoft-com:vml" xmlns:wp14="http://schemas.microsoft.com/office/word/2010/wordprocessingDrawing" xmlns:wp="http://schemas.openxmlformats.org/drawingml/2006/wordprocessingDrawing" xmlns:w10="urn:schemas-microsoft-com:office:word" xmlns:w="http://schemas.openxmlformats.org/wordprocessingml/2006/main" xmlns:w14="http://schemas.microsoft.com/office/word/2010/wordml" xmlns:w15="http://schemas.microsoft.com/office/word/2012/wordml" xmlns:w16cex="http://schemas.microsoft.com/office/word/2018/wordml/cex" xmlns:w16cid="http://schemas.microsoft.com/office/word/2016/wordml/cid" xmlns:w16="http://schemas.microsoft.com/office/word/2018/wordml" xmlns:w16sdtdh="http://schemas.microsoft.com/office/word/2020/wordml/sdtdatahash" xmlns:w16se="http://schemas.microsoft.com/office/word/2015/wordml/symex" xmlns:wpg="http://schemas.microsoft.com/office/word/2010/wordprocessingGroup" xmlns:wpi="http://schemas.microsoft.com/office/word/2010/wordprocessingInk" xmlns:wne="http://schemas.microsoft.com/office/word/2006/wordml" xmlns:wps="http://schemas.microsoft.com/office/word/2010/wordprocessingShape" mc:Ignorable="w14 w15 w16se w16cid w16 w16cex w16sdtdh wp14">
+<w:hdr xmlns:wpc="http://schemas.microsoft.com/office/word/2010/wordprocessingCanvas" xmlns:cx="http://schemas.microsoft.com/office/drawing/2014/chartex" xmlns:cx1="http://schemas.microsoft.com/office/drawing/2015/9/8/chartex" xmlns:cx2="http://schemas.microsoft.com/office/drawing/2015/10/21/chartex" xmlns:cx3="http://schemas.microsoft.com/office/drawing/2016/5/9/chartex" xmlns:cx4="http://schemas.microsoft.com/office/drawing/2016/5/10/chartex" xmlns:cx5="http://schemas.microsoft.com/office/drawing/2016/5/11/chartex" xmlns:cx6="http://schemas.microsoft.com/office/drawing/2016/5/12/chartex" xmlns:cx7="http://schemas.microsoft.com/office/drawing/2016/5/13/chartex" xmlns:cx8="http://schemas.microsoft.com/office/drawing/2016/5/14/chartex" xmlns:mc="http://schemas.openxmlformats.org/markup-compatibility/2006" xmlns:aink="http://schemas.microsoft.com/office/drawing/2016/ink" xmlns:am3d="http://schemas.microsoft.com/office/drawing/2017/model3d" xmlns:o="urn:schemas-microsoft-com:office:office" xmlns:oel="http://schemas.microsoft.com/office/2019/extlst" xmlns:r="http://schemas.openxmlformats.org/officeDocument/2006/relationships" xmlns:m="http://schemas.openxmlformats.org/officeDocument/2006/math" xmlns:v="urn:schemas-microsoft-com:vml" xmlns:wp14="http://schemas.microsoft.com/office/word/2010/wordprocessingDrawing" xmlns:wp="http://schemas.openxmlformats.org/drawingml/2006/wordprocessingDrawing" xmlns:w10="urn:schemas-microsoft-com:office:word" xmlns:w="http://schemas.openxmlformats.org/wordprocessingml/2006/main" xmlns:w14="http://schemas.microsoft.com/office/word/2010/wordml" xmlns:w15="http://schemas.microsoft.com/office/word/2012/wordml" xmlns:w16cex="http://schemas.microsoft.com/office/word/2018/wordml/cex" xmlns:w16cid="http://schemas.microsoft.com/office/word/2016/wordml/cid" xmlns:w16="http://schemas.microsoft.com/office/word/2018/wordml" xmlns:w16du="http://schemas.microsoft.com/office/word/2023/wordml/word16du" xmlns:w16sdtdh="http://schemas.microsoft.com/office/word/2020/wordml/sdtdatahash" xmlns:w16sdtfl="http://schemas.microsoft.com/office/word/2024/wordml/sdtformatlock" xmlns:w16se="http://schemas.microsoft.com/office/word/2015/wordml/symex" xmlns:wpg="http://schemas.microsoft.com/office/word/2010/wordprocessingGroup" xmlns:wpi="http://schemas.microsoft.com/office/word/2010/wordprocessingInk" xmlns:wne="http://schemas.microsoft.com/office/word/2006/wordml" xmlns:wps="http://schemas.microsoft.com/office/word/2010/wordprocessingShape" mc:Ignorable="w14 w15 w16se w16cid w16 w16cex w16sdtdh w16sdtfl w16du wp14">
   <w:p>
     <w:pPr>
       <w:spacing w:after="0" w:line="259" w:lineRule="auto"/>
@@ -9869,7 +10783,7 @@
 </file>
 
 <file path=word/header3.xml><?xml version="1.0" encoding="utf-8"?>
-<w:hdr xmlns:wpc="http://schemas.microsoft.com/office/word/2010/wordprocessingCanvas" xmlns:cx="http://schemas.microsoft.com/office/drawing/2014/chartex" xmlns:cx1="http://schemas.microsoft.com/office/drawing/2015/9/8/chartex" xmlns:cx2="http://schemas.microsoft.com/office/drawing/2015/10/21/chartex" xmlns:cx3="http://schemas.microsoft.com/office/drawing/2016/5/9/chartex" xmlns:cx4="http://schemas.microsoft.com/office/drawing/2016/5/10/chartex" xmlns:cx5="http://schemas.microsoft.com/office/drawing/2016/5/11/chartex" xmlns:cx6="http://schemas.microsoft.com/office/drawing/2016/5/12/chartex" xmlns:cx7="http://schemas.microsoft.com/office/drawing/2016/5/13/chartex" xmlns:cx8="http://schemas.microsoft.com/office/drawing/2016/5/14/chartex" xmlns:mc="http://schemas.openxmlformats.org/markup-compatibility/2006" xmlns:aink="http://schemas.microsoft.com/office/drawing/2016/ink" xmlns:am3d="http://schemas.microsoft.com/office/drawing/2017/model3d" xmlns:o="urn:schemas-microsoft-com:office:office" xmlns:r="http://schemas.openxmlformats.org/officeDocument/2006/relationships" xmlns:m="http://schemas.openxmlformats.org/officeDocument/2006/math" xmlns:v="urn:schemas-microsoft-com:vml" xmlns:wp14="http://schemas.microsoft.com/office/word/2010/wordprocessingDrawing" xmlns:wp="http://schemas.openxmlformats.org/drawingml/2006/wordprocessingDrawing" xmlns:w10="urn:schemas-microsoft-com:office:word" xmlns:w="http://schemas.openxmlformats.org/wordprocessingml/2006/main" xmlns:w14="http://schemas.microsoft.com/office/word/2010/wordml" xmlns:w15="http://schemas.microsoft.com/office/word/2012/wordml" xmlns:w16cex="http://schemas.microsoft.com/office/word/2018/wordml/cex" xmlns:w16cid="http://schemas.microsoft.com/office/word/2016/wordml/cid" xmlns:w16="http://schemas.microsoft.com/office/word/2018/wordml" xmlns:w16sdtdh="http://schemas.microsoft.com/office/word/2020/wordml/sdtdatahash" xmlns:w16se="http://schemas.microsoft.com/office/word/2015/wordml/symex" xmlns:wpg="http://schemas.microsoft.com/office/word/2010/wordprocessingGroup" xmlns:wpi="http://schemas.microsoft.com/office/word/2010/wordprocessingInk" xmlns:wne="http://schemas.microsoft.com/office/word/2006/wordml" xmlns:wps="http://schemas.microsoft.com/office/word/2010/wordprocessingShape" mc:Ignorable="w14 w15 w16se w16cid w16 w16cex w16sdtdh wp14">
+<w:hdr xmlns:wpc="http://schemas.microsoft.com/office/word/2010/wordprocessingCanvas" xmlns:cx="http://schemas.microsoft.com/office/drawing/2014/chartex" xmlns:cx1="http://schemas.microsoft.com/office/drawing/2015/9/8/chartex" xmlns:cx2="http://schemas.microsoft.com/office/drawing/2015/10/21/chartex" xmlns:cx3="http://schemas.microsoft.com/office/drawing/2016/5/9/chartex" xmlns:cx4="http://schemas.microsoft.com/office/drawing/2016/5/10/chartex" xmlns:cx5="http://schemas.microsoft.com/office/drawing/2016/5/11/chartex" xmlns:cx6="http://schemas.microsoft.com/office/drawing/2016/5/12/chartex" xmlns:cx7="http://schemas.microsoft.com/office/drawing/2016/5/13/chartex" xmlns:cx8="http://schemas.microsoft.com/office/drawing/2016/5/14/chartex" xmlns:mc="http://schemas.openxmlformats.org/markup-compatibility/2006" xmlns:aink="http://schemas.microsoft.com/office/drawing/2016/ink" xmlns:am3d="http://schemas.microsoft.com/office/drawing/2017/model3d" xmlns:o="urn:schemas-microsoft-com:office:office" xmlns:oel="http://schemas.microsoft.com/office/2019/extlst" xmlns:r="http://schemas.openxmlformats.org/officeDocument/2006/relationships" xmlns:m="http://schemas.openxmlformats.org/officeDocument/2006/math" xmlns:v="urn:schemas-microsoft-com:vml" xmlns:wp14="http://schemas.microsoft.com/office/word/2010/wordprocessingDrawing" xmlns:wp="http://schemas.openxmlformats.org/drawingml/2006/wordprocessingDrawing" xmlns:w10="urn:schemas-microsoft-com:office:word" xmlns:w="http://schemas.openxmlformats.org/wordprocessingml/2006/main" xmlns:w14="http://schemas.microsoft.com/office/word/2010/wordml" xmlns:w15="http://schemas.microsoft.com/office/word/2012/wordml" xmlns:w16cex="http://schemas.microsoft.com/office/word/2018/wordml/cex" xmlns:w16cid="http://schemas.microsoft.com/office/word/2016/wordml/cid" xmlns:w16="http://schemas.microsoft.com/office/word/2018/wordml" xmlns:w16du="http://schemas.microsoft.com/office/word/2023/wordml/word16du" xmlns:w16sdtdh="http://schemas.microsoft.com/office/word/2020/wordml/sdtdatahash" xmlns:w16sdtfl="http://schemas.microsoft.com/office/word/2024/wordml/sdtformatlock" xmlns:w16se="http://schemas.microsoft.com/office/word/2015/wordml/symex" xmlns:wpg="http://schemas.microsoft.com/office/word/2010/wordprocessingGroup" xmlns:wpi="http://schemas.microsoft.com/office/word/2010/wordprocessingInk" xmlns:wne="http://schemas.microsoft.com/office/word/2006/wordml" xmlns:wps="http://schemas.microsoft.com/office/word/2010/wordprocessingShape" mc:Ignorable="w14 w15 w16se w16cid w16 w16cex w16sdtdh w16sdtfl w16du wp14">
   <w:p>
     <w:pPr>
       <w:spacing w:after="160" w:line="259" w:lineRule="auto"/>
@@ -9880,7 +10794,7 @@
 </file>
 
 <file path=word/header4.xml><?xml version="1.0" encoding="utf-8"?>
-<w:hdr xmlns:wpc="http://schemas.microsoft.com/office/word/2010/wordprocessingCanvas" xmlns:cx="http://schemas.microsoft.com/office/drawing/2014/chartex" xmlns:cx1="http://schemas.microsoft.com/office/drawing/2015/9/8/chartex" xmlns:cx2="http://schemas.microsoft.com/office/drawing/2015/10/21/chartex" xmlns:cx3="http://schemas.microsoft.com/office/drawing/2016/5/9/chartex" xmlns:cx4="http://schemas.microsoft.com/office/drawing/2016/5/10/chartex" xmlns:cx5="http://schemas.microsoft.com/office/drawing/2016/5/11/chartex" xmlns:cx6="http://schemas.microsoft.com/office/drawing/2016/5/12/chartex" xmlns:cx7="http://schemas.microsoft.com/office/drawing/2016/5/13/chartex" xmlns:cx8="http://schemas.microsoft.com/office/drawing/2016/5/14/chartex" xmlns:mc="http://schemas.openxmlformats.org/markup-compatibility/2006" xmlns:aink="http://schemas.microsoft.com/office/drawing/2016/ink" xmlns:am3d="http://schemas.microsoft.com/office/drawing/2017/model3d" xmlns:o="urn:schemas-microsoft-com:office:office" xmlns:r="http://schemas.openxmlformats.org/officeDocument/2006/relationships" xmlns:m="http://schemas.openxmlformats.org/officeDocument/2006/math" xmlns:v="urn:schemas-microsoft-com:vml" xmlns:wp14="http://schemas.microsoft.com/office/word/2010/wordprocessingDrawing" xmlns:wp="http://schemas.openxmlformats.org/drawingml/2006/wordprocessingDrawing" xmlns:w10="urn:schemas-microsoft-com:office:word" xmlns:w="http://schemas.openxmlformats.org/wordprocessingml/2006/main" xmlns:w14="http://schemas.microsoft.com/office/word/2010/wordml" xmlns:w15="http://schemas.microsoft.com/office/word/2012/wordml" xmlns:w16cex="http://schemas.microsoft.com/office/word/2018/wordml/cex" xmlns:w16cid="http://schemas.microsoft.com/office/word/2016/wordml/cid" xmlns:w16="http://schemas.microsoft.com/office/word/2018/wordml" xmlns:w16sdtdh="http://schemas.microsoft.com/office/word/2020/wordml/sdtdatahash" xmlns:w16se="http://schemas.microsoft.com/office/word/2015/wordml/symex" xmlns:wpg="http://schemas.microsoft.com/office/word/2010/wordprocessingGroup" xmlns:wpi="http://schemas.microsoft.com/office/word/2010/wordprocessingInk" xmlns:wne="http://schemas.microsoft.com/office/word/2006/wordml" xmlns:wps="http://schemas.microsoft.com/office/word/2010/wordprocessingShape" mc:Ignorable="w14 w15 w16se w16cid w16 w16cex w16sdtdh wp14">
+<w:hdr xmlns:wpc="http://schemas.microsoft.com/office/word/2010/wordprocessingCanvas" xmlns:cx="http://schemas.microsoft.com/office/drawing/2014/chartex" xmlns:cx1="http://schemas.microsoft.com/office/drawing/2015/9/8/chartex" xmlns:cx2="http://schemas.microsoft.com/office/drawing/2015/10/21/chartex" xmlns:cx3="http://schemas.microsoft.com/office/drawing/2016/5/9/chartex" xmlns:cx4="http://schemas.microsoft.com/office/drawing/2016/5/10/chartex" xmlns:cx5="http://schemas.microsoft.com/office/drawing/2016/5/11/chartex" xmlns:cx6="http://schemas.microsoft.com/office/drawing/2016/5/12/chartex" xmlns:cx7="http://schemas.microsoft.com/office/drawing/2016/5/13/chartex" xmlns:cx8="http://schemas.microsoft.com/office/drawing/2016/5/14/chartex" xmlns:mc="http://schemas.openxmlformats.org/markup-compatibility/2006" xmlns:aink="http://schemas.microsoft.com/office/drawing/2016/ink" xmlns:am3d="http://schemas.microsoft.com/office/drawing/2017/model3d" xmlns:o="urn:schemas-microsoft-com:office:office" xmlns:oel="http://schemas.microsoft.com/office/2019/extlst" xmlns:r="http://schemas.openxmlformats.org/officeDocument/2006/relationships" xmlns:m="http://schemas.openxmlformats.org/officeDocument/2006/math" xmlns:v="urn:schemas-microsoft-com:vml" xmlns:wp14="http://schemas.microsoft.com/office/word/2010/wordprocessingDrawing" xmlns:wp="http://schemas.openxmlformats.org/drawingml/2006/wordprocessingDrawing" xmlns:w10="urn:schemas-microsoft-com:office:word" xmlns:w="http://schemas.openxmlformats.org/wordprocessingml/2006/main" xmlns:w14="http://schemas.microsoft.com/office/word/2010/wordml" xmlns:w15="http://schemas.microsoft.com/office/word/2012/wordml" xmlns:w16cex="http://schemas.microsoft.com/office/word/2018/wordml/cex" xmlns:w16cid="http://schemas.microsoft.com/office/word/2016/wordml/cid" xmlns:w16="http://schemas.microsoft.com/office/word/2018/wordml" xmlns:w16du="http://schemas.microsoft.com/office/word/2023/wordml/word16du" xmlns:w16sdtdh="http://schemas.microsoft.com/office/word/2020/wordml/sdtdatahash" xmlns:w16sdtfl="http://schemas.microsoft.com/office/word/2024/wordml/sdtformatlock" xmlns:w16se="http://schemas.microsoft.com/office/word/2015/wordml/symex" xmlns:wpg="http://schemas.microsoft.com/office/word/2010/wordprocessingGroup" xmlns:wpi="http://schemas.microsoft.com/office/word/2010/wordprocessingInk" xmlns:wne="http://schemas.microsoft.com/office/word/2006/wordml" xmlns:wps="http://schemas.microsoft.com/office/word/2010/wordprocessingShape" mc:Ignorable="w14 w15 w16se w16cid w16 w16cex w16sdtdh w16sdtfl w16du wp14">
   <w:p>
     <w:pPr>
       <w:spacing w:after="160" w:line="259" w:lineRule="auto"/>
@@ -9891,7 +10805,7 @@
 </file>
 
 <file path=word/header5.xml><?xml version="1.0" encoding="utf-8"?>
-<w:hdr xmlns:wpc="http://schemas.microsoft.com/office/word/2010/wordprocessingCanvas" xmlns:cx="http://schemas.microsoft.com/office/drawing/2014/chartex" xmlns:cx1="http://schemas.microsoft.com/office/drawing/2015/9/8/chartex" xmlns:cx2="http://schemas.microsoft.com/office/drawing/2015/10/21/chartex" xmlns:cx3="http://schemas.microsoft.com/office/drawing/2016/5/9/chartex" xmlns:cx4="http://schemas.microsoft.com/office/drawing/2016/5/10/chartex" xmlns:cx5="http://schemas.microsoft.com/office/drawing/2016/5/11/chartex" xmlns:cx6="http://schemas.microsoft.com/office/drawing/2016/5/12/chartex" xmlns:cx7="http://schemas.microsoft.com/office/drawing/2016/5/13/chartex" xmlns:cx8="http://schemas.microsoft.com/office/drawing/2016/5/14/chartex" xmlns:mc="http://schemas.openxmlformats.org/markup-compatibility/2006" xmlns:aink="http://schemas.microsoft.com/office/drawing/2016/ink" xmlns:am3d="http://schemas.microsoft.com/office/drawing/2017/model3d" xmlns:o="urn:schemas-microsoft-com:office:office" xmlns:r="http://schemas.openxmlformats.org/officeDocument/2006/relationships" xmlns:m="http://schemas.openxmlformats.org/officeDocument/2006/math" xmlns:v="urn:schemas-microsoft-com:vml" xmlns:wp14="http://schemas.microsoft.com/office/word/2010/wordprocessingDrawing" xmlns:wp="http://schemas.openxmlformats.org/drawingml/2006/wordprocessingDrawing" xmlns:w10="urn:schemas-microsoft-com:office:word" xmlns:w="http://schemas.openxmlformats.org/wordprocessingml/2006/main" xmlns:w14="http://schemas.microsoft.com/office/word/2010/wordml" xmlns:w15="http://schemas.microsoft.com/office/word/2012/wordml" xmlns:w16cex="http://schemas.microsoft.com/office/word/2018/wordml/cex" xmlns:w16cid="http://schemas.microsoft.com/office/word/2016/wordml/cid" xmlns:w16="http://schemas.microsoft.com/office/word/2018/wordml" xmlns:w16sdtdh="http://schemas.microsoft.com/office/word/2020/wordml/sdtdatahash" xmlns:w16se="http://schemas.microsoft.com/office/word/2015/wordml/symex" xmlns:wpg="http://schemas.microsoft.com/office/word/2010/wordprocessingGroup" xmlns:wpi="http://schemas.microsoft.com/office/word/2010/wordprocessingInk" xmlns:wne="http://schemas.microsoft.com/office/word/2006/wordml" xmlns:wps="http://schemas.microsoft.com/office/word/2010/wordprocessingShape" mc:Ignorable="w14 w15 w16se w16cid w16 w16cex w16sdtdh wp14">
+<w:hdr xmlns:wpc="http://schemas.microsoft.com/office/word/2010/wordprocessingCanvas" xmlns:cx="http://schemas.microsoft.com/office/drawing/2014/chartex" xmlns:cx1="http://schemas.microsoft.com/office/drawing/2015/9/8/chartex" xmlns:cx2="http://schemas.microsoft.com/office/drawing/2015/10/21/chartex" xmlns:cx3="http://schemas.microsoft.com/office/drawing/2016/5/9/chartex" xmlns:cx4="http://schemas.microsoft.com/office/drawing/2016/5/10/chartex" xmlns:cx5="http://schemas.microsoft.com/office/drawing/2016/5/11/chartex" xmlns:cx6="http://schemas.microsoft.com/office/drawing/2016/5/12/chartex" xmlns:cx7="http://schemas.microsoft.com/office/drawing/2016/5/13/chartex" xmlns:cx8="http://schemas.microsoft.com/office/drawing/2016/5/14/chartex" xmlns:mc="http://schemas.openxmlformats.org/markup-compatibility/2006" xmlns:aink="http://schemas.microsoft.com/office/drawing/2016/ink" xmlns:am3d="http://schemas.microsoft.com/office/drawing/2017/model3d" xmlns:o="urn:schemas-microsoft-com:office:office" xmlns:oel="http://schemas.microsoft.com/office/2019/extlst" xmlns:r="http://schemas.openxmlformats.org/officeDocument/2006/relationships" xmlns:m="http://schemas.openxmlformats.org/officeDocument/2006/math" xmlns:v="urn:schemas-microsoft-com:vml" xmlns:wp14="http://schemas.microsoft.com/office/word/2010/wordprocessingDrawing" xmlns:wp="http://schemas.openxmlformats.org/drawingml/2006/wordprocessingDrawing" xmlns:w10="urn:schemas-microsoft-com:office:word" xmlns:w="http://schemas.openxmlformats.org/wordprocessingml/2006/main" xmlns:w14="http://schemas.microsoft.com/office/word/2010/wordml" xmlns:w15="http://schemas.microsoft.com/office/word/2012/wordml" xmlns:w16cex="http://schemas.microsoft.com/office/word/2018/wordml/cex" xmlns:w16cid="http://schemas.microsoft.com/office/word/2016/wordml/cid" xmlns:w16="http://schemas.microsoft.com/office/word/2018/wordml" xmlns:w16du="http://schemas.microsoft.com/office/word/2023/wordml/word16du" xmlns:w16sdtdh="http://schemas.microsoft.com/office/word/2020/wordml/sdtdatahash" xmlns:w16sdtfl="http://schemas.microsoft.com/office/word/2024/wordml/sdtformatlock" xmlns:w16se="http://schemas.microsoft.com/office/word/2015/wordml/symex" xmlns:wpg="http://schemas.microsoft.com/office/word/2010/wordprocessingGroup" xmlns:wpi="http://schemas.microsoft.com/office/word/2010/wordprocessingInk" xmlns:wne="http://schemas.microsoft.com/office/word/2006/wordml" xmlns:wps="http://schemas.microsoft.com/office/word/2010/wordprocessingShape" mc:Ignorable="w14 w15 w16se w16cid w16 w16cex w16sdtdh w16sdtfl w16du wp14">
   <w:p>
     <w:pPr>
       <w:spacing w:after="160" w:line="259" w:lineRule="auto"/>
@@ -9902,7 +10816,7 @@
 </file>
 
 <file path=word/header6.xml><?xml version="1.0" encoding="utf-8"?>
-<w:hdr xmlns:wpc="http://schemas.microsoft.com/office/word/2010/wordprocessingCanvas" xmlns:cx="http://schemas.microsoft.com/office/drawing/2014/chartex" xmlns:cx1="http://schemas.microsoft.com/office/drawing/2015/9/8/chartex" xmlns:cx2="http://schemas.microsoft.com/office/drawing/2015/10/21/chartex" xmlns:cx3="http://schemas.microsoft.com/office/drawing/2016/5/9/chartex" xmlns:cx4="http://schemas.microsoft.com/office/drawing/2016/5/10/chartex" xmlns:cx5="http://schemas.microsoft.com/office/drawing/2016/5/11/chartex" xmlns:cx6="http://schemas.microsoft.com/office/drawing/2016/5/12/chartex" xmlns:cx7="http://schemas.microsoft.com/office/drawing/2016/5/13/chartex" xmlns:cx8="http://schemas.microsoft.com/office/drawing/2016/5/14/chartex" xmlns:mc="http://schemas.openxmlformats.org/markup-compatibility/2006" xmlns:aink="http://schemas.microsoft.com/office/drawing/2016/ink" xmlns:am3d="http://schemas.microsoft.com/office/drawing/2017/model3d" xmlns:o="urn:schemas-microsoft-com:office:office" xmlns:r="http://schemas.openxmlformats.org/officeDocument/2006/relationships" xmlns:m="http://schemas.openxmlformats.org/officeDocument/2006/math" xmlns:v="urn:schemas-microsoft-com:vml" xmlns:wp14="http://schemas.microsoft.com/office/word/2010/wordprocessingDrawing" xmlns:wp="http://schemas.openxmlformats.org/drawingml/2006/wordprocessingDrawing" xmlns:w10="urn:schemas-microsoft-com:office:word" xmlns:w="http://schemas.openxmlformats.org/wordprocessingml/2006/main" xmlns:w14="http://schemas.microsoft.com/office/word/2010/wordml" xmlns:w15="http://schemas.microsoft.com/office/word/2012/wordml" xmlns:w16cex="http://schemas.microsoft.com/office/word/2018/wordml/cex" xmlns:w16cid="http://schemas.microsoft.com/office/word/2016/wordml/cid" xmlns:w16="http://schemas.microsoft.com/office/word/2018/wordml" xmlns:w16sdtdh="http://schemas.microsoft.com/office/word/2020/wordml/sdtdatahash" xmlns:w16se="http://schemas.microsoft.com/office/word/2015/wordml/symex" xmlns:wpg="http://schemas.microsoft.com/office/word/2010/wordprocessingGroup" xmlns:wpi="http://schemas.microsoft.com/office/word/2010/wordprocessingInk" xmlns:wne="http://schemas.microsoft.com/office/word/2006/wordml" xmlns:wps="http://schemas.microsoft.com/office/word/2010/wordprocessingShape" mc:Ignorable="w14 w15 w16se w16cid w16 w16cex w16sdtdh wp14">
+<w:hdr xmlns:wpc="http://schemas.microsoft.com/office/word/2010/wordprocessingCanvas" xmlns:cx="http://schemas.microsoft.com/office/drawing/2014/chartex" xmlns:cx1="http://schemas.microsoft.com/office/drawing/2015/9/8/chartex" xmlns:cx2="http://schemas.microsoft.com/office/drawing/2015/10/21/chartex" xmlns:cx3="http://schemas.microsoft.com/office/drawing/2016/5/9/chartex" xmlns:cx4="http://schemas.microsoft.com/office/drawing/2016/5/10/chartex" xmlns:cx5="http://schemas.microsoft.com/office/drawing/2016/5/11/chartex" xmlns:cx6="http://schemas.microsoft.com/office/drawing/2016/5/12/chartex" xmlns:cx7="http://schemas.microsoft.com/office/drawing/2016/5/13/chartex" xmlns:cx8="http://schemas.microsoft.com/office/drawing/2016/5/14/chartex" xmlns:mc="http://schemas.openxmlformats.org/markup-compatibility/2006" xmlns:aink="http://schemas.microsoft.com/office/drawing/2016/ink" xmlns:am3d="http://schemas.microsoft.com/office/drawing/2017/model3d" xmlns:o="urn:schemas-microsoft-com:office:office" xmlns:oel="http://schemas.microsoft.com/office/2019/extlst" xmlns:r="http://schemas.openxmlformats.org/officeDocument/2006/relationships" xmlns:m="http://schemas.openxmlformats.org/officeDocument/2006/math" xmlns:v="urn:schemas-microsoft-com:vml" xmlns:wp14="http://schemas.microsoft.com/office/word/2010/wordprocessingDrawing" xmlns:wp="http://schemas.openxmlformats.org/drawingml/2006/wordprocessingDrawing" xmlns:w10="urn:schemas-microsoft-com:office:word" xmlns:w="http://schemas.openxmlformats.org/wordprocessingml/2006/main" xmlns:w14="http://schemas.microsoft.com/office/word/2010/wordml" xmlns:w15="http://schemas.microsoft.com/office/word/2012/wordml" xmlns:w16cex="http://schemas.microsoft.com/office/word/2018/wordml/cex" xmlns:w16cid="http://schemas.microsoft.com/office/word/2016/wordml/cid" xmlns:w16="http://schemas.microsoft.com/office/word/2018/wordml" xmlns:w16du="http://schemas.microsoft.com/office/word/2023/wordml/word16du" xmlns:w16sdtdh="http://schemas.microsoft.com/office/word/2020/wordml/sdtdatahash" xmlns:w16sdtfl="http://schemas.microsoft.com/office/word/2024/wordml/sdtformatlock" xmlns:w16se="http://schemas.microsoft.com/office/word/2015/wordml/symex" xmlns:wpg="http://schemas.microsoft.com/office/word/2010/wordprocessingGroup" xmlns:wpi="http://schemas.microsoft.com/office/word/2010/wordprocessingInk" xmlns:wne="http://schemas.microsoft.com/office/word/2006/wordml" xmlns:wps="http://schemas.microsoft.com/office/word/2010/wordprocessingShape" mc:Ignorable="w14 w15 w16se w16cid w16 w16cex w16sdtdh w16sdtfl w16du wp14">
   <w:p>
     <w:pPr>
       <w:spacing w:after="160" w:line="259" w:lineRule="auto"/>
@@ -9913,25 +10827,473 @@
 </file>
 
 <file path=word/intelligence2.xml><?xml version="1.0" encoding="utf-8"?>
-<int2:intelligence xmlns:int2="http://schemas.microsoft.com/office/intelligence/2020/intelligence">
+<int2:intelligence xmlns:int2="http://schemas.microsoft.com/office/intelligence/2020/intelligence" xmlns:oel="http://schemas.microsoft.com/office/2019/extlst">
   <int2:observations>
     <int2:bookmark int2:bookmarkName="_Int_2hBZPgM7" int2:invalidationBookmarkName="" int2:hashCode="1ElqKwwYbuBASk" int2:id="MoUV7dkF">
-      <int2:state int2:type="style" int2:value="Rejected"/>
+      <int2:state int2:value="Rejected" int2:type="style"/>
     </int2:bookmark>
     <int2:bookmark int2:bookmarkName="_Int_sr24HzYn" int2:invalidationBookmarkName="" int2:hashCode="w81jalhbIMQKwt" int2:id="QaXNgMHq">
-      <int2:state int2:type="spell" int2:value="Rejected"/>
+      <int2:state int2:value="Rejected" int2:type="spell"/>
     </int2:bookmark>
     <int2:bookmark int2:bookmarkName="_Int_FdbUik8o" int2:invalidationBookmarkName="" int2:hashCode="1ElqKwwYbuBASk" int2:id="SHbK0KfH">
-      <int2:state int2:type="style" int2:value="Rejected"/>
+      <int2:state int2:value="Rejected" int2:type="style"/>
     </int2:bookmark>
   </int2:observations>
   <int2:intelligenceSettings/>
+  <int2:onDemandWorkflows/>
 </int2:intelligence>
 </file>
 
 <file path=word/numbering.xml><?xml version="1.0" encoding="utf-8"?>
-<w:numbering xmlns:wpc="http://schemas.microsoft.com/office/word/2010/wordprocessingCanvas" xmlns:cx="http://schemas.microsoft.com/office/drawing/2014/chartex" xmlns:cx1="http://schemas.microsoft.com/office/drawing/2015/9/8/chartex" xmlns:cx2="http://schemas.microsoft.com/office/drawing/2015/10/21/chartex" xmlns:cx3="http://schemas.microsoft.com/office/drawing/2016/5/9/chartex" xmlns:cx4="http://schemas.microsoft.com/office/drawing/2016/5/10/chartex" xmlns:cx5="http://schemas.microsoft.com/office/drawing/2016/5/11/chartex" xmlns:cx6="http://schemas.microsoft.com/office/drawing/2016/5/12/chartex" xmlns:cx7="http://schemas.microsoft.com/office/drawing/2016/5/13/chartex" xmlns:cx8="http://schemas.microsoft.com/office/drawing/2016/5/14/chartex" xmlns:mc="http://schemas.openxmlformats.org/markup-compatibility/2006" xmlns:aink="http://schemas.microsoft.com/office/drawing/2016/ink" xmlns:am3d="http://schemas.microsoft.com/office/drawing/2017/model3d" xmlns:o="urn:schemas-microsoft-com:office:office" xmlns:r="http://schemas.openxmlformats.org/officeDocument/2006/relationships" xmlns:m="http://schemas.openxmlformats.org/officeDocument/2006/math" xmlns:v="urn:schemas-microsoft-com:vml" xmlns:wp14="http://schemas.microsoft.com/office/word/2010/wordprocessingDrawing" xmlns:wp="http://schemas.openxmlformats.org/drawingml/2006/wordprocessingDrawing" xmlns:w10="urn:schemas-microsoft-com:office:word" xmlns:w="http://schemas.openxmlformats.org/wordprocessingml/2006/main" xmlns:w14="http://schemas.microsoft.com/office/word/2010/wordml" xmlns:w15="http://schemas.microsoft.com/office/word/2012/wordml" xmlns:w16cex="http://schemas.microsoft.com/office/word/2018/wordml/cex" xmlns:w16cid="http://schemas.microsoft.com/office/word/2016/wordml/cid" xmlns:w16="http://schemas.microsoft.com/office/word/2018/wordml" xmlns:w16sdtdh="http://schemas.microsoft.com/office/word/2020/wordml/sdtdatahash" xmlns:w16se="http://schemas.microsoft.com/office/word/2015/wordml/symex" xmlns:wpg="http://schemas.microsoft.com/office/word/2010/wordprocessingGroup" xmlns:wpi="http://schemas.microsoft.com/office/word/2010/wordprocessingInk" xmlns:wne="http://schemas.microsoft.com/office/word/2006/wordml" xmlns:wps="http://schemas.microsoft.com/office/word/2010/wordprocessingShape" mc:Ignorable="w14 w15 w16se w16cid w16 w16cex w16sdtdh wp14">
+<w:numbering xmlns:wpc="http://schemas.microsoft.com/office/word/2010/wordprocessingCanvas" xmlns:cx="http://schemas.microsoft.com/office/drawing/2014/chartex" xmlns:cx1="http://schemas.microsoft.com/office/drawing/2015/9/8/chartex" xmlns:cx2="http://schemas.microsoft.com/office/drawing/2015/10/21/chartex" xmlns:cx3="http://schemas.microsoft.com/office/drawing/2016/5/9/chartex" xmlns:cx4="http://schemas.microsoft.com/office/drawing/2016/5/10/chartex" xmlns:cx5="http://schemas.microsoft.com/office/drawing/2016/5/11/chartex" xmlns:cx6="http://schemas.microsoft.com/office/drawing/2016/5/12/chartex" xmlns:cx7="http://schemas.microsoft.com/office/drawing/2016/5/13/chartex" xmlns:cx8="http://schemas.microsoft.com/office/drawing/2016/5/14/chartex" xmlns:mc="http://schemas.openxmlformats.org/markup-compatibility/2006" xmlns:aink="http://schemas.microsoft.com/office/drawing/2016/ink" xmlns:am3d="http://schemas.microsoft.com/office/drawing/2017/model3d" xmlns:o="urn:schemas-microsoft-com:office:office" xmlns:oel="http://schemas.microsoft.com/office/2019/extlst" xmlns:r="http://schemas.openxmlformats.org/officeDocument/2006/relationships" xmlns:m="http://schemas.openxmlformats.org/officeDocument/2006/math" xmlns:v="urn:schemas-microsoft-com:vml" xmlns:wp14="http://schemas.microsoft.com/office/word/2010/wordprocessingDrawing" xmlns:wp="http://schemas.openxmlformats.org/drawingml/2006/wordprocessingDrawing" xmlns:w10="urn:schemas-microsoft-com:office:word" xmlns:w="http://schemas.openxmlformats.org/wordprocessingml/2006/main" xmlns:w14="http://schemas.microsoft.com/office/word/2010/wordml" xmlns:w15="http://schemas.microsoft.com/office/word/2012/wordml" xmlns:w16cex="http://schemas.microsoft.com/office/word/2018/wordml/cex" xmlns:w16cid="http://schemas.microsoft.com/office/word/2016/wordml/cid" xmlns:w16="http://schemas.microsoft.com/office/word/2018/wordml" xmlns:w16du="http://schemas.microsoft.com/office/word/2023/wordml/word16du" xmlns:w16sdtdh="http://schemas.microsoft.com/office/word/2020/wordml/sdtdatahash" xmlns:w16sdtfl="http://schemas.microsoft.com/office/word/2024/wordml/sdtformatlock" xmlns:w16se="http://schemas.microsoft.com/office/word/2015/wordml/symex" xmlns:wpg="http://schemas.microsoft.com/office/word/2010/wordprocessingGroup" xmlns:wpi="http://schemas.microsoft.com/office/word/2010/wordprocessingInk" xmlns:wne="http://schemas.microsoft.com/office/word/2006/wordml" xmlns:wps="http://schemas.microsoft.com/office/word/2010/wordprocessingShape" mc:Ignorable="w14 w15 w16se w16cid w16 w16cex w16sdtdh w16sdtfl w16du wp14">
   <w:abstractNum w:abstractNumId="0" w15:restartNumberingAfterBreak="0">
+    <w:nsid w:val="00A74697"/>
+    <w:multiLevelType w:val="multilevel"/>
+    <w:tmpl w:val="941432B4"/>
+    <w:lvl w:ilvl="0">
+      <w:start w:val="1"/>
+      <w:numFmt w:val="bullet"/>
+      <w:lvlText w:val=""/>
+      <w:lvlJc w:val="left"/>
+      <w:pPr>
+        <w:tabs>
+          <w:tab w:val="num" w:pos="720"/>
+        </w:tabs>
+        <w:ind w:left="720" w:hanging="360"/>
+      </w:pPr>
+      <w:rPr>
+        <w:rFonts w:ascii="Symbol" w:hAnsi="Symbol" w:hint="default"/>
+        <w:sz w:val="20"/>
+      </w:rPr>
+    </w:lvl>
+    <w:lvl w:ilvl="1" w:tentative="1">
+      <w:start w:val="1"/>
+      <w:numFmt w:val="bullet"/>
+      <w:lvlText w:val=""/>
+      <w:lvlJc w:val="left"/>
+      <w:pPr>
+        <w:tabs>
+          <w:tab w:val="num" w:pos="1440"/>
+        </w:tabs>
+        <w:ind w:left="1440" w:hanging="360"/>
+      </w:pPr>
+      <w:rPr>
+        <w:rFonts w:ascii="Symbol" w:hAnsi="Symbol" w:hint="default"/>
+        <w:sz w:val="20"/>
+      </w:rPr>
+    </w:lvl>
+    <w:lvl w:ilvl="2" w:tentative="1">
+      <w:start w:val="1"/>
+      <w:numFmt w:val="bullet"/>
+      <w:lvlText w:val=""/>
+      <w:lvlJc w:val="left"/>
+      <w:pPr>
+        <w:tabs>
+          <w:tab w:val="num" w:pos="2160"/>
+        </w:tabs>
+        <w:ind w:left="2160" w:hanging="360"/>
+      </w:pPr>
+      <w:rPr>
+        <w:rFonts w:ascii="Symbol" w:hAnsi="Symbol" w:hint="default"/>
+        <w:sz w:val="20"/>
+      </w:rPr>
+    </w:lvl>
+    <w:lvl w:ilvl="3" w:tentative="1">
+      <w:start w:val="1"/>
+      <w:numFmt w:val="bullet"/>
+      <w:lvlText w:val=""/>
+      <w:lvlJc w:val="left"/>
+      <w:pPr>
+        <w:tabs>
+          <w:tab w:val="num" w:pos="2880"/>
+        </w:tabs>
+        <w:ind w:left="2880" w:hanging="360"/>
+      </w:pPr>
+      <w:rPr>
+        <w:rFonts w:ascii="Symbol" w:hAnsi="Symbol" w:hint="default"/>
+        <w:sz w:val="20"/>
+      </w:rPr>
+    </w:lvl>
+    <w:lvl w:ilvl="4" w:tentative="1">
+      <w:start w:val="1"/>
+      <w:numFmt w:val="bullet"/>
+      <w:lvlText w:val=""/>
+      <w:lvlJc w:val="left"/>
+      <w:pPr>
+        <w:tabs>
+          <w:tab w:val="num" w:pos="3600"/>
+        </w:tabs>
+        <w:ind w:left="3600" w:hanging="360"/>
+      </w:pPr>
+      <w:rPr>
+        <w:rFonts w:ascii="Symbol" w:hAnsi="Symbol" w:hint="default"/>
+        <w:sz w:val="20"/>
+      </w:rPr>
+    </w:lvl>
+    <w:lvl w:ilvl="5" w:tentative="1">
+      <w:start w:val="1"/>
+      <w:numFmt w:val="bullet"/>
+      <w:lvlText w:val=""/>
+      <w:lvlJc w:val="left"/>
+      <w:pPr>
+        <w:tabs>
+          <w:tab w:val="num" w:pos="4320"/>
+        </w:tabs>
+        <w:ind w:left="4320" w:hanging="360"/>
+      </w:pPr>
+      <w:rPr>
+        <w:rFonts w:ascii="Symbol" w:hAnsi="Symbol" w:hint="default"/>
+        <w:sz w:val="20"/>
+      </w:rPr>
+    </w:lvl>
+    <w:lvl w:ilvl="6" w:tentative="1">
+      <w:start w:val="1"/>
+      <w:numFmt w:val="bullet"/>
+      <w:lvlText w:val=""/>
+      <w:lvlJc w:val="left"/>
+      <w:pPr>
+        <w:tabs>
+          <w:tab w:val="num" w:pos="5040"/>
+        </w:tabs>
+        <w:ind w:left="5040" w:hanging="360"/>
+      </w:pPr>
+      <w:rPr>
+        <w:rFonts w:ascii="Symbol" w:hAnsi="Symbol" w:hint="default"/>
+        <w:sz w:val="20"/>
+      </w:rPr>
+    </w:lvl>
+    <w:lvl w:ilvl="7" w:tentative="1">
+      <w:start w:val="1"/>
+      <w:numFmt w:val="bullet"/>
+      <w:lvlText w:val=""/>
+      <w:lvlJc w:val="left"/>
+      <w:pPr>
+        <w:tabs>
+          <w:tab w:val="num" w:pos="5760"/>
+        </w:tabs>
+        <w:ind w:left="5760" w:hanging="360"/>
+      </w:pPr>
+      <w:rPr>
+        <w:rFonts w:ascii="Symbol" w:hAnsi="Symbol" w:hint="default"/>
+        <w:sz w:val="20"/>
+      </w:rPr>
+    </w:lvl>
+    <w:lvl w:ilvl="8" w:tentative="1">
+      <w:start w:val="1"/>
+      <w:numFmt w:val="bullet"/>
+      <w:lvlText w:val=""/>
+      <w:lvlJc w:val="left"/>
+      <w:pPr>
+        <w:tabs>
+          <w:tab w:val="num" w:pos="6480"/>
+        </w:tabs>
+        <w:ind w:left="6480" w:hanging="360"/>
+      </w:pPr>
+      <w:rPr>
+        <w:rFonts w:ascii="Symbol" w:hAnsi="Symbol" w:hint="default"/>
+        <w:sz w:val="20"/>
+      </w:rPr>
+    </w:lvl>
+  </w:abstractNum>
+  <w:abstractNum w:abstractNumId="1" w15:restartNumberingAfterBreak="0">
+    <w:nsid w:val="02A072F3"/>
+    <w:multiLevelType w:val="multilevel"/>
+    <w:tmpl w:val="6A0E1910"/>
+    <w:lvl w:ilvl="0">
+      <w:start w:val="1"/>
+      <w:numFmt w:val="bullet"/>
+      <w:lvlText w:val=""/>
+      <w:lvlJc w:val="left"/>
+      <w:pPr>
+        <w:tabs>
+          <w:tab w:val="num" w:pos="720"/>
+        </w:tabs>
+        <w:ind w:left="720" w:hanging="360"/>
+      </w:pPr>
+      <w:rPr>
+        <w:rFonts w:ascii="Symbol" w:hAnsi="Symbol" w:hint="default"/>
+        <w:sz w:val="20"/>
+      </w:rPr>
+    </w:lvl>
+    <w:lvl w:ilvl="1" w:tentative="1">
+      <w:start w:val="1"/>
+      <w:numFmt w:val="bullet"/>
+      <w:lvlText w:val=""/>
+      <w:lvlJc w:val="left"/>
+      <w:pPr>
+        <w:tabs>
+          <w:tab w:val="num" w:pos="1440"/>
+        </w:tabs>
+        <w:ind w:left="1440" w:hanging="360"/>
+      </w:pPr>
+      <w:rPr>
+        <w:rFonts w:ascii="Symbol" w:hAnsi="Symbol" w:hint="default"/>
+        <w:sz w:val="20"/>
+      </w:rPr>
+    </w:lvl>
+    <w:lvl w:ilvl="2" w:tentative="1">
+      <w:start w:val="1"/>
+      <w:numFmt w:val="bullet"/>
+      <w:lvlText w:val=""/>
+      <w:lvlJc w:val="left"/>
+      <w:pPr>
+        <w:tabs>
+          <w:tab w:val="num" w:pos="2160"/>
+        </w:tabs>
+        <w:ind w:left="2160" w:hanging="360"/>
+      </w:pPr>
+      <w:rPr>
+        <w:rFonts w:ascii="Symbol" w:hAnsi="Symbol" w:hint="default"/>
+        <w:sz w:val="20"/>
+      </w:rPr>
+    </w:lvl>
+    <w:lvl w:ilvl="3" w:tentative="1">
+      <w:start w:val="1"/>
+      <w:numFmt w:val="bullet"/>
+      <w:lvlText w:val=""/>
+      <w:lvlJc w:val="left"/>
+      <w:pPr>
+        <w:tabs>
+          <w:tab w:val="num" w:pos="2880"/>
+        </w:tabs>
+        <w:ind w:left="2880" w:hanging="360"/>
+      </w:pPr>
+      <w:rPr>
+        <w:rFonts w:ascii="Symbol" w:hAnsi="Symbol" w:hint="default"/>
+        <w:sz w:val="20"/>
+      </w:rPr>
+    </w:lvl>
+    <w:lvl w:ilvl="4" w:tentative="1">
+      <w:start w:val="1"/>
+      <w:numFmt w:val="bullet"/>
+      <w:lvlText w:val=""/>
+      <w:lvlJc w:val="left"/>
+      <w:pPr>
+        <w:tabs>
+          <w:tab w:val="num" w:pos="3600"/>
+        </w:tabs>
+        <w:ind w:left="3600" w:hanging="360"/>
+      </w:pPr>
+      <w:rPr>
+        <w:rFonts w:ascii="Symbol" w:hAnsi="Symbol" w:hint="default"/>
+        <w:sz w:val="20"/>
+      </w:rPr>
+    </w:lvl>
+    <w:lvl w:ilvl="5" w:tentative="1">
+      <w:start w:val="1"/>
+      <w:numFmt w:val="bullet"/>
+      <w:lvlText w:val=""/>
+      <w:lvlJc w:val="left"/>
+      <w:pPr>
+        <w:tabs>
+          <w:tab w:val="num" w:pos="4320"/>
+        </w:tabs>
+        <w:ind w:left="4320" w:hanging="360"/>
+      </w:pPr>
+      <w:rPr>
+        <w:rFonts w:ascii="Symbol" w:hAnsi="Symbol" w:hint="default"/>
+        <w:sz w:val="20"/>
+      </w:rPr>
+    </w:lvl>
+    <w:lvl w:ilvl="6" w:tentative="1">
+      <w:start w:val="1"/>
+      <w:numFmt w:val="bullet"/>
+      <w:lvlText w:val=""/>
+      <w:lvlJc w:val="left"/>
+      <w:pPr>
+        <w:tabs>
+          <w:tab w:val="num" w:pos="5040"/>
+        </w:tabs>
+        <w:ind w:left="5040" w:hanging="360"/>
+      </w:pPr>
+      <w:rPr>
+        <w:rFonts w:ascii="Symbol" w:hAnsi="Symbol" w:hint="default"/>
+        <w:sz w:val="20"/>
+      </w:rPr>
+    </w:lvl>
+    <w:lvl w:ilvl="7" w:tentative="1">
+      <w:start w:val="1"/>
+      <w:numFmt w:val="bullet"/>
+      <w:lvlText w:val=""/>
+      <w:lvlJc w:val="left"/>
+      <w:pPr>
+        <w:tabs>
+          <w:tab w:val="num" w:pos="5760"/>
+        </w:tabs>
+        <w:ind w:left="5760" w:hanging="360"/>
+      </w:pPr>
+      <w:rPr>
+        <w:rFonts w:ascii="Symbol" w:hAnsi="Symbol" w:hint="default"/>
+        <w:sz w:val="20"/>
+      </w:rPr>
+    </w:lvl>
+    <w:lvl w:ilvl="8" w:tentative="1">
+      <w:start w:val="1"/>
+      <w:numFmt w:val="bullet"/>
+      <w:lvlText w:val=""/>
+      <w:lvlJc w:val="left"/>
+      <w:pPr>
+        <w:tabs>
+          <w:tab w:val="num" w:pos="6480"/>
+        </w:tabs>
+        <w:ind w:left="6480" w:hanging="360"/>
+      </w:pPr>
+      <w:rPr>
+        <w:rFonts w:ascii="Symbol" w:hAnsi="Symbol" w:hint="default"/>
+        <w:sz w:val="20"/>
+      </w:rPr>
+    </w:lvl>
+  </w:abstractNum>
+  <w:abstractNum w:abstractNumId="2" w15:restartNumberingAfterBreak="0">
+    <w:nsid w:val="083A5392"/>
+    <w:multiLevelType w:val="multilevel"/>
+    <w:tmpl w:val="78E21474"/>
+    <w:lvl w:ilvl="0">
+      <w:start w:val="1"/>
+      <w:numFmt w:val="bullet"/>
+      <w:lvlText w:val=""/>
+      <w:lvlJc w:val="left"/>
+      <w:pPr>
+        <w:tabs>
+          <w:tab w:val="num" w:pos="720"/>
+        </w:tabs>
+        <w:ind w:left="720" w:hanging="360"/>
+      </w:pPr>
+      <w:rPr>
+        <w:rFonts w:ascii="Symbol" w:hAnsi="Symbol" w:hint="default"/>
+        <w:sz w:val="20"/>
+      </w:rPr>
+    </w:lvl>
+    <w:lvl w:ilvl="1" w:tentative="1">
+      <w:start w:val="1"/>
+      <w:numFmt w:val="bullet"/>
+      <w:lvlText w:val=""/>
+      <w:lvlJc w:val="left"/>
+      <w:pPr>
+        <w:tabs>
+          <w:tab w:val="num" w:pos="1440"/>
+        </w:tabs>
+        <w:ind w:left="1440" w:hanging="360"/>
+      </w:pPr>
+      <w:rPr>
+        <w:rFonts w:ascii="Symbol" w:hAnsi="Symbol" w:hint="default"/>
+        <w:sz w:val="20"/>
+      </w:rPr>
+    </w:lvl>
+    <w:lvl w:ilvl="2" w:tentative="1">
+      <w:start w:val="1"/>
+      <w:numFmt w:val="bullet"/>
+      <w:lvlText w:val=""/>
+      <w:lvlJc w:val="left"/>
+      <w:pPr>
+        <w:tabs>
+          <w:tab w:val="num" w:pos="2160"/>
+        </w:tabs>
+        <w:ind w:left="2160" w:hanging="360"/>
+      </w:pPr>
+      <w:rPr>
+        <w:rFonts w:ascii="Symbol" w:hAnsi="Symbol" w:hint="default"/>
+        <w:sz w:val="20"/>
+      </w:rPr>
+    </w:lvl>
+    <w:lvl w:ilvl="3" w:tentative="1">
+      <w:start w:val="1"/>
+      <w:numFmt w:val="bullet"/>
+      <w:lvlText w:val=""/>
+      <w:lvlJc w:val="left"/>
+      <w:pPr>
+        <w:tabs>
+          <w:tab w:val="num" w:pos="2880"/>
+        </w:tabs>
+        <w:ind w:left="2880" w:hanging="360"/>
+      </w:pPr>
+      <w:rPr>
+        <w:rFonts w:ascii="Symbol" w:hAnsi="Symbol" w:hint="default"/>
+        <w:sz w:val="20"/>
+      </w:rPr>
+    </w:lvl>
+    <w:lvl w:ilvl="4" w:tentative="1">
+      <w:start w:val="1"/>
+      <w:numFmt w:val="bullet"/>
+      <w:lvlText w:val=""/>
+      <w:lvlJc w:val="left"/>
+      <w:pPr>
+        <w:tabs>
+          <w:tab w:val="num" w:pos="3600"/>
+        </w:tabs>
+        <w:ind w:left="3600" w:hanging="360"/>
+      </w:pPr>
+      <w:rPr>
+        <w:rFonts w:ascii="Symbol" w:hAnsi="Symbol" w:hint="default"/>
+        <w:sz w:val="20"/>
+      </w:rPr>
+    </w:lvl>
+    <w:lvl w:ilvl="5" w:tentative="1">
+      <w:start w:val="1"/>
+      <w:numFmt w:val="bullet"/>
+      <w:lvlText w:val=""/>
+      <w:lvlJc w:val="left"/>
+      <w:pPr>
+        <w:tabs>
+          <w:tab w:val="num" w:pos="4320"/>
+        </w:tabs>
+        <w:ind w:left="4320" w:hanging="360"/>
+      </w:pPr>
+      <w:rPr>
+        <w:rFonts w:ascii="Symbol" w:hAnsi="Symbol" w:hint="default"/>
+        <w:sz w:val="20"/>
+      </w:rPr>
+    </w:lvl>
+    <w:lvl w:ilvl="6" w:tentative="1">
+      <w:start w:val="1"/>
+      <w:numFmt w:val="bullet"/>
+      <w:lvlText w:val=""/>
+      <w:lvlJc w:val="left"/>
+      <w:pPr>
+        <w:tabs>
+          <w:tab w:val="num" w:pos="5040"/>
+        </w:tabs>
+        <w:ind w:left="5040" w:hanging="360"/>
+      </w:pPr>
+      <w:rPr>
+        <w:rFonts w:ascii="Symbol" w:hAnsi="Symbol" w:hint="default"/>
+        <w:sz w:val="20"/>
+      </w:rPr>
+    </w:lvl>
+    <w:lvl w:ilvl="7" w:tentative="1">
+      <w:start w:val="1"/>
+      <w:numFmt w:val="bullet"/>
+      <w:lvlText w:val=""/>
+      <w:lvlJc w:val="left"/>
+      <w:pPr>
+        <w:tabs>
+          <w:tab w:val="num" w:pos="5760"/>
+        </w:tabs>
+        <w:ind w:left="5760" w:hanging="360"/>
+      </w:pPr>
+      <w:rPr>
+        <w:rFonts w:ascii="Symbol" w:hAnsi="Symbol" w:hint="default"/>
+        <w:sz w:val="20"/>
+      </w:rPr>
+    </w:lvl>
+    <w:lvl w:ilvl="8" w:tentative="1">
+      <w:start w:val="1"/>
+      <w:numFmt w:val="bullet"/>
+      <w:lvlText w:val=""/>
+      <w:lvlJc w:val="left"/>
+      <w:pPr>
+        <w:tabs>
+          <w:tab w:val="num" w:pos="6480"/>
+        </w:tabs>
+        <w:ind w:left="6480" w:hanging="360"/>
+      </w:pPr>
+      <w:rPr>
+        <w:rFonts w:ascii="Symbol" w:hAnsi="Symbol" w:hint="default"/>
+        <w:sz w:val="20"/>
+      </w:rPr>
+    </w:lvl>
+  </w:abstractNum>
+  <w:abstractNum w:abstractNumId="3" w15:restartNumberingAfterBreak="0">
     <w:nsid w:val="107F8219"/>
     <w:multiLevelType w:val="hybridMultilevel"/>
     <w:tmpl w:val="E5E064F6"/>
@@ -10044,7 +11406,7 @@
       </w:rPr>
     </w:lvl>
   </w:abstractNum>
-  <w:abstractNum w:abstractNumId="1" w15:restartNumberingAfterBreak="0">
+  <w:abstractNum w:abstractNumId="4" w15:restartNumberingAfterBreak="0">
     <w:nsid w:val="147CEDC1"/>
     <w:multiLevelType w:val="hybridMultilevel"/>
     <w:tmpl w:val="16841E08"/>
@@ -10157,7 +11519,418 @@
       </w:rPr>
     </w:lvl>
   </w:abstractNum>
-  <w:abstractNum w:abstractNumId="2" w15:restartNumberingAfterBreak="0">
+  <w:abstractNum w:abstractNumId="5" w15:restartNumberingAfterBreak="0">
+    <w:nsid w:val="1F483240"/>
+    <w:multiLevelType w:val="hybridMultilevel"/>
+    <w:tmpl w:val="0F8E16E0"/>
+    <w:lvl w:ilvl="0" w:tplc="04160001">
+      <w:start w:val="1"/>
+      <w:numFmt w:val="bullet"/>
+      <w:lvlText w:val=""/>
+      <w:lvlJc w:val="left"/>
+      <w:pPr>
+        <w:ind w:left="705" w:hanging="360"/>
+      </w:pPr>
+      <w:rPr>
+        <w:rFonts w:ascii="Symbol" w:hAnsi="Symbol" w:hint="default"/>
+      </w:rPr>
+    </w:lvl>
+    <w:lvl w:ilvl="1" w:tplc="04160003" w:tentative="1">
+      <w:start w:val="1"/>
+      <w:numFmt w:val="bullet"/>
+      <w:lvlText w:val="o"/>
+      <w:lvlJc w:val="left"/>
+      <w:pPr>
+        <w:ind w:left="1425" w:hanging="360"/>
+      </w:pPr>
+      <w:rPr>
+        <w:rFonts w:ascii="Courier New" w:hAnsi="Courier New" w:cs="Courier New" w:hint="default"/>
+      </w:rPr>
+    </w:lvl>
+    <w:lvl w:ilvl="2" w:tplc="04160005" w:tentative="1">
+      <w:start w:val="1"/>
+      <w:numFmt w:val="bullet"/>
+      <w:lvlText w:val=""/>
+      <w:lvlJc w:val="left"/>
+      <w:pPr>
+        <w:ind w:left="2145" w:hanging="360"/>
+      </w:pPr>
+      <w:rPr>
+        <w:rFonts w:ascii="Wingdings" w:hAnsi="Wingdings" w:hint="default"/>
+      </w:rPr>
+    </w:lvl>
+    <w:lvl w:ilvl="3" w:tplc="04160001" w:tentative="1">
+      <w:start w:val="1"/>
+      <w:numFmt w:val="bullet"/>
+      <w:lvlText w:val=""/>
+      <w:lvlJc w:val="left"/>
+      <w:pPr>
+        <w:ind w:left="2865" w:hanging="360"/>
+      </w:pPr>
+      <w:rPr>
+        <w:rFonts w:ascii="Symbol" w:hAnsi="Symbol" w:hint="default"/>
+      </w:rPr>
+    </w:lvl>
+    <w:lvl w:ilvl="4" w:tplc="04160003" w:tentative="1">
+      <w:start w:val="1"/>
+      <w:numFmt w:val="bullet"/>
+      <w:lvlText w:val="o"/>
+      <w:lvlJc w:val="left"/>
+      <w:pPr>
+        <w:ind w:left="3585" w:hanging="360"/>
+      </w:pPr>
+      <w:rPr>
+        <w:rFonts w:ascii="Courier New" w:hAnsi="Courier New" w:cs="Courier New" w:hint="default"/>
+      </w:rPr>
+    </w:lvl>
+    <w:lvl w:ilvl="5" w:tplc="04160005" w:tentative="1">
+      <w:start w:val="1"/>
+      <w:numFmt w:val="bullet"/>
+      <w:lvlText w:val=""/>
+      <w:lvlJc w:val="left"/>
+      <w:pPr>
+        <w:ind w:left="4305" w:hanging="360"/>
+      </w:pPr>
+      <w:rPr>
+        <w:rFonts w:ascii="Wingdings" w:hAnsi="Wingdings" w:hint="default"/>
+      </w:rPr>
+    </w:lvl>
+    <w:lvl w:ilvl="6" w:tplc="04160001" w:tentative="1">
+      <w:start w:val="1"/>
+      <w:numFmt w:val="bullet"/>
+      <w:lvlText w:val=""/>
+      <w:lvlJc w:val="left"/>
+      <w:pPr>
+        <w:ind w:left="5025" w:hanging="360"/>
+      </w:pPr>
+      <w:rPr>
+        <w:rFonts w:ascii="Symbol" w:hAnsi="Symbol" w:hint="default"/>
+      </w:rPr>
+    </w:lvl>
+    <w:lvl w:ilvl="7" w:tplc="04160003" w:tentative="1">
+      <w:start w:val="1"/>
+      <w:numFmt w:val="bullet"/>
+      <w:lvlText w:val="o"/>
+      <w:lvlJc w:val="left"/>
+      <w:pPr>
+        <w:ind w:left="5745" w:hanging="360"/>
+      </w:pPr>
+      <w:rPr>
+        <w:rFonts w:ascii="Courier New" w:hAnsi="Courier New" w:cs="Courier New" w:hint="default"/>
+      </w:rPr>
+    </w:lvl>
+    <w:lvl w:ilvl="8" w:tplc="04160005" w:tentative="1">
+      <w:start w:val="1"/>
+      <w:numFmt w:val="bullet"/>
+      <w:lvlText w:val=""/>
+      <w:lvlJc w:val="left"/>
+      <w:pPr>
+        <w:ind w:left="6465" w:hanging="360"/>
+      </w:pPr>
+      <w:rPr>
+        <w:rFonts w:ascii="Wingdings" w:hAnsi="Wingdings" w:hint="default"/>
+      </w:rPr>
+    </w:lvl>
+  </w:abstractNum>
+  <w:abstractNum w:abstractNumId="6" w15:restartNumberingAfterBreak="0">
+    <w:nsid w:val="20EE0205"/>
+    <w:multiLevelType w:val="multilevel"/>
+    <w:tmpl w:val="4978E394"/>
+    <w:lvl w:ilvl="0">
+      <w:start w:val="1"/>
+      <w:numFmt w:val="bullet"/>
+      <w:lvlText w:val=""/>
+      <w:lvlJc w:val="left"/>
+      <w:pPr>
+        <w:tabs>
+          <w:tab w:val="num" w:pos="720"/>
+        </w:tabs>
+        <w:ind w:left="720" w:hanging="360"/>
+      </w:pPr>
+      <w:rPr>
+        <w:rFonts w:ascii="Symbol" w:hAnsi="Symbol" w:hint="default"/>
+        <w:sz w:val="20"/>
+      </w:rPr>
+    </w:lvl>
+    <w:lvl w:ilvl="1" w:tentative="1">
+      <w:start w:val="1"/>
+      <w:numFmt w:val="bullet"/>
+      <w:lvlText w:val=""/>
+      <w:lvlJc w:val="left"/>
+      <w:pPr>
+        <w:tabs>
+          <w:tab w:val="num" w:pos="1440"/>
+        </w:tabs>
+        <w:ind w:left="1440" w:hanging="360"/>
+      </w:pPr>
+      <w:rPr>
+        <w:rFonts w:ascii="Symbol" w:hAnsi="Symbol" w:hint="default"/>
+        <w:sz w:val="20"/>
+      </w:rPr>
+    </w:lvl>
+    <w:lvl w:ilvl="2" w:tentative="1">
+      <w:start w:val="1"/>
+      <w:numFmt w:val="bullet"/>
+      <w:lvlText w:val=""/>
+      <w:lvlJc w:val="left"/>
+      <w:pPr>
+        <w:tabs>
+          <w:tab w:val="num" w:pos="2160"/>
+        </w:tabs>
+        <w:ind w:left="2160" w:hanging="360"/>
+      </w:pPr>
+      <w:rPr>
+        <w:rFonts w:ascii="Symbol" w:hAnsi="Symbol" w:hint="default"/>
+        <w:sz w:val="20"/>
+      </w:rPr>
+    </w:lvl>
+    <w:lvl w:ilvl="3" w:tentative="1">
+      <w:start w:val="1"/>
+      <w:numFmt w:val="bullet"/>
+      <w:lvlText w:val=""/>
+      <w:lvlJc w:val="left"/>
+      <w:pPr>
+        <w:tabs>
+          <w:tab w:val="num" w:pos="2880"/>
+        </w:tabs>
+        <w:ind w:left="2880" w:hanging="360"/>
+      </w:pPr>
+      <w:rPr>
+        <w:rFonts w:ascii="Symbol" w:hAnsi="Symbol" w:hint="default"/>
+        <w:sz w:val="20"/>
+      </w:rPr>
+    </w:lvl>
+    <w:lvl w:ilvl="4" w:tentative="1">
+      <w:start w:val="1"/>
+      <w:numFmt w:val="bullet"/>
+      <w:lvlText w:val=""/>
+      <w:lvlJc w:val="left"/>
+      <w:pPr>
+        <w:tabs>
+          <w:tab w:val="num" w:pos="3600"/>
+        </w:tabs>
+        <w:ind w:left="3600" w:hanging="360"/>
+      </w:pPr>
+      <w:rPr>
+        <w:rFonts w:ascii="Symbol" w:hAnsi="Symbol" w:hint="default"/>
+        <w:sz w:val="20"/>
+      </w:rPr>
+    </w:lvl>
+    <w:lvl w:ilvl="5" w:tentative="1">
+      <w:start w:val="1"/>
+      <w:numFmt w:val="bullet"/>
+      <w:lvlText w:val=""/>
+      <w:lvlJc w:val="left"/>
+      <w:pPr>
+        <w:tabs>
+          <w:tab w:val="num" w:pos="4320"/>
+        </w:tabs>
+        <w:ind w:left="4320" w:hanging="360"/>
+      </w:pPr>
+      <w:rPr>
+        <w:rFonts w:ascii="Symbol" w:hAnsi="Symbol" w:hint="default"/>
+        <w:sz w:val="20"/>
+      </w:rPr>
+    </w:lvl>
+    <w:lvl w:ilvl="6" w:tentative="1">
+      <w:start w:val="1"/>
+      <w:numFmt w:val="bullet"/>
+      <w:lvlText w:val=""/>
+      <w:lvlJc w:val="left"/>
+      <w:pPr>
+        <w:tabs>
+          <w:tab w:val="num" w:pos="5040"/>
+        </w:tabs>
+        <w:ind w:left="5040" w:hanging="360"/>
+      </w:pPr>
+      <w:rPr>
+        <w:rFonts w:ascii="Symbol" w:hAnsi="Symbol" w:hint="default"/>
+        <w:sz w:val="20"/>
+      </w:rPr>
+    </w:lvl>
+    <w:lvl w:ilvl="7" w:tentative="1">
+      <w:start w:val="1"/>
+      <w:numFmt w:val="bullet"/>
+      <w:lvlText w:val=""/>
+      <w:lvlJc w:val="left"/>
+      <w:pPr>
+        <w:tabs>
+          <w:tab w:val="num" w:pos="5760"/>
+        </w:tabs>
+        <w:ind w:left="5760" w:hanging="360"/>
+      </w:pPr>
+      <w:rPr>
+        <w:rFonts w:ascii="Symbol" w:hAnsi="Symbol" w:hint="default"/>
+        <w:sz w:val="20"/>
+      </w:rPr>
+    </w:lvl>
+    <w:lvl w:ilvl="8" w:tentative="1">
+      <w:start w:val="1"/>
+      <w:numFmt w:val="bullet"/>
+      <w:lvlText w:val=""/>
+      <w:lvlJc w:val="left"/>
+      <w:pPr>
+        <w:tabs>
+          <w:tab w:val="num" w:pos="6480"/>
+        </w:tabs>
+        <w:ind w:left="6480" w:hanging="360"/>
+      </w:pPr>
+      <w:rPr>
+        <w:rFonts w:ascii="Symbol" w:hAnsi="Symbol" w:hint="default"/>
+        <w:sz w:val="20"/>
+      </w:rPr>
+    </w:lvl>
+  </w:abstractNum>
+  <w:abstractNum w:abstractNumId="7" w15:restartNumberingAfterBreak="0">
+    <w:nsid w:val="246316B6"/>
+    <w:multiLevelType w:val="multilevel"/>
+    <w:tmpl w:val="04C8CA98"/>
+    <w:lvl w:ilvl="0">
+      <w:start w:val="1"/>
+      <w:numFmt w:val="bullet"/>
+      <w:lvlText w:val=""/>
+      <w:lvlJc w:val="left"/>
+      <w:pPr>
+        <w:tabs>
+          <w:tab w:val="num" w:pos="720"/>
+        </w:tabs>
+        <w:ind w:left="720" w:hanging="360"/>
+      </w:pPr>
+      <w:rPr>
+        <w:rFonts w:ascii="Symbol" w:hAnsi="Symbol" w:hint="default"/>
+        <w:sz w:val="20"/>
+      </w:rPr>
+    </w:lvl>
+    <w:lvl w:ilvl="1" w:tentative="1">
+      <w:start w:val="1"/>
+      <w:numFmt w:val="bullet"/>
+      <w:lvlText w:val=""/>
+      <w:lvlJc w:val="left"/>
+      <w:pPr>
+        <w:tabs>
+          <w:tab w:val="num" w:pos="1440"/>
+        </w:tabs>
+        <w:ind w:left="1440" w:hanging="360"/>
+      </w:pPr>
+      <w:rPr>
+        <w:rFonts w:ascii="Symbol" w:hAnsi="Symbol" w:hint="default"/>
+        <w:sz w:val="20"/>
+      </w:rPr>
+    </w:lvl>
+    <w:lvl w:ilvl="2" w:tentative="1">
+      <w:start w:val="1"/>
+      <w:numFmt w:val="bullet"/>
+      <w:lvlText w:val=""/>
+      <w:lvlJc w:val="left"/>
+      <w:pPr>
+        <w:tabs>
+          <w:tab w:val="num" w:pos="2160"/>
+        </w:tabs>
+        <w:ind w:left="2160" w:hanging="360"/>
+      </w:pPr>
+      <w:rPr>
+        <w:rFonts w:ascii="Symbol" w:hAnsi="Symbol" w:hint="default"/>
+        <w:sz w:val="20"/>
+      </w:rPr>
+    </w:lvl>
+    <w:lvl w:ilvl="3" w:tentative="1">
+      <w:start w:val="1"/>
+      <w:numFmt w:val="bullet"/>
+      <w:lvlText w:val=""/>
+      <w:lvlJc w:val="left"/>
+      <w:pPr>
+        <w:tabs>
+          <w:tab w:val="num" w:pos="2880"/>
+        </w:tabs>
+        <w:ind w:left="2880" w:hanging="360"/>
+      </w:pPr>
+      <w:rPr>
+        <w:rFonts w:ascii="Symbol" w:hAnsi="Symbol" w:hint="default"/>
+        <w:sz w:val="20"/>
+      </w:rPr>
+    </w:lvl>
+    <w:lvl w:ilvl="4" w:tentative="1">
+      <w:start w:val="1"/>
+      <w:numFmt w:val="bullet"/>
+      <w:lvlText w:val=""/>
+      <w:lvlJc w:val="left"/>
+      <w:pPr>
+        <w:tabs>
+          <w:tab w:val="num" w:pos="3600"/>
+        </w:tabs>
+        <w:ind w:left="3600" w:hanging="360"/>
+      </w:pPr>
+      <w:rPr>
+        <w:rFonts w:ascii="Symbol" w:hAnsi="Symbol" w:hint="default"/>
+        <w:sz w:val="20"/>
+      </w:rPr>
+    </w:lvl>
+    <w:lvl w:ilvl="5" w:tentative="1">
+      <w:start w:val="1"/>
+      <w:numFmt w:val="bullet"/>
+      <w:lvlText w:val=""/>
+      <w:lvlJc w:val="left"/>
+      <w:pPr>
+        <w:tabs>
+          <w:tab w:val="num" w:pos="4320"/>
+        </w:tabs>
+        <w:ind w:left="4320" w:hanging="360"/>
+      </w:pPr>
+      <w:rPr>
+        <w:rFonts w:ascii="Symbol" w:hAnsi="Symbol" w:hint="default"/>
+        <w:sz w:val="20"/>
+      </w:rPr>
+    </w:lvl>
+    <w:lvl w:ilvl="6" w:tentative="1">
+      <w:start w:val="1"/>
+      <w:numFmt w:val="bullet"/>
+      <w:lvlText w:val=""/>
+      <w:lvlJc w:val="left"/>
+      <w:pPr>
+        <w:tabs>
+          <w:tab w:val="num" w:pos="5040"/>
+        </w:tabs>
+        <w:ind w:left="5040" w:hanging="360"/>
+      </w:pPr>
+      <w:rPr>
+        <w:rFonts w:ascii="Symbol" w:hAnsi="Symbol" w:hint="default"/>
+        <w:sz w:val="20"/>
+      </w:rPr>
+    </w:lvl>
+    <w:lvl w:ilvl="7" w:tentative="1">
+      <w:start w:val="1"/>
+      <w:numFmt w:val="bullet"/>
+      <w:lvlText w:val=""/>
+      <w:lvlJc w:val="left"/>
+      <w:pPr>
+        <w:tabs>
+          <w:tab w:val="num" w:pos="5760"/>
+        </w:tabs>
+        <w:ind w:left="5760" w:hanging="360"/>
+      </w:pPr>
+      <w:rPr>
+        <w:rFonts w:ascii="Symbol" w:hAnsi="Symbol" w:hint="default"/>
+        <w:sz w:val="20"/>
+      </w:rPr>
+    </w:lvl>
+    <w:lvl w:ilvl="8" w:tentative="1">
+      <w:start w:val="1"/>
+      <w:numFmt w:val="bullet"/>
+      <w:lvlText w:val=""/>
+      <w:lvlJc w:val="left"/>
+      <w:pPr>
+        <w:tabs>
+          <w:tab w:val="num" w:pos="6480"/>
+        </w:tabs>
+        <w:ind w:left="6480" w:hanging="360"/>
+      </w:pPr>
+      <w:rPr>
+        <w:rFonts w:ascii="Symbol" w:hAnsi="Symbol" w:hint="default"/>
+        <w:sz w:val="20"/>
+      </w:rPr>
+    </w:lvl>
+  </w:abstractNum>
+  <w:abstractNum w:abstractNumId="8" w15:restartNumberingAfterBreak="0">
     <w:nsid w:val="2ABC17D2"/>
     <w:multiLevelType w:val="hybridMultilevel"/>
     <w:tmpl w:val="F356CCEE"/>
@@ -10369,7 +12142,644 @@
       </w:rPr>
     </w:lvl>
   </w:abstractNum>
-  <w:abstractNum w:abstractNumId="3" w15:restartNumberingAfterBreak="0">
+  <w:abstractNum w:abstractNumId="9" w15:restartNumberingAfterBreak="0">
+    <w:nsid w:val="2B174070"/>
+    <w:multiLevelType w:val="hybridMultilevel"/>
+    <w:tmpl w:val="B122D1B0"/>
+    <w:lvl w:ilvl="0" w:tplc="04160001">
+      <w:start w:val="1"/>
+      <w:numFmt w:val="bullet"/>
+      <w:lvlText w:val=""/>
+      <w:lvlJc w:val="left"/>
+      <w:pPr>
+        <w:ind w:left="705" w:hanging="360"/>
+      </w:pPr>
+      <w:rPr>
+        <w:rFonts w:ascii="Symbol" w:hAnsi="Symbol" w:hint="default"/>
+      </w:rPr>
+    </w:lvl>
+    <w:lvl w:ilvl="1" w:tplc="04160003" w:tentative="1">
+      <w:start w:val="1"/>
+      <w:numFmt w:val="bullet"/>
+      <w:lvlText w:val="o"/>
+      <w:lvlJc w:val="left"/>
+      <w:pPr>
+        <w:ind w:left="1425" w:hanging="360"/>
+      </w:pPr>
+      <w:rPr>
+        <w:rFonts w:ascii="Courier New" w:hAnsi="Courier New" w:cs="Courier New" w:hint="default"/>
+      </w:rPr>
+    </w:lvl>
+    <w:lvl w:ilvl="2" w:tplc="04160005" w:tentative="1">
+      <w:start w:val="1"/>
+      <w:numFmt w:val="bullet"/>
+      <w:lvlText w:val=""/>
+      <w:lvlJc w:val="left"/>
+      <w:pPr>
+        <w:ind w:left="2145" w:hanging="360"/>
+      </w:pPr>
+      <w:rPr>
+        <w:rFonts w:ascii="Wingdings" w:hAnsi="Wingdings" w:hint="default"/>
+      </w:rPr>
+    </w:lvl>
+    <w:lvl w:ilvl="3" w:tplc="04160001" w:tentative="1">
+      <w:start w:val="1"/>
+      <w:numFmt w:val="bullet"/>
+      <w:lvlText w:val=""/>
+      <w:lvlJc w:val="left"/>
+      <w:pPr>
+        <w:ind w:left="2865" w:hanging="360"/>
+      </w:pPr>
+      <w:rPr>
+        <w:rFonts w:ascii="Symbol" w:hAnsi="Symbol" w:hint="default"/>
+      </w:rPr>
+    </w:lvl>
+    <w:lvl w:ilvl="4" w:tplc="04160003" w:tentative="1">
+      <w:start w:val="1"/>
+      <w:numFmt w:val="bullet"/>
+      <w:lvlText w:val="o"/>
+      <w:lvlJc w:val="left"/>
+      <w:pPr>
+        <w:ind w:left="3585" w:hanging="360"/>
+      </w:pPr>
+      <w:rPr>
+        <w:rFonts w:ascii="Courier New" w:hAnsi="Courier New" w:cs="Courier New" w:hint="default"/>
+      </w:rPr>
+    </w:lvl>
+    <w:lvl w:ilvl="5" w:tplc="04160005" w:tentative="1">
+      <w:start w:val="1"/>
+      <w:numFmt w:val="bullet"/>
+      <w:lvlText w:val=""/>
+      <w:lvlJc w:val="left"/>
+      <w:pPr>
+        <w:ind w:left="4305" w:hanging="360"/>
+      </w:pPr>
+      <w:rPr>
+        <w:rFonts w:ascii="Wingdings" w:hAnsi="Wingdings" w:hint="default"/>
+      </w:rPr>
+    </w:lvl>
+    <w:lvl w:ilvl="6" w:tplc="04160001" w:tentative="1">
+      <w:start w:val="1"/>
+      <w:numFmt w:val="bullet"/>
+      <w:lvlText w:val=""/>
+      <w:lvlJc w:val="left"/>
+      <w:pPr>
+        <w:ind w:left="5025" w:hanging="360"/>
+      </w:pPr>
+      <w:rPr>
+        <w:rFonts w:ascii="Symbol" w:hAnsi="Symbol" w:hint="default"/>
+      </w:rPr>
+    </w:lvl>
+    <w:lvl w:ilvl="7" w:tplc="04160003" w:tentative="1">
+      <w:start w:val="1"/>
+      <w:numFmt w:val="bullet"/>
+      <w:lvlText w:val="o"/>
+      <w:lvlJc w:val="left"/>
+      <w:pPr>
+        <w:ind w:left="5745" w:hanging="360"/>
+      </w:pPr>
+      <w:rPr>
+        <w:rFonts w:ascii="Courier New" w:hAnsi="Courier New" w:cs="Courier New" w:hint="default"/>
+      </w:rPr>
+    </w:lvl>
+    <w:lvl w:ilvl="8" w:tplc="04160005" w:tentative="1">
+      <w:start w:val="1"/>
+      <w:numFmt w:val="bullet"/>
+      <w:lvlText w:val=""/>
+      <w:lvlJc w:val="left"/>
+      <w:pPr>
+        <w:ind w:left="6465" w:hanging="360"/>
+      </w:pPr>
+      <w:rPr>
+        <w:rFonts w:ascii="Wingdings" w:hAnsi="Wingdings" w:hint="default"/>
+      </w:rPr>
+    </w:lvl>
+  </w:abstractNum>
+  <w:abstractNum w:abstractNumId="10" w15:restartNumberingAfterBreak="0">
+    <w:nsid w:val="2E826CB4"/>
+    <w:multiLevelType w:val="multilevel"/>
+    <w:tmpl w:val="0588B430"/>
+    <w:lvl w:ilvl="0">
+      <w:start w:val="1"/>
+      <w:numFmt w:val="bullet"/>
+      <w:lvlText w:val=""/>
+      <w:lvlJc w:val="left"/>
+      <w:pPr>
+        <w:tabs>
+          <w:tab w:val="num" w:pos="720"/>
+        </w:tabs>
+        <w:ind w:left="720" w:hanging="360"/>
+      </w:pPr>
+      <w:rPr>
+        <w:rFonts w:ascii="Symbol" w:hAnsi="Symbol" w:hint="default"/>
+        <w:sz w:val="20"/>
+      </w:rPr>
+    </w:lvl>
+    <w:lvl w:ilvl="1" w:tentative="1">
+      <w:start w:val="1"/>
+      <w:numFmt w:val="bullet"/>
+      <w:lvlText w:val=""/>
+      <w:lvlJc w:val="left"/>
+      <w:pPr>
+        <w:tabs>
+          <w:tab w:val="num" w:pos="1440"/>
+        </w:tabs>
+        <w:ind w:left="1440" w:hanging="360"/>
+      </w:pPr>
+      <w:rPr>
+        <w:rFonts w:ascii="Symbol" w:hAnsi="Symbol" w:hint="default"/>
+        <w:sz w:val="20"/>
+      </w:rPr>
+    </w:lvl>
+    <w:lvl w:ilvl="2" w:tentative="1">
+      <w:start w:val="1"/>
+      <w:numFmt w:val="bullet"/>
+      <w:lvlText w:val=""/>
+      <w:lvlJc w:val="left"/>
+      <w:pPr>
+        <w:tabs>
+          <w:tab w:val="num" w:pos="2160"/>
+        </w:tabs>
+        <w:ind w:left="2160" w:hanging="360"/>
+      </w:pPr>
+      <w:rPr>
+        <w:rFonts w:ascii="Symbol" w:hAnsi="Symbol" w:hint="default"/>
+        <w:sz w:val="20"/>
+      </w:rPr>
+    </w:lvl>
+    <w:lvl w:ilvl="3" w:tentative="1">
+      <w:start w:val="1"/>
+      <w:numFmt w:val="bullet"/>
+      <w:lvlText w:val=""/>
+      <w:lvlJc w:val="left"/>
+      <w:pPr>
+        <w:tabs>
+          <w:tab w:val="num" w:pos="2880"/>
+        </w:tabs>
+        <w:ind w:left="2880" w:hanging="360"/>
+      </w:pPr>
+      <w:rPr>
+        <w:rFonts w:ascii="Symbol" w:hAnsi="Symbol" w:hint="default"/>
+        <w:sz w:val="20"/>
+      </w:rPr>
+    </w:lvl>
+    <w:lvl w:ilvl="4" w:tentative="1">
+      <w:start w:val="1"/>
+      <w:numFmt w:val="bullet"/>
+      <w:lvlText w:val=""/>
+      <w:lvlJc w:val="left"/>
+      <w:pPr>
+        <w:tabs>
+          <w:tab w:val="num" w:pos="3600"/>
+        </w:tabs>
+        <w:ind w:left="3600" w:hanging="360"/>
+      </w:pPr>
+      <w:rPr>
+        <w:rFonts w:ascii="Symbol" w:hAnsi="Symbol" w:hint="default"/>
+        <w:sz w:val="20"/>
+      </w:rPr>
+    </w:lvl>
+    <w:lvl w:ilvl="5" w:tentative="1">
+      <w:start w:val="1"/>
+      <w:numFmt w:val="bullet"/>
+      <w:lvlText w:val=""/>
+      <w:lvlJc w:val="left"/>
+      <w:pPr>
+        <w:tabs>
+          <w:tab w:val="num" w:pos="4320"/>
+        </w:tabs>
+        <w:ind w:left="4320" w:hanging="360"/>
+      </w:pPr>
+      <w:rPr>
+        <w:rFonts w:ascii="Symbol" w:hAnsi="Symbol" w:hint="default"/>
+        <w:sz w:val="20"/>
+      </w:rPr>
+    </w:lvl>
+    <w:lvl w:ilvl="6" w:tentative="1">
+      <w:start w:val="1"/>
+      <w:numFmt w:val="bullet"/>
+      <w:lvlText w:val=""/>
+      <w:lvlJc w:val="left"/>
+      <w:pPr>
+        <w:tabs>
+          <w:tab w:val="num" w:pos="5040"/>
+        </w:tabs>
+        <w:ind w:left="5040" w:hanging="360"/>
+      </w:pPr>
+      <w:rPr>
+        <w:rFonts w:ascii="Symbol" w:hAnsi="Symbol" w:hint="default"/>
+        <w:sz w:val="20"/>
+      </w:rPr>
+    </w:lvl>
+    <w:lvl w:ilvl="7" w:tentative="1">
+      <w:start w:val="1"/>
+      <w:numFmt w:val="bullet"/>
+      <w:lvlText w:val=""/>
+      <w:lvlJc w:val="left"/>
+      <w:pPr>
+        <w:tabs>
+          <w:tab w:val="num" w:pos="5760"/>
+        </w:tabs>
+        <w:ind w:left="5760" w:hanging="360"/>
+      </w:pPr>
+      <w:rPr>
+        <w:rFonts w:ascii="Symbol" w:hAnsi="Symbol" w:hint="default"/>
+        <w:sz w:val="20"/>
+      </w:rPr>
+    </w:lvl>
+    <w:lvl w:ilvl="8" w:tentative="1">
+      <w:start w:val="1"/>
+      <w:numFmt w:val="bullet"/>
+      <w:lvlText w:val=""/>
+      <w:lvlJc w:val="left"/>
+      <w:pPr>
+        <w:tabs>
+          <w:tab w:val="num" w:pos="6480"/>
+        </w:tabs>
+        <w:ind w:left="6480" w:hanging="360"/>
+      </w:pPr>
+      <w:rPr>
+        <w:rFonts w:ascii="Symbol" w:hAnsi="Symbol" w:hint="default"/>
+        <w:sz w:val="20"/>
+      </w:rPr>
+    </w:lvl>
+  </w:abstractNum>
+  <w:abstractNum w:abstractNumId="11" w15:restartNumberingAfterBreak="0">
+    <w:nsid w:val="2F91012E"/>
+    <w:multiLevelType w:val="hybridMultilevel"/>
+    <w:tmpl w:val="FE26BAEE"/>
+    <w:lvl w:ilvl="0" w:tplc="04160001">
+      <w:start w:val="1"/>
+      <w:numFmt w:val="bullet"/>
+      <w:lvlText w:val=""/>
+      <w:lvlJc w:val="left"/>
+      <w:pPr>
+        <w:ind w:left="705" w:hanging="360"/>
+      </w:pPr>
+      <w:rPr>
+        <w:rFonts w:ascii="Symbol" w:hAnsi="Symbol" w:hint="default"/>
+      </w:rPr>
+    </w:lvl>
+    <w:lvl w:ilvl="1" w:tplc="04160003" w:tentative="1">
+      <w:start w:val="1"/>
+      <w:numFmt w:val="bullet"/>
+      <w:lvlText w:val="o"/>
+      <w:lvlJc w:val="left"/>
+      <w:pPr>
+        <w:ind w:left="1425" w:hanging="360"/>
+      </w:pPr>
+      <w:rPr>
+        <w:rFonts w:ascii="Courier New" w:hAnsi="Courier New" w:cs="Courier New" w:hint="default"/>
+      </w:rPr>
+    </w:lvl>
+    <w:lvl w:ilvl="2" w:tplc="04160005" w:tentative="1">
+      <w:start w:val="1"/>
+      <w:numFmt w:val="bullet"/>
+      <w:lvlText w:val=""/>
+      <w:lvlJc w:val="left"/>
+      <w:pPr>
+        <w:ind w:left="2145" w:hanging="360"/>
+      </w:pPr>
+      <w:rPr>
+        <w:rFonts w:ascii="Wingdings" w:hAnsi="Wingdings" w:hint="default"/>
+      </w:rPr>
+    </w:lvl>
+    <w:lvl w:ilvl="3" w:tplc="04160001" w:tentative="1">
+      <w:start w:val="1"/>
+      <w:numFmt w:val="bullet"/>
+      <w:lvlText w:val=""/>
+      <w:lvlJc w:val="left"/>
+      <w:pPr>
+        <w:ind w:left="2865" w:hanging="360"/>
+      </w:pPr>
+      <w:rPr>
+        <w:rFonts w:ascii="Symbol" w:hAnsi="Symbol" w:hint="default"/>
+      </w:rPr>
+    </w:lvl>
+    <w:lvl w:ilvl="4" w:tplc="04160003" w:tentative="1">
+      <w:start w:val="1"/>
+      <w:numFmt w:val="bullet"/>
+      <w:lvlText w:val="o"/>
+      <w:lvlJc w:val="left"/>
+      <w:pPr>
+        <w:ind w:left="3585" w:hanging="360"/>
+      </w:pPr>
+      <w:rPr>
+        <w:rFonts w:ascii="Courier New" w:hAnsi="Courier New" w:cs="Courier New" w:hint="default"/>
+      </w:rPr>
+    </w:lvl>
+    <w:lvl w:ilvl="5" w:tplc="04160005" w:tentative="1">
+      <w:start w:val="1"/>
+      <w:numFmt w:val="bullet"/>
+      <w:lvlText w:val=""/>
+      <w:lvlJc w:val="left"/>
+      <w:pPr>
+        <w:ind w:left="4305" w:hanging="360"/>
+      </w:pPr>
+      <w:rPr>
+        <w:rFonts w:ascii="Wingdings" w:hAnsi="Wingdings" w:hint="default"/>
+      </w:rPr>
+    </w:lvl>
+    <w:lvl w:ilvl="6" w:tplc="04160001" w:tentative="1">
+      <w:start w:val="1"/>
+      <w:numFmt w:val="bullet"/>
+      <w:lvlText w:val=""/>
+      <w:lvlJc w:val="left"/>
+      <w:pPr>
+        <w:ind w:left="5025" w:hanging="360"/>
+      </w:pPr>
+      <w:rPr>
+        <w:rFonts w:ascii="Symbol" w:hAnsi="Symbol" w:hint="default"/>
+      </w:rPr>
+    </w:lvl>
+    <w:lvl w:ilvl="7" w:tplc="04160003" w:tentative="1">
+      <w:start w:val="1"/>
+      <w:numFmt w:val="bullet"/>
+      <w:lvlText w:val="o"/>
+      <w:lvlJc w:val="left"/>
+      <w:pPr>
+        <w:ind w:left="5745" w:hanging="360"/>
+      </w:pPr>
+      <w:rPr>
+        <w:rFonts w:ascii="Courier New" w:hAnsi="Courier New" w:cs="Courier New" w:hint="default"/>
+      </w:rPr>
+    </w:lvl>
+    <w:lvl w:ilvl="8" w:tplc="04160005" w:tentative="1">
+      <w:start w:val="1"/>
+      <w:numFmt w:val="bullet"/>
+      <w:lvlText w:val=""/>
+      <w:lvlJc w:val="left"/>
+      <w:pPr>
+        <w:ind w:left="6465" w:hanging="360"/>
+      </w:pPr>
+      <w:rPr>
+        <w:rFonts w:ascii="Wingdings" w:hAnsi="Wingdings" w:hint="default"/>
+      </w:rPr>
+    </w:lvl>
+  </w:abstractNum>
+  <w:abstractNum w:abstractNumId="12" w15:restartNumberingAfterBreak="0">
+    <w:nsid w:val="34445108"/>
+    <w:multiLevelType w:val="hybridMultilevel"/>
+    <w:tmpl w:val="C56E93FE"/>
+    <w:lvl w:ilvl="0" w:tplc="04160001">
+      <w:start w:val="1"/>
+      <w:numFmt w:val="bullet"/>
+      <w:lvlText w:val=""/>
+      <w:lvlJc w:val="left"/>
+      <w:pPr>
+        <w:ind w:left="705" w:hanging="360"/>
+      </w:pPr>
+      <w:rPr>
+        <w:rFonts w:ascii="Symbol" w:hAnsi="Symbol" w:hint="default"/>
+      </w:rPr>
+    </w:lvl>
+    <w:lvl w:ilvl="1" w:tplc="04160003" w:tentative="1">
+      <w:start w:val="1"/>
+      <w:numFmt w:val="bullet"/>
+      <w:lvlText w:val="o"/>
+      <w:lvlJc w:val="left"/>
+      <w:pPr>
+        <w:ind w:left="1425" w:hanging="360"/>
+      </w:pPr>
+      <w:rPr>
+        <w:rFonts w:ascii="Courier New" w:hAnsi="Courier New" w:cs="Courier New" w:hint="default"/>
+      </w:rPr>
+    </w:lvl>
+    <w:lvl w:ilvl="2" w:tplc="04160005" w:tentative="1">
+      <w:start w:val="1"/>
+      <w:numFmt w:val="bullet"/>
+      <w:lvlText w:val=""/>
+      <w:lvlJc w:val="left"/>
+      <w:pPr>
+        <w:ind w:left="2145" w:hanging="360"/>
+      </w:pPr>
+      <w:rPr>
+        <w:rFonts w:ascii="Wingdings" w:hAnsi="Wingdings" w:hint="default"/>
+      </w:rPr>
+    </w:lvl>
+    <w:lvl w:ilvl="3" w:tplc="04160001" w:tentative="1">
+      <w:start w:val="1"/>
+      <w:numFmt w:val="bullet"/>
+      <w:lvlText w:val=""/>
+      <w:lvlJc w:val="left"/>
+      <w:pPr>
+        <w:ind w:left="2865" w:hanging="360"/>
+      </w:pPr>
+      <w:rPr>
+        <w:rFonts w:ascii="Symbol" w:hAnsi="Symbol" w:hint="default"/>
+      </w:rPr>
+    </w:lvl>
+    <w:lvl w:ilvl="4" w:tplc="04160003" w:tentative="1">
+      <w:start w:val="1"/>
+      <w:numFmt w:val="bullet"/>
+      <w:lvlText w:val="o"/>
+      <w:lvlJc w:val="left"/>
+      <w:pPr>
+        <w:ind w:left="3585" w:hanging="360"/>
+      </w:pPr>
+      <w:rPr>
+        <w:rFonts w:ascii="Courier New" w:hAnsi="Courier New" w:cs="Courier New" w:hint="default"/>
+      </w:rPr>
+    </w:lvl>
+    <w:lvl w:ilvl="5" w:tplc="04160005" w:tentative="1">
+      <w:start w:val="1"/>
+      <w:numFmt w:val="bullet"/>
+      <w:lvlText w:val=""/>
+      <w:lvlJc w:val="left"/>
+      <w:pPr>
+        <w:ind w:left="4305" w:hanging="360"/>
+      </w:pPr>
+      <w:rPr>
+        <w:rFonts w:ascii="Wingdings" w:hAnsi="Wingdings" w:hint="default"/>
+      </w:rPr>
+    </w:lvl>
+    <w:lvl w:ilvl="6" w:tplc="04160001" w:tentative="1">
+      <w:start w:val="1"/>
+      <w:numFmt w:val="bullet"/>
+      <w:lvlText w:val=""/>
+      <w:lvlJc w:val="left"/>
+      <w:pPr>
+        <w:ind w:left="5025" w:hanging="360"/>
+      </w:pPr>
+      <w:rPr>
+        <w:rFonts w:ascii="Symbol" w:hAnsi="Symbol" w:hint="default"/>
+      </w:rPr>
+    </w:lvl>
+    <w:lvl w:ilvl="7" w:tplc="04160003" w:tentative="1">
+      <w:start w:val="1"/>
+      <w:numFmt w:val="bullet"/>
+      <w:lvlText w:val="o"/>
+      <w:lvlJc w:val="left"/>
+      <w:pPr>
+        <w:ind w:left="5745" w:hanging="360"/>
+      </w:pPr>
+      <w:rPr>
+        <w:rFonts w:ascii="Courier New" w:hAnsi="Courier New" w:cs="Courier New" w:hint="default"/>
+      </w:rPr>
+    </w:lvl>
+    <w:lvl w:ilvl="8" w:tplc="04160005" w:tentative="1">
+      <w:start w:val="1"/>
+      <w:numFmt w:val="bullet"/>
+      <w:lvlText w:val=""/>
+      <w:lvlJc w:val="left"/>
+      <w:pPr>
+        <w:ind w:left="6465" w:hanging="360"/>
+      </w:pPr>
+      <w:rPr>
+        <w:rFonts w:ascii="Wingdings" w:hAnsi="Wingdings" w:hint="default"/>
+      </w:rPr>
+    </w:lvl>
+  </w:abstractNum>
+  <w:abstractNum w:abstractNumId="13" w15:restartNumberingAfterBreak="0">
+    <w:nsid w:val="347E7EEF"/>
+    <w:multiLevelType w:val="multilevel"/>
+    <w:tmpl w:val="BC741F5A"/>
+    <w:lvl w:ilvl="0">
+      <w:start w:val="1"/>
+      <w:numFmt w:val="bullet"/>
+      <w:lvlText w:val=""/>
+      <w:lvlJc w:val="left"/>
+      <w:pPr>
+        <w:tabs>
+          <w:tab w:val="num" w:pos="720"/>
+        </w:tabs>
+        <w:ind w:left="720" w:hanging="360"/>
+      </w:pPr>
+      <w:rPr>
+        <w:rFonts w:ascii="Symbol" w:hAnsi="Symbol" w:hint="default"/>
+        <w:sz w:val="20"/>
+      </w:rPr>
+    </w:lvl>
+    <w:lvl w:ilvl="1" w:tentative="1">
+      <w:start w:val="1"/>
+      <w:numFmt w:val="bullet"/>
+      <w:lvlText w:val=""/>
+      <w:lvlJc w:val="left"/>
+      <w:pPr>
+        <w:tabs>
+          <w:tab w:val="num" w:pos="1440"/>
+        </w:tabs>
+        <w:ind w:left="1440" w:hanging="360"/>
+      </w:pPr>
+      <w:rPr>
+        <w:rFonts w:ascii="Symbol" w:hAnsi="Symbol" w:hint="default"/>
+        <w:sz w:val="20"/>
+      </w:rPr>
+    </w:lvl>
+    <w:lvl w:ilvl="2" w:tentative="1">
+      <w:start w:val="1"/>
+      <w:numFmt w:val="bullet"/>
+      <w:lvlText w:val=""/>
+      <w:lvlJc w:val="left"/>
+      <w:pPr>
+        <w:tabs>
+          <w:tab w:val="num" w:pos="2160"/>
+        </w:tabs>
+        <w:ind w:left="2160" w:hanging="360"/>
+      </w:pPr>
+      <w:rPr>
+        <w:rFonts w:ascii="Symbol" w:hAnsi="Symbol" w:hint="default"/>
+        <w:sz w:val="20"/>
+      </w:rPr>
+    </w:lvl>
+    <w:lvl w:ilvl="3" w:tentative="1">
+      <w:start w:val="1"/>
+      <w:numFmt w:val="bullet"/>
+      <w:lvlText w:val=""/>
+      <w:lvlJc w:val="left"/>
+      <w:pPr>
+        <w:tabs>
+          <w:tab w:val="num" w:pos="2880"/>
+        </w:tabs>
+        <w:ind w:left="2880" w:hanging="360"/>
+      </w:pPr>
+      <w:rPr>
+        <w:rFonts w:ascii="Symbol" w:hAnsi="Symbol" w:hint="default"/>
+        <w:sz w:val="20"/>
+      </w:rPr>
+    </w:lvl>
+    <w:lvl w:ilvl="4" w:tentative="1">
+      <w:start w:val="1"/>
+      <w:numFmt w:val="bullet"/>
+      <w:lvlText w:val=""/>
+      <w:lvlJc w:val="left"/>
+      <w:pPr>
+        <w:tabs>
+          <w:tab w:val="num" w:pos="3600"/>
+        </w:tabs>
+        <w:ind w:left="3600" w:hanging="360"/>
+      </w:pPr>
+      <w:rPr>
+        <w:rFonts w:ascii="Symbol" w:hAnsi="Symbol" w:hint="default"/>
+        <w:sz w:val="20"/>
+      </w:rPr>
+    </w:lvl>
+    <w:lvl w:ilvl="5" w:tentative="1">
+      <w:start w:val="1"/>
+      <w:numFmt w:val="bullet"/>
+      <w:lvlText w:val=""/>
+      <w:lvlJc w:val="left"/>
+      <w:pPr>
+        <w:tabs>
+          <w:tab w:val="num" w:pos="4320"/>
+        </w:tabs>
+        <w:ind w:left="4320" w:hanging="360"/>
+      </w:pPr>
+      <w:rPr>
+        <w:rFonts w:ascii="Symbol" w:hAnsi="Symbol" w:hint="default"/>
+        <w:sz w:val="20"/>
+      </w:rPr>
+    </w:lvl>
+    <w:lvl w:ilvl="6" w:tentative="1">
+      <w:start w:val="1"/>
+      <w:numFmt w:val="bullet"/>
+      <w:lvlText w:val=""/>
+      <w:lvlJc w:val="left"/>
+      <w:pPr>
+        <w:tabs>
+          <w:tab w:val="num" w:pos="5040"/>
+        </w:tabs>
+        <w:ind w:left="5040" w:hanging="360"/>
+      </w:pPr>
+      <w:rPr>
+        <w:rFonts w:ascii="Symbol" w:hAnsi="Symbol" w:hint="default"/>
+        <w:sz w:val="20"/>
+      </w:rPr>
+    </w:lvl>
+    <w:lvl w:ilvl="7" w:tentative="1">
+      <w:start w:val="1"/>
+      <w:numFmt w:val="bullet"/>
+      <w:lvlText w:val=""/>
+      <w:lvlJc w:val="left"/>
+      <w:pPr>
+        <w:tabs>
+          <w:tab w:val="num" w:pos="5760"/>
+        </w:tabs>
+        <w:ind w:left="5760" w:hanging="360"/>
+      </w:pPr>
+      <w:rPr>
+        <w:rFonts w:ascii="Symbol" w:hAnsi="Symbol" w:hint="default"/>
+        <w:sz w:val="20"/>
+      </w:rPr>
+    </w:lvl>
+    <w:lvl w:ilvl="8" w:tentative="1">
+      <w:start w:val="1"/>
+      <w:numFmt w:val="bullet"/>
+      <w:lvlText w:val=""/>
+      <w:lvlJc w:val="left"/>
+      <w:pPr>
+        <w:tabs>
+          <w:tab w:val="num" w:pos="6480"/>
+        </w:tabs>
+        <w:ind w:left="6480" w:hanging="360"/>
+      </w:pPr>
+      <w:rPr>
+        <w:rFonts w:ascii="Symbol" w:hAnsi="Symbol" w:hint="default"/>
+        <w:sz w:val="20"/>
+      </w:rPr>
+    </w:lvl>
+  </w:abstractNum>
+  <w:abstractNum w:abstractNumId="14" w15:restartNumberingAfterBreak="0">
     <w:nsid w:val="41B72AB0"/>
     <w:multiLevelType w:val="hybridMultilevel"/>
     <w:tmpl w:val="90E66790"/>
@@ -10482,7 +12892,7 @@
       </w:rPr>
     </w:lvl>
   </w:abstractNum>
-  <w:abstractNum w:abstractNumId="4" w15:restartNumberingAfterBreak="0">
+  <w:abstractNum w:abstractNumId="15" w15:restartNumberingAfterBreak="0">
     <w:nsid w:val="46053BFE"/>
     <w:multiLevelType w:val="hybridMultilevel"/>
     <w:tmpl w:val="5576F144"/>
@@ -10595,7 +13005,418 @@
       </w:rPr>
     </w:lvl>
   </w:abstractNum>
-  <w:abstractNum w:abstractNumId="5" w15:restartNumberingAfterBreak="0">
+  <w:abstractNum w:abstractNumId="16" w15:restartNumberingAfterBreak="0">
+    <w:nsid w:val="4CA35111"/>
+    <w:multiLevelType w:val="hybridMultilevel"/>
+    <w:tmpl w:val="83946DC2"/>
+    <w:lvl w:ilvl="0" w:tplc="04160001">
+      <w:start w:val="1"/>
+      <w:numFmt w:val="bullet"/>
+      <w:lvlText w:val=""/>
+      <w:lvlJc w:val="left"/>
+      <w:pPr>
+        <w:ind w:left="705" w:hanging="360"/>
+      </w:pPr>
+      <w:rPr>
+        <w:rFonts w:ascii="Symbol" w:hAnsi="Symbol" w:hint="default"/>
+      </w:rPr>
+    </w:lvl>
+    <w:lvl w:ilvl="1" w:tplc="04160003" w:tentative="1">
+      <w:start w:val="1"/>
+      <w:numFmt w:val="bullet"/>
+      <w:lvlText w:val="o"/>
+      <w:lvlJc w:val="left"/>
+      <w:pPr>
+        <w:ind w:left="1425" w:hanging="360"/>
+      </w:pPr>
+      <w:rPr>
+        <w:rFonts w:ascii="Courier New" w:hAnsi="Courier New" w:cs="Courier New" w:hint="default"/>
+      </w:rPr>
+    </w:lvl>
+    <w:lvl w:ilvl="2" w:tplc="04160005" w:tentative="1">
+      <w:start w:val="1"/>
+      <w:numFmt w:val="bullet"/>
+      <w:lvlText w:val=""/>
+      <w:lvlJc w:val="left"/>
+      <w:pPr>
+        <w:ind w:left="2145" w:hanging="360"/>
+      </w:pPr>
+      <w:rPr>
+        <w:rFonts w:ascii="Wingdings" w:hAnsi="Wingdings" w:hint="default"/>
+      </w:rPr>
+    </w:lvl>
+    <w:lvl w:ilvl="3" w:tplc="04160001" w:tentative="1">
+      <w:start w:val="1"/>
+      <w:numFmt w:val="bullet"/>
+      <w:lvlText w:val=""/>
+      <w:lvlJc w:val="left"/>
+      <w:pPr>
+        <w:ind w:left="2865" w:hanging="360"/>
+      </w:pPr>
+      <w:rPr>
+        <w:rFonts w:ascii="Symbol" w:hAnsi="Symbol" w:hint="default"/>
+      </w:rPr>
+    </w:lvl>
+    <w:lvl w:ilvl="4" w:tplc="04160003" w:tentative="1">
+      <w:start w:val="1"/>
+      <w:numFmt w:val="bullet"/>
+      <w:lvlText w:val="o"/>
+      <w:lvlJc w:val="left"/>
+      <w:pPr>
+        <w:ind w:left="3585" w:hanging="360"/>
+      </w:pPr>
+      <w:rPr>
+        <w:rFonts w:ascii="Courier New" w:hAnsi="Courier New" w:cs="Courier New" w:hint="default"/>
+      </w:rPr>
+    </w:lvl>
+    <w:lvl w:ilvl="5" w:tplc="04160005" w:tentative="1">
+      <w:start w:val="1"/>
+      <w:numFmt w:val="bullet"/>
+      <w:lvlText w:val=""/>
+      <w:lvlJc w:val="left"/>
+      <w:pPr>
+        <w:ind w:left="4305" w:hanging="360"/>
+      </w:pPr>
+      <w:rPr>
+        <w:rFonts w:ascii="Wingdings" w:hAnsi="Wingdings" w:hint="default"/>
+      </w:rPr>
+    </w:lvl>
+    <w:lvl w:ilvl="6" w:tplc="04160001" w:tentative="1">
+      <w:start w:val="1"/>
+      <w:numFmt w:val="bullet"/>
+      <w:lvlText w:val=""/>
+      <w:lvlJc w:val="left"/>
+      <w:pPr>
+        <w:ind w:left="5025" w:hanging="360"/>
+      </w:pPr>
+      <w:rPr>
+        <w:rFonts w:ascii="Symbol" w:hAnsi="Symbol" w:hint="default"/>
+      </w:rPr>
+    </w:lvl>
+    <w:lvl w:ilvl="7" w:tplc="04160003" w:tentative="1">
+      <w:start w:val="1"/>
+      <w:numFmt w:val="bullet"/>
+      <w:lvlText w:val="o"/>
+      <w:lvlJc w:val="left"/>
+      <w:pPr>
+        <w:ind w:left="5745" w:hanging="360"/>
+      </w:pPr>
+      <w:rPr>
+        <w:rFonts w:ascii="Courier New" w:hAnsi="Courier New" w:cs="Courier New" w:hint="default"/>
+      </w:rPr>
+    </w:lvl>
+    <w:lvl w:ilvl="8" w:tplc="04160005" w:tentative="1">
+      <w:start w:val="1"/>
+      <w:numFmt w:val="bullet"/>
+      <w:lvlText w:val=""/>
+      <w:lvlJc w:val="left"/>
+      <w:pPr>
+        <w:ind w:left="6465" w:hanging="360"/>
+      </w:pPr>
+      <w:rPr>
+        <w:rFonts w:ascii="Wingdings" w:hAnsi="Wingdings" w:hint="default"/>
+      </w:rPr>
+    </w:lvl>
+  </w:abstractNum>
+  <w:abstractNum w:abstractNumId="17" w15:restartNumberingAfterBreak="0">
+    <w:nsid w:val="57CB4E00"/>
+    <w:multiLevelType w:val="multilevel"/>
+    <w:tmpl w:val="1302B86E"/>
+    <w:lvl w:ilvl="0">
+      <w:start w:val="1"/>
+      <w:numFmt w:val="bullet"/>
+      <w:lvlText w:val=""/>
+      <w:lvlJc w:val="left"/>
+      <w:pPr>
+        <w:tabs>
+          <w:tab w:val="num" w:pos="720"/>
+        </w:tabs>
+        <w:ind w:left="720" w:hanging="360"/>
+      </w:pPr>
+      <w:rPr>
+        <w:rFonts w:ascii="Symbol" w:hAnsi="Symbol" w:hint="default"/>
+        <w:sz w:val="20"/>
+      </w:rPr>
+    </w:lvl>
+    <w:lvl w:ilvl="1" w:tentative="1">
+      <w:start w:val="1"/>
+      <w:numFmt w:val="bullet"/>
+      <w:lvlText w:val=""/>
+      <w:lvlJc w:val="left"/>
+      <w:pPr>
+        <w:tabs>
+          <w:tab w:val="num" w:pos="1440"/>
+        </w:tabs>
+        <w:ind w:left="1440" w:hanging="360"/>
+      </w:pPr>
+      <w:rPr>
+        <w:rFonts w:ascii="Symbol" w:hAnsi="Symbol" w:hint="default"/>
+        <w:sz w:val="20"/>
+      </w:rPr>
+    </w:lvl>
+    <w:lvl w:ilvl="2" w:tentative="1">
+      <w:start w:val="1"/>
+      <w:numFmt w:val="bullet"/>
+      <w:lvlText w:val=""/>
+      <w:lvlJc w:val="left"/>
+      <w:pPr>
+        <w:tabs>
+          <w:tab w:val="num" w:pos="2160"/>
+        </w:tabs>
+        <w:ind w:left="2160" w:hanging="360"/>
+      </w:pPr>
+      <w:rPr>
+        <w:rFonts w:ascii="Symbol" w:hAnsi="Symbol" w:hint="default"/>
+        <w:sz w:val="20"/>
+      </w:rPr>
+    </w:lvl>
+    <w:lvl w:ilvl="3" w:tentative="1">
+      <w:start w:val="1"/>
+      <w:numFmt w:val="bullet"/>
+      <w:lvlText w:val=""/>
+      <w:lvlJc w:val="left"/>
+      <w:pPr>
+        <w:tabs>
+          <w:tab w:val="num" w:pos="2880"/>
+        </w:tabs>
+        <w:ind w:left="2880" w:hanging="360"/>
+      </w:pPr>
+      <w:rPr>
+        <w:rFonts w:ascii="Symbol" w:hAnsi="Symbol" w:hint="default"/>
+        <w:sz w:val="20"/>
+      </w:rPr>
+    </w:lvl>
+    <w:lvl w:ilvl="4" w:tentative="1">
+      <w:start w:val="1"/>
+      <w:numFmt w:val="bullet"/>
+      <w:lvlText w:val=""/>
+      <w:lvlJc w:val="left"/>
+      <w:pPr>
+        <w:tabs>
+          <w:tab w:val="num" w:pos="3600"/>
+        </w:tabs>
+        <w:ind w:left="3600" w:hanging="360"/>
+      </w:pPr>
+      <w:rPr>
+        <w:rFonts w:ascii="Symbol" w:hAnsi="Symbol" w:hint="default"/>
+        <w:sz w:val="20"/>
+      </w:rPr>
+    </w:lvl>
+    <w:lvl w:ilvl="5" w:tentative="1">
+      <w:start w:val="1"/>
+      <w:numFmt w:val="bullet"/>
+      <w:lvlText w:val=""/>
+      <w:lvlJc w:val="left"/>
+      <w:pPr>
+        <w:tabs>
+          <w:tab w:val="num" w:pos="4320"/>
+        </w:tabs>
+        <w:ind w:left="4320" w:hanging="360"/>
+      </w:pPr>
+      <w:rPr>
+        <w:rFonts w:ascii="Symbol" w:hAnsi="Symbol" w:hint="default"/>
+        <w:sz w:val="20"/>
+      </w:rPr>
+    </w:lvl>
+    <w:lvl w:ilvl="6" w:tentative="1">
+      <w:start w:val="1"/>
+      <w:numFmt w:val="bullet"/>
+      <w:lvlText w:val=""/>
+      <w:lvlJc w:val="left"/>
+      <w:pPr>
+        <w:tabs>
+          <w:tab w:val="num" w:pos="5040"/>
+        </w:tabs>
+        <w:ind w:left="5040" w:hanging="360"/>
+      </w:pPr>
+      <w:rPr>
+        <w:rFonts w:ascii="Symbol" w:hAnsi="Symbol" w:hint="default"/>
+        <w:sz w:val="20"/>
+      </w:rPr>
+    </w:lvl>
+    <w:lvl w:ilvl="7" w:tentative="1">
+      <w:start w:val="1"/>
+      <w:numFmt w:val="bullet"/>
+      <w:lvlText w:val=""/>
+      <w:lvlJc w:val="left"/>
+      <w:pPr>
+        <w:tabs>
+          <w:tab w:val="num" w:pos="5760"/>
+        </w:tabs>
+        <w:ind w:left="5760" w:hanging="360"/>
+      </w:pPr>
+      <w:rPr>
+        <w:rFonts w:ascii="Symbol" w:hAnsi="Symbol" w:hint="default"/>
+        <w:sz w:val="20"/>
+      </w:rPr>
+    </w:lvl>
+    <w:lvl w:ilvl="8" w:tentative="1">
+      <w:start w:val="1"/>
+      <w:numFmt w:val="bullet"/>
+      <w:lvlText w:val=""/>
+      <w:lvlJc w:val="left"/>
+      <w:pPr>
+        <w:tabs>
+          <w:tab w:val="num" w:pos="6480"/>
+        </w:tabs>
+        <w:ind w:left="6480" w:hanging="360"/>
+      </w:pPr>
+      <w:rPr>
+        <w:rFonts w:ascii="Symbol" w:hAnsi="Symbol" w:hint="default"/>
+        <w:sz w:val="20"/>
+      </w:rPr>
+    </w:lvl>
+  </w:abstractNum>
+  <w:abstractNum w:abstractNumId="18" w15:restartNumberingAfterBreak="0">
+    <w:nsid w:val="58D11FFC"/>
+    <w:multiLevelType w:val="multilevel"/>
+    <w:tmpl w:val="7BB657CE"/>
+    <w:lvl w:ilvl="0">
+      <w:start w:val="1"/>
+      <w:numFmt w:val="bullet"/>
+      <w:lvlText w:val=""/>
+      <w:lvlJc w:val="left"/>
+      <w:pPr>
+        <w:tabs>
+          <w:tab w:val="num" w:pos="720"/>
+        </w:tabs>
+        <w:ind w:left="720" w:hanging="360"/>
+      </w:pPr>
+      <w:rPr>
+        <w:rFonts w:ascii="Symbol" w:hAnsi="Symbol" w:hint="default"/>
+        <w:sz w:val="20"/>
+      </w:rPr>
+    </w:lvl>
+    <w:lvl w:ilvl="1" w:tentative="1">
+      <w:start w:val="1"/>
+      <w:numFmt w:val="bullet"/>
+      <w:lvlText w:val=""/>
+      <w:lvlJc w:val="left"/>
+      <w:pPr>
+        <w:tabs>
+          <w:tab w:val="num" w:pos="1440"/>
+        </w:tabs>
+        <w:ind w:left="1440" w:hanging="360"/>
+      </w:pPr>
+      <w:rPr>
+        <w:rFonts w:ascii="Symbol" w:hAnsi="Symbol" w:hint="default"/>
+        <w:sz w:val="20"/>
+      </w:rPr>
+    </w:lvl>
+    <w:lvl w:ilvl="2" w:tentative="1">
+      <w:start w:val="1"/>
+      <w:numFmt w:val="bullet"/>
+      <w:lvlText w:val=""/>
+      <w:lvlJc w:val="left"/>
+      <w:pPr>
+        <w:tabs>
+          <w:tab w:val="num" w:pos="2160"/>
+        </w:tabs>
+        <w:ind w:left="2160" w:hanging="360"/>
+      </w:pPr>
+      <w:rPr>
+        <w:rFonts w:ascii="Symbol" w:hAnsi="Symbol" w:hint="default"/>
+        <w:sz w:val="20"/>
+      </w:rPr>
+    </w:lvl>
+    <w:lvl w:ilvl="3" w:tentative="1">
+      <w:start w:val="1"/>
+      <w:numFmt w:val="bullet"/>
+      <w:lvlText w:val=""/>
+      <w:lvlJc w:val="left"/>
+      <w:pPr>
+        <w:tabs>
+          <w:tab w:val="num" w:pos="2880"/>
+        </w:tabs>
+        <w:ind w:left="2880" w:hanging="360"/>
+      </w:pPr>
+      <w:rPr>
+        <w:rFonts w:ascii="Symbol" w:hAnsi="Symbol" w:hint="default"/>
+        <w:sz w:val="20"/>
+      </w:rPr>
+    </w:lvl>
+    <w:lvl w:ilvl="4" w:tentative="1">
+      <w:start w:val="1"/>
+      <w:numFmt w:val="bullet"/>
+      <w:lvlText w:val=""/>
+      <w:lvlJc w:val="left"/>
+      <w:pPr>
+        <w:tabs>
+          <w:tab w:val="num" w:pos="3600"/>
+        </w:tabs>
+        <w:ind w:left="3600" w:hanging="360"/>
+      </w:pPr>
+      <w:rPr>
+        <w:rFonts w:ascii="Symbol" w:hAnsi="Symbol" w:hint="default"/>
+        <w:sz w:val="20"/>
+      </w:rPr>
+    </w:lvl>
+    <w:lvl w:ilvl="5" w:tentative="1">
+      <w:start w:val="1"/>
+      <w:numFmt w:val="bullet"/>
+      <w:lvlText w:val=""/>
+      <w:lvlJc w:val="left"/>
+      <w:pPr>
+        <w:tabs>
+          <w:tab w:val="num" w:pos="4320"/>
+        </w:tabs>
+        <w:ind w:left="4320" w:hanging="360"/>
+      </w:pPr>
+      <w:rPr>
+        <w:rFonts w:ascii="Symbol" w:hAnsi="Symbol" w:hint="default"/>
+        <w:sz w:val="20"/>
+      </w:rPr>
+    </w:lvl>
+    <w:lvl w:ilvl="6" w:tentative="1">
+      <w:start w:val="1"/>
+      <w:numFmt w:val="bullet"/>
+      <w:lvlText w:val=""/>
+      <w:lvlJc w:val="left"/>
+      <w:pPr>
+        <w:tabs>
+          <w:tab w:val="num" w:pos="5040"/>
+        </w:tabs>
+        <w:ind w:left="5040" w:hanging="360"/>
+      </w:pPr>
+      <w:rPr>
+        <w:rFonts w:ascii="Symbol" w:hAnsi="Symbol" w:hint="default"/>
+        <w:sz w:val="20"/>
+      </w:rPr>
+    </w:lvl>
+    <w:lvl w:ilvl="7" w:tentative="1">
+      <w:start w:val="1"/>
+      <w:numFmt w:val="bullet"/>
+      <w:lvlText w:val=""/>
+      <w:lvlJc w:val="left"/>
+      <w:pPr>
+        <w:tabs>
+          <w:tab w:val="num" w:pos="5760"/>
+        </w:tabs>
+        <w:ind w:left="5760" w:hanging="360"/>
+      </w:pPr>
+      <w:rPr>
+        <w:rFonts w:ascii="Symbol" w:hAnsi="Symbol" w:hint="default"/>
+        <w:sz w:val="20"/>
+      </w:rPr>
+    </w:lvl>
+    <w:lvl w:ilvl="8" w:tentative="1">
+      <w:start w:val="1"/>
+      <w:numFmt w:val="bullet"/>
+      <w:lvlText w:val=""/>
+      <w:lvlJc w:val="left"/>
+      <w:pPr>
+        <w:tabs>
+          <w:tab w:val="num" w:pos="6480"/>
+        </w:tabs>
+        <w:ind w:left="6480" w:hanging="360"/>
+      </w:pPr>
+      <w:rPr>
+        <w:rFonts w:ascii="Symbol" w:hAnsi="Symbol" w:hint="default"/>
+        <w:sz w:val="20"/>
+      </w:rPr>
+    </w:lvl>
+  </w:abstractNum>
+  <w:abstractNum w:abstractNumId="19" w15:restartNumberingAfterBreak="0">
     <w:nsid w:val="5BCADB28"/>
     <w:multiLevelType w:val="hybridMultilevel"/>
     <w:tmpl w:val="E5ACAA00"/>
@@ -10708,7 +13529,7 @@
       </w:rPr>
     </w:lvl>
   </w:abstractNum>
-  <w:abstractNum w:abstractNumId="6" w15:restartNumberingAfterBreak="0">
+  <w:abstractNum w:abstractNumId="20" w15:restartNumberingAfterBreak="0">
     <w:nsid w:val="5DD90C23"/>
     <w:multiLevelType w:val="hybridMultilevel"/>
     <w:tmpl w:val="AA58989C"/>
@@ -10920,7 +13741,156 @@
       </w:rPr>
     </w:lvl>
   </w:abstractNum>
-  <w:abstractNum w:abstractNumId="7" w15:restartNumberingAfterBreak="0">
+  <w:abstractNum w:abstractNumId="21" w15:restartNumberingAfterBreak="0">
+    <w:nsid w:val="612C1D6B"/>
+    <w:multiLevelType w:val="multilevel"/>
+    <w:tmpl w:val="9C0888DE"/>
+    <w:lvl w:ilvl="0">
+      <w:start w:val="1"/>
+      <w:numFmt w:val="bullet"/>
+      <w:lvlText w:val=""/>
+      <w:lvlJc w:val="left"/>
+      <w:pPr>
+        <w:tabs>
+          <w:tab w:val="num" w:pos="720"/>
+        </w:tabs>
+        <w:ind w:left="720" w:hanging="360"/>
+      </w:pPr>
+      <w:rPr>
+        <w:rFonts w:ascii="Symbol" w:hAnsi="Symbol" w:hint="default"/>
+        <w:sz w:val="20"/>
+      </w:rPr>
+    </w:lvl>
+    <w:lvl w:ilvl="1" w:tentative="1">
+      <w:start w:val="1"/>
+      <w:numFmt w:val="bullet"/>
+      <w:lvlText w:val=""/>
+      <w:lvlJc w:val="left"/>
+      <w:pPr>
+        <w:tabs>
+          <w:tab w:val="num" w:pos="1440"/>
+        </w:tabs>
+        <w:ind w:left="1440" w:hanging="360"/>
+      </w:pPr>
+      <w:rPr>
+        <w:rFonts w:ascii="Symbol" w:hAnsi="Symbol" w:hint="default"/>
+        <w:sz w:val="20"/>
+      </w:rPr>
+    </w:lvl>
+    <w:lvl w:ilvl="2" w:tentative="1">
+      <w:start w:val="1"/>
+      <w:numFmt w:val="bullet"/>
+      <w:lvlText w:val=""/>
+      <w:lvlJc w:val="left"/>
+      <w:pPr>
+        <w:tabs>
+          <w:tab w:val="num" w:pos="2160"/>
+        </w:tabs>
+        <w:ind w:left="2160" w:hanging="360"/>
+      </w:pPr>
+      <w:rPr>
+        <w:rFonts w:ascii="Symbol" w:hAnsi="Symbol" w:hint="default"/>
+        <w:sz w:val="20"/>
+      </w:rPr>
+    </w:lvl>
+    <w:lvl w:ilvl="3" w:tentative="1">
+      <w:start w:val="1"/>
+      <w:numFmt w:val="bullet"/>
+      <w:lvlText w:val=""/>
+      <w:lvlJc w:val="left"/>
+      <w:pPr>
+        <w:tabs>
+          <w:tab w:val="num" w:pos="2880"/>
+        </w:tabs>
+        <w:ind w:left="2880" w:hanging="360"/>
+      </w:pPr>
+      <w:rPr>
+        <w:rFonts w:ascii="Symbol" w:hAnsi="Symbol" w:hint="default"/>
+        <w:sz w:val="20"/>
+      </w:rPr>
+    </w:lvl>
+    <w:lvl w:ilvl="4" w:tentative="1">
+      <w:start w:val="1"/>
+      <w:numFmt w:val="bullet"/>
+      <w:lvlText w:val=""/>
+      <w:lvlJc w:val="left"/>
+      <w:pPr>
+        <w:tabs>
+          <w:tab w:val="num" w:pos="3600"/>
+        </w:tabs>
+        <w:ind w:left="3600" w:hanging="360"/>
+      </w:pPr>
+      <w:rPr>
+        <w:rFonts w:ascii="Symbol" w:hAnsi="Symbol" w:hint="default"/>
+        <w:sz w:val="20"/>
+      </w:rPr>
+    </w:lvl>
+    <w:lvl w:ilvl="5" w:tentative="1">
+      <w:start w:val="1"/>
+      <w:numFmt w:val="bullet"/>
+      <w:lvlText w:val=""/>
+      <w:lvlJc w:val="left"/>
+      <w:pPr>
+        <w:tabs>
+          <w:tab w:val="num" w:pos="4320"/>
+        </w:tabs>
+        <w:ind w:left="4320" w:hanging="360"/>
+      </w:pPr>
+      <w:rPr>
+        <w:rFonts w:ascii="Symbol" w:hAnsi="Symbol" w:hint="default"/>
+        <w:sz w:val="20"/>
+      </w:rPr>
+    </w:lvl>
+    <w:lvl w:ilvl="6" w:tentative="1">
+      <w:start w:val="1"/>
+      <w:numFmt w:val="bullet"/>
+      <w:lvlText w:val=""/>
+      <w:lvlJc w:val="left"/>
+      <w:pPr>
+        <w:tabs>
+          <w:tab w:val="num" w:pos="5040"/>
+        </w:tabs>
+        <w:ind w:left="5040" w:hanging="360"/>
+      </w:pPr>
+      <w:rPr>
+        <w:rFonts w:ascii="Symbol" w:hAnsi="Symbol" w:hint="default"/>
+        <w:sz w:val="20"/>
+      </w:rPr>
+    </w:lvl>
+    <w:lvl w:ilvl="7" w:tentative="1">
+      <w:start w:val="1"/>
+      <w:numFmt w:val="bullet"/>
+      <w:lvlText w:val=""/>
+      <w:lvlJc w:val="left"/>
+      <w:pPr>
+        <w:tabs>
+          <w:tab w:val="num" w:pos="5760"/>
+        </w:tabs>
+        <w:ind w:left="5760" w:hanging="360"/>
+      </w:pPr>
+      <w:rPr>
+        <w:rFonts w:ascii="Symbol" w:hAnsi="Symbol" w:hint="default"/>
+        <w:sz w:val="20"/>
+      </w:rPr>
+    </w:lvl>
+    <w:lvl w:ilvl="8" w:tentative="1">
+      <w:start w:val="1"/>
+      <w:numFmt w:val="bullet"/>
+      <w:lvlText w:val=""/>
+      <w:lvlJc w:val="left"/>
+      <w:pPr>
+        <w:tabs>
+          <w:tab w:val="num" w:pos="6480"/>
+        </w:tabs>
+        <w:ind w:left="6480" w:hanging="360"/>
+      </w:pPr>
+      <w:rPr>
+        <w:rFonts w:ascii="Symbol" w:hAnsi="Symbol" w:hint="default"/>
+        <w:sz w:val="20"/>
+      </w:rPr>
+    </w:lvl>
+  </w:abstractNum>
+  <w:abstractNum w:abstractNumId="22" w15:restartNumberingAfterBreak="0">
     <w:nsid w:val="633A2319"/>
     <w:multiLevelType w:val="hybridMultilevel"/>
     <w:tmpl w:val="AC8E6156"/>
@@ -11033,7 +14003,269 @@
       </w:rPr>
     </w:lvl>
   </w:abstractNum>
-  <w:abstractNum w:abstractNumId="8" w15:restartNumberingAfterBreak="0">
+  <w:abstractNum w:abstractNumId="23" w15:restartNumberingAfterBreak="0">
+    <w:nsid w:val="73333AD2"/>
+    <w:multiLevelType w:val="hybridMultilevel"/>
+    <w:tmpl w:val="96FE28DA"/>
+    <w:lvl w:ilvl="0" w:tplc="04160001">
+      <w:start w:val="1"/>
+      <w:numFmt w:val="bullet"/>
+      <w:lvlText w:val=""/>
+      <w:lvlJc w:val="left"/>
+      <w:pPr>
+        <w:ind w:left="720" w:hanging="360"/>
+      </w:pPr>
+      <w:rPr>
+        <w:rFonts w:ascii="Symbol" w:hAnsi="Symbol" w:hint="default"/>
+      </w:rPr>
+    </w:lvl>
+    <w:lvl w:ilvl="1" w:tplc="04160003" w:tentative="1">
+      <w:start w:val="1"/>
+      <w:numFmt w:val="bullet"/>
+      <w:lvlText w:val="o"/>
+      <w:lvlJc w:val="left"/>
+      <w:pPr>
+        <w:ind w:left="1440" w:hanging="360"/>
+      </w:pPr>
+      <w:rPr>
+        <w:rFonts w:ascii="Courier New" w:hAnsi="Courier New" w:cs="Courier New" w:hint="default"/>
+      </w:rPr>
+    </w:lvl>
+    <w:lvl w:ilvl="2" w:tplc="04160005" w:tentative="1">
+      <w:start w:val="1"/>
+      <w:numFmt w:val="bullet"/>
+      <w:lvlText w:val=""/>
+      <w:lvlJc w:val="left"/>
+      <w:pPr>
+        <w:ind w:left="2160" w:hanging="360"/>
+      </w:pPr>
+      <w:rPr>
+        <w:rFonts w:ascii="Wingdings" w:hAnsi="Wingdings" w:hint="default"/>
+      </w:rPr>
+    </w:lvl>
+    <w:lvl w:ilvl="3" w:tplc="04160001" w:tentative="1">
+      <w:start w:val="1"/>
+      <w:numFmt w:val="bullet"/>
+      <w:lvlText w:val=""/>
+      <w:lvlJc w:val="left"/>
+      <w:pPr>
+        <w:ind w:left="2880" w:hanging="360"/>
+      </w:pPr>
+      <w:rPr>
+        <w:rFonts w:ascii="Symbol" w:hAnsi="Symbol" w:hint="default"/>
+      </w:rPr>
+    </w:lvl>
+    <w:lvl w:ilvl="4" w:tplc="04160003" w:tentative="1">
+      <w:start w:val="1"/>
+      <w:numFmt w:val="bullet"/>
+      <w:lvlText w:val="o"/>
+      <w:lvlJc w:val="left"/>
+      <w:pPr>
+        <w:ind w:left="3600" w:hanging="360"/>
+      </w:pPr>
+      <w:rPr>
+        <w:rFonts w:ascii="Courier New" w:hAnsi="Courier New" w:cs="Courier New" w:hint="default"/>
+      </w:rPr>
+    </w:lvl>
+    <w:lvl w:ilvl="5" w:tplc="04160005" w:tentative="1">
+      <w:start w:val="1"/>
+      <w:numFmt w:val="bullet"/>
+      <w:lvlText w:val=""/>
+      <w:lvlJc w:val="left"/>
+      <w:pPr>
+        <w:ind w:left="4320" w:hanging="360"/>
+      </w:pPr>
+      <w:rPr>
+        <w:rFonts w:ascii="Wingdings" w:hAnsi="Wingdings" w:hint="default"/>
+      </w:rPr>
+    </w:lvl>
+    <w:lvl w:ilvl="6" w:tplc="04160001" w:tentative="1">
+      <w:start w:val="1"/>
+      <w:numFmt w:val="bullet"/>
+      <w:lvlText w:val=""/>
+      <w:lvlJc w:val="left"/>
+      <w:pPr>
+        <w:ind w:left="5040" w:hanging="360"/>
+      </w:pPr>
+      <w:rPr>
+        <w:rFonts w:ascii="Symbol" w:hAnsi="Symbol" w:hint="default"/>
+      </w:rPr>
+    </w:lvl>
+    <w:lvl w:ilvl="7" w:tplc="04160003" w:tentative="1">
+      <w:start w:val="1"/>
+      <w:numFmt w:val="bullet"/>
+      <w:lvlText w:val="o"/>
+      <w:lvlJc w:val="left"/>
+      <w:pPr>
+        <w:ind w:left="5760" w:hanging="360"/>
+      </w:pPr>
+      <w:rPr>
+        <w:rFonts w:ascii="Courier New" w:hAnsi="Courier New" w:cs="Courier New" w:hint="default"/>
+      </w:rPr>
+    </w:lvl>
+    <w:lvl w:ilvl="8" w:tplc="04160005" w:tentative="1">
+      <w:start w:val="1"/>
+      <w:numFmt w:val="bullet"/>
+      <w:lvlText w:val=""/>
+      <w:lvlJc w:val="left"/>
+      <w:pPr>
+        <w:ind w:left="6480" w:hanging="360"/>
+      </w:pPr>
+      <w:rPr>
+        <w:rFonts w:ascii="Wingdings" w:hAnsi="Wingdings" w:hint="default"/>
+      </w:rPr>
+    </w:lvl>
+  </w:abstractNum>
+  <w:abstractNum w:abstractNumId="24" w15:restartNumberingAfterBreak="0">
+    <w:nsid w:val="7566220D"/>
+    <w:multiLevelType w:val="multilevel"/>
+    <w:tmpl w:val="0C22D270"/>
+    <w:lvl w:ilvl="0">
+      <w:start w:val="1"/>
+      <w:numFmt w:val="bullet"/>
+      <w:lvlText w:val=""/>
+      <w:lvlJc w:val="left"/>
+      <w:pPr>
+        <w:tabs>
+          <w:tab w:val="num" w:pos="720"/>
+        </w:tabs>
+        <w:ind w:left="720" w:hanging="360"/>
+      </w:pPr>
+      <w:rPr>
+        <w:rFonts w:ascii="Symbol" w:hAnsi="Symbol" w:hint="default"/>
+        <w:sz w:val="20"/>
+      </w:rPr>
+    </w:lvl>
+    <w:lvl w:ilvl="1" w:tentative="1">
+      <w:start w:val="1"/>
+      <w:numFmt w:val="bullet"/>
+      <w:lvlText w:val=""/>
+      <w:lvlJc w:val="left"/>
+      <w:pPr>
+        <w:tabs>
+          <w:tab w:val="num" w:pos="1440"/>
+        </w:tabs>
+        <w:ind w:left="1440" w:hanging="360"/>
+      </w:pPr>
+      <w:rPr>
+        <w:rFonts w:ascii="Symbol" w:hAnsi="Symbol" w:hint="default"/>
+        <w:sz w:val="20"/>
+      </w:rPr>
+    </w:lvl>
+    <w:lvl w:ilvl="2" w:tentative="1">
+      <w:start w:val="1"/>
+      <w:numFmt w:val="bullet"/>
+      <w:lvlText w:val=""/>
+      <w:lvlJc w:val="left"/>
+      <w:pPr>
+        <w:tabs>
+          <w:tab w:val="num" w:pos="2160"/>
+        </w:tabs>
+        <w:ind w:left="2160" w:hanging="360"/>
+      </w:pPr>
+      <w:rPr>
+        <w:rFonts w:ascii="Symbol" w:hAnsi="Symbol" w:hint="default"/>
+        <w:sz w:val="20"/>
+      </w:rPr>
+    </w:lvl>
+    <w:lvl w:ilvl="3" w:tentative="1">
+      <w:start w:val="1"/>
+      <w:numFmt w:val="bullet"/>
+      <w:lvlText w:val=""/>
+      <w:lvlJc w:val="left"/>
+      <w:pPr>
+        <w:tabs>
+          <w:tab w:val="num" w:pos="2880"/>
+        </w:tabs>
+        <w:ind w:left="2880" w:hanging="360"/>
+      </w:pPr>
+      <w:rPr>
+        <w:rFonts w:ascii="Symbol" w:hAnsi="Symbol" w:hint="default"/>
+        <w:sz w:val="20"/>
+      </w:rPr>
+    </w:lvl>
+    <w:lvl w:ilvl="4" w:tentative="1">
+      <w:start w:val="1"/>
+      <w:numFmt w:val="bullet"/>
+      <w:lvlText w:val=""/>
+      <w:lvlJc w:val="left"/>
+      <w:pPr>
+        <w:tabs>
+          <w:tab w:val="num" w:pos="3600"/>
+        </w:tabs>
+        <w:ind w:left="3600" w:hanging="360"/>
+      </w:pPr>
+      <w:rPr>
+        <w:rFonts w:ascii="Symbol" w:hAnsi="Symbol" w:hint="default"/>
+        <w:sz w:val="20"/>
+      </w:rPr>
+    </w:lvl>
+    <w:lvl w:ilvl="5" w:tentative="1">
+      <w:start w:val="1"/>
+      <w:numFmt w:val="bullet"/>
+      <w:lvlText w:val=""/>
+      <w:lvlJc w:val="left"/>
+      <w:pPr>
+        <w:tabs>
+          <w:tab w:val="num" w:pos="4320"/>
+        </w:tabs>
+        <w:ind w:left="4320" w:hanging="360"/>
+      </w:pPr>
+      <w:rPr>
+        <w:rFonts w:ascii="Symbol" w:hAnsi="Symbol" w:hint="default"/>
+        <w:sz w:val="20"/>
+      </w:rPr>
+    </w:lvl>
+    <w:lvl w:ilvl="6" w:tentative="1">
+      <w:start w:val="1"/>
+      <w:numFmt w:val="bullet"/>
+      <w:lvlText w:val=""/>
+      <w:lvlJc w:val="left"/>
+      <w:pPr>
+        <w:tabs>
+          <w:tab w:val="num" w:pos="5040"/>
+        </w:tabs>
+        <w:ind w:left="5040" w:hanging="360"/>
+      </w:pPr>
+      <w:rPr>
+        <w:rFonts w:ascii="Symbol" w:hAnsi="Symbol" w:hint="default"/>
+        <w:sz w:val="20"/>
+      </w:rPr>
+    </w:lvl>
+    <w:lvl w:ilvl="7" w:tentative="1">
+      <w:start w:val="1"/>
+      <w:numFmt w:val="bullet"/>
+      <w:lvlText w:val=""/>
+      <w:lvlJc w:val="left"/>
+      <w:pPr>
+        <w:tabs>
+          <w:tab w:val="num" w:pos="5760"/>
+        </w:tabs>
+        <w:ind w:left="5760" w:hanging="360"/>
+      </w:pPr>
+      <w:rPr>
+        <w:rFonts w:ascii="Symbol" w:hAnsi="Symbol" w:hint="default"/>
+        <w:sz w:val="20"/>
+      </w:rPr>
+    </w:lvl>
+    <w:lvl w:ilvl="8" w:tentative="1">
+      <w:start w:val="1"/>
+      <w:numFmt w:val="bullet"/>
+      <w:lvlText w:val=""/>
+      <w:lvlJc w:val="left"/>
+      <w:pPr>
+        <w:tabs>
+          <w:tab w:val="num" w:pos="6480"/>
+        </w:tabs>
+        <w:ind w:left="6480" w:hanging="360"/>
+      </w:pPr>
+      <w:rPr>
+        <w:rFonts w:ascii="Symbol" w:hAnsi="Symbol" w:hint="default"/>
+        <w:sz w:val="20"/>
+      </w:rPr>
+    </w:lvl>
+  </w:abstractNum>
+  <w:abstractNum w:abstractNumId="25" w15:restartNumberingAfterBreak="0">
     <w:nsid w:val="7F8A8ACB"/>
     <w:multiLevelType w:val="hybridMultilevel"/>
     <w:tmpl w:val="9F26E440"/>
@@ -11146,38 +14378,89 @@
       </w:rPr>
     </w:lvl>
   </w:abstractNum>
-  <w:num w:numId="1">
+  <w:num w:numId="1" w16cid:durableId="911814849">
+    <w:abstractNumId w:val="25"/>
+  </w:num>
+  <w:num w:numId="2" w16cid:durableId="1848250196">
+    <w:abstractNumId w:val="15"/>
+  </w:num>
+  <w:num w:numId="3" w16cid:durableId="26688008">
+    <w:abstractNumId w:val="19"/>
+  </w:num>
+  <w:num w:numId="4" w16cid:durableId="1465807702">
+    <w:abstractNumId w:val="4"/>
+  </w:num>
+  <w:num w:numId="5" w16cid:durableId="1981114275">
+    <w:abstractNumId w:val="14"/>
+  </w:num>
+  <w:num w:numId="6" w16cid:durableId="1969432950">
+    <w:abstractNumId w:val="22"/>
+  </w:num>
+  <w:num w:numId="7" w16cid:durableId="1530294649">
+    <w:abstractNumId w:val="3"/>
+  </w:num>
+  <w:num w:numId="8" w16cid:durableId="2055889371">
+    <w:abstractNumId w:val="20"/>
+  </w:num>
+  <w:num w:numId="9" w16cid:durableId="1575820863">
     <w:abstractNumId w:val="8"/>
   </w:num>
-  <w:num w:numId="2">
-    <w:abstractNumId w:val="4"/>
+  <w:num w:numId="10" w16cid:durableId="1630939772">
+    <w:abstractNumId w:val="7"/>
   </w:num>
-  <w:num w:numId="3">
-    <w:abstractNumId w:val="5"/>
-  </w:num>
-  <w:num w:numId="4">
+  <w:num w:numId="11" w16cid:durableId="1742365107">
     <w:abstractNumId w:val="1"/>
   </w:num>
-  <w:num w:numId="5">
-    <w:abstractNumId w:val="3"/>
+  <w:num w:numId="12" w16cid:durableId="397636696">
+    <w:abstractNumId w:val="21"/>
   </w:num>
-  <w:num w:numId="6">
-    <w:abstractNumId w:val="7"/>
+  <w:num w:numId="13" w16cid:durableId="483394803">
+    <w:abstractNumId w:val="6"/>
   </w:num>
-  <w:num w:numId="7">
+  <w:num w:numId="14" w16cid:durableId="882867004">
     <w:abstractNumId w:val="0"/>
   </w:num>
-  <w:num w:numId="8">
-    <w:abstractNumId w:val="6"/>
+  <w:num w:numId="15" w16cid:durableId="1492017947">
+    <w:abstractNumId w:val="24"/>
   </w:num>
-  <w:num w:numId="9">
+  <w:num w:numId="16" w16cid:durableId="1874995667">
+    <w:abstractNumId w:val="17"/>
+  </w:num>
+  <w:num w:numId="17" w16cid:durableId="289360698">
+    <w:abstractNumId w:val="13"/>
+  </w:num>
+  <w:num w:numId="18" w16cid:durableId="59179993">
     <w:abstractNumId w:val="2"/>
+  </w:num>
+  <w:num w:numId="19" w16cid:durableId="2125612767">
+    <w:abstractNumId w:val="18"/>
+  </w:num>
+  <w:num w:numId="20" w16cid:durableId="308365006">
+    <w:abstractNumId w:val="10"/>
+  </w:num>
+  <w:num w:numId="21" w16cid:durableId="837767711">
+    <w:abstractNumId w:val="12"/>
+  </w:num>
+  <w:num w:numId="22" w16cid:durableId="1542088658">
+    <w:abstractNumId w:val="11"/>
+  </w:num>
+  <w:num w:numId="23" w16cid:durableId="1070813104">
+    <w:abstractNumId w:val="16"/>
+  </w:num>
+  <w:num w:numId="24" w16cid:durableId="360134085">
+    <w:abstractNumId w:val="23"/>
+  </w:num>
+  <w:num w:numId="25" w16cid:durableId="1840926862">
+    <w:abstractNumId w:val="9"/>
+  </w:num>
+  <w:num w:numId="26" w16cid:durableId="1410805219">
+    <w:abstractNumId w:val="5"/>
   </w:num>
 </w:numbering>
 </file>
 
 <file path=word/styles.xml><?xml version="1.0" encoding="utf-8"?>
-<w:styles xmlns:mc="http://schemas.openxmlformats.org/markup-compatibility/2006" xmlns:r="http://schemas.openxmlformats.org/officeDocument/2006/relationships" xmlns:w="http://schemas.openxmlformats.org/wordprocessingml/2006/main" xmlns:w14="http://schemas.microsoft.com/office/word/2010/wordml" xmlns:w15="http://schemas.microsoft.com/office/word/2012/wordml" xmlns:w16cex="http://schemas.microsoft.com/office/word/2018/wordml/cex" xmlns:w16cid="http://schemas.microsoft.com/office/word/2016/wordml/cid" xmlns:w16="http://schemas.microsoft.com/office/word/2018/wordml" xmlns:w16sdtdh="http://schemas.microsoft.com/office/word/2020/wordml/sdtdatahash" xmlns:w16se="http://schemas.microsoft.com/office/word/2015/wordml/symex" mc:Ignorable="w14 w15 w16se w16cid w16 w16cex w16sdtdh">
+<w:styles xmlns:mc="http://schemas.openxmlformats.org/markup-compatibility/2006" xmlns:r="http://schemas.openxmlformats.org/officeDocument/2006/relationships" xmlns:w="http://schemas.openxmlformats.org/wordprocessingml/2006/main" xmlns:w14="http://schemas.microsoft.com/office/word/2010/wordml" xmlns:w15="http://schemas.microsoft.com/office/word/2012/wordml" xmlns:w16cex="http://schemas.microsoft.com/office/word/2018/wordml/cex" xmlns:w16cid="http://schemas.microsoft.com/office/word/2016/wordml/cid" xmlns:w16="http://schemas.microsoft.com/office/word/2018/wordml" xmlns:w16du="http://schemas.microsoft.com/office/word/2023/wordml/word16du" xmlns:w16sdtdh="http://schemas.microsoft.com/office/word/2020/wordml/sdtdatahash" xmlns:w16sdtfl="http://schemas.microsoft.com/office/word/2024/wordml/sdtformatlock" xmlns:w16se="http://schemas.microsoft.com/office/word/2015/wordml/symex" mc:Ignorable="w14 w15 w16se w16cid w16 w16cex w16sdtdh w16sdtfl w16du">
   <w:docDefaults>
     <w:rPrDefault>
       <w:rPr>
@@ -11574,7 +14857,7 @@
   <w:style w:type="paragraph" w:default="1" w:styleId="Normal">
     <w:name w:val="Normal"/>
     <w:qFormat/>
-    <w:rsid w:val="007E01E9"/>
+    <w:rsid w:val="00F50979"/>
     <w:pPr>
       <w:spacing w:after="157" w:line="264" w:lineRule="auto"/>
       <w:ind w:left="10" w:hanging="10"/>
@@ -11672,7 +14955,6 @@
   <w:style w:type="character" w:default="1" w:styleId="Fontepargpadro">
     <w:name w:val="Default Paragraph Font"/>
     <w:uiPriority w:val="1"/>
-    <w:semiHidden/>
     <w:unhideWhenUsed/>
   </w:style>
   <w:style w:type="table" w:default="1" w:styleId="Tabelanormal">

</xml_diff>